<commit_message>
[Test]Test Admin Menu vs. Player Menu,Guest Redirection, Permission Boundaries.
</commit_message>
<xml_diff>
--- a/king/docs/test-cases.docx
+++ b/king/docs/test-cases.docx
@@ -2089,7 +2089,7 @@
         <w:pStyle w:val="Heading1"/>
       </w:pPr>
       <w:r>
-        <w:t xml:space="preserve">Test Session 2: [To Be Filled]</w:t>
+        <w:t xml:space="preserve">Test Session 2: Role-Based Access</w:t>
       </w:r>
     </w:p>
     <w:p>
@@ -2109,11 +2109,10 @@
       <w:r>
         <w:rPr>
           <w:rFonts w:ascii="Arial" w:cs="Arial" w:eastAsia="Arial" w:hAnsi="Arial"/>
-          <w:color w:val="90A4AE"/>
           <w:sz w:val="22"/>
           <w:szCs w:val="22"/>
         </w:rPr>
-        <w:t xml:space="preserve">YYYY-MM-DD</w:t>
+        <w:t xml:space="preserve">2026-06-07</w:t>
       </w:r>
     </w:p>
     <w:p>
@@ -2133,11 +2132,10 @@
       <w:r>
         <w:rPr>
           <w:rFonts w:ascii="Arial" w:cs="Arial" w:eastAsia="Arial" w:hAnsi="Arial"/>
-          <w:color w:val="90A4AE"/>
           <w:sz w:val="22"/>
           <w:szCs w:val="22"/>
         </w:rPr>
-        <w:t xml:space="preserve">[To Be Filled]</w:t>
+        <w:t xml:space="preserve">RoleBasedAccessTest.java</w:t>
       </w:r>
     </w:p>
     <w:p>
@@ -2157,16 +2155,15 @@
       <w:r>
         <w:rPr>
           <w:rFonts w:ascii="Arial" w:cs="Arial" w:eastAsia="Arial" w:hAnsi="Arial"/>
-          <w:color w:val="90A4AE"/>
           <w:sz w:val="22"/>
           <w:szCs w:val="22"/>
         </w:rPr>
-        <w:t xml:space="preserve">[To Be Filled]</w:t>
+        <w:t xml:space="preserve">AuthenticationService (currentUserIsAdmin, currentUserIsPlayer, getCurrentUser, logout)</w:t>
       </w:r>
     </w:p>
     <w:p>
       <w:pPr>
-        <w:spacing w:after="200"/>
+        <w:spacing w:after="120"/>
       </w:pPr>
       <w:r>
         <w:rPr>
@@ -2181,27 +2178,1540 @@
       <w:r>
         <w:rPr>
           <w:rFonts w:ascii="Arial" w:cs="Arial" w:eastAsia="Arial" w:hAnsi="Arial"/>
-          <w:color w:val="90A4AE"/>
+          <w:b/>
+          <w:bCs/>
+          <w:color w:val="2E7D32"/>
           <w:sz w:val="22"/>
           <w:szCs w:val="22"/>
         </w:rPr>
-        <w:t xml:space="preserve">[To Be Filled]</w:t>
+        <w:t xml:space="preserve">6 PASSED, 0 FAILED</w:t>
       </w:r>
     </w:p>
     <w:p>
       <w:pPr>
-        <w:spacing w:after="200"/>
+        <w:pStyle w:val="Heading2"/>
+      </w:pPr>
+      <w:r>
+        <w:t xml:space="preserve">Test Cases</w:t>
+      </w:r>
+    </w:p>
+    <w:tbl>
+      <w:tblPr>
+        <w:tblW w:type="pct" w:w="100%"/>
+        <w:tblBorders>
+          <w:top w:val="single" w:color="auto" w:sz="4"/>
+          <w:left w:val="single" w:color="auto" w:sz="4"/>
+          <w:bottom w:val="single" w:color="auto" w:sz="4"/>
+          <w:right w:val="single" w:color="auto" w:sz="4"/>
+          <w:insideH w:val="single" w:color="auto" w:sz="4"/>
+          <w:insideV w:val="single" w:color="auto" w:sz="4"/>
+        </w:tblBorders>
+      </w:tblPr>
+      <w:tblGrid>
+        <w:gridCol w:w="500"/>
+        <w:gridCol w:w="2200"/>
+        <w:gridCol w:w="2200"/>
+        <w:gridCol w:w="2200"/>
+        <w:gridCol w:w="2200"/>
+        <w:gridCol w:w="1000"/>
+      </w:tblGrid>
+      <w:tr>
+        <w:trPr>
+          <w:cantSplit/>
+        </w:trPr>
+        <w:tc>
+          <w:tcPr>
+            <w:tcW w:type="dxa" w:w="500"/>
+            <w:tcBorders>
+              <w:top w:val="single" w:color="B0BEC5" w:sz="1"/>
+              <w:left w:val="single" w:color="B0BEC5" w:sz="1"/>
+              <w:bottom w:val="single" w:color="B0BEC5" w:sz="1"/>
+              <w:right w:val="single" w:color="B0BEC5" w:sz="1"/>
+            </w:tcBorders>
+            <w:shd w:fill="1B3A5C" w:val="clear"/>
+            <w:tcMar>
+              <w:top w:type="dxa" w:w="60"/>
+              <w:left w:type="dxa" w:w="100"/>
+              <w:bottom w:type="dxa" w:w="60"/>
+              <w:right w:type="dxa" w:w="100"/>
+            </w:tcMar>
+            <w:vAlign w:val="center"/>
+          </w:tcPr>
+          <w:p>
+            <w:pPr>
+              <w:spacing w:after="0" w:before="0"/>
+              <w:jc w:val="center"/>
+            </w:pPr>
+            <w:r>
+              <w:rPr>
+                <w:rFonts w:ascii="Arial" w:cs="Arial" w:eastAsia="Arial" w:hAnsi="Arial"/>
+                <w:b/>
+                <w:bCs/>
+                <w:color w:val="FFFFFF"/>
+                <w:sz w:val="20"/>
+                <w:szCs w:val="20"/>
+              </w:rPr>
+              <w:t xml:space="preserve">#</w:t>
+            </w:r>
+          </w:p>
+        </w:tc>
+        <w:tc>
+          <w:tcPr>
+            <w:tcW w:type="dxa" w:w="2200"/>
+            <w:tcBorders>
+              <w:top w:val="single" w:color="B0BEC5" w:sz="1"/>
+              <w:left w:val="single" w:color="B0BEC5" w:sz="1"/>
+              <w:bottom w:val="single" w:color="B0BEC5" w:sz="1"/>
+              <w:right w:val="single" w:color="B0BEC5" w:sz="1"/>
+            </w:tcBorders>
+            <w:shd w:fill="1B3A5C" w:val="clear"/>
+            <w:tcMar>
+              <w:top w:type="dxa" w:w="60"/>
+              <w:left w:type="dxa" w:w="100"/>
+              <w:bottom w:type="dxa" w:w="60"/>
+              <w:right w:type="dxa" w:w="100"/>
+            </w:tcMar>
+            <w:vAlign w:val="center"/>
+          </w:tcPr>
+          <w:p>
+            <w:pPr>
+              <w:spacing w:after="0" w:before="0"/>
+              <w:jc w:val="center"/>
+            </w:pPr>
+            <w:r>
+              <w:rPr>
+                <w:rFonts w:ascii="Arial" w:cs="Arial" w:eastAsia="Arial" w:hAnsi="Arial"/>
+                <w:b/>
+                <w:bCs/>
+                <w:color w:val="FFFFFF"/>
+                <w:sz w:val="20"/>
+                <w:szCs w:val="20"/>
+              </w:rPr>
+              <w:t xml:space="preserve">Test Case</w:t>
+            </w:r>
+          </w:p>
+        </w:tc>
+        <w:tc>
+          <w:tcPr>
+            <w:tcW w:type="dxa" w:w="2200"/>
+            <w:tcBorders>
+              <w:top w:val="single" w:color="B0BEC5" w:sz="1"/>
+              <w:left w:val="single" w:color="B0BEC5" w:sz="1"/>
+              <w:bottom w:val="single" w:color="B0BEC5" w:sz="1"/>
+              <w:right w:val="single" w:color="B0BEC5" w:sz="1"/>
+            </w:tcBorders>
+            <w:shd w:fill="1B3A5C" w:val="clear"/>
+            <w:tcMar>
+              <w:top w:type="dxa" w:w="60"/>
+              <w:left w:type="dxa" w:w="100"/>
+              <w:bottom w:type="dxa" w:w="60"/>
+              <w:right w:type="dxa" w:w="100"/>
+            </w:tcMar>
+            <w:vAlign w:val="center"/>
+          </w:tcPr>
+          <w:p>
+            <w:pPr>
+              <w:spacing w:after="0" w:before="0"/>
+              <w:jc w:val="center"/>
+            </w:pPr>
+            <w:r>
+              <w:rPr>
+                <w:rFonts w:ascii="Arial" w:cs="Arial" w:eastAsia="Arial" w:hAnsi="Arial"/>
+                <w:b/>
+                <w:bCs/>
+                <w:color w:val="FFFFFF"/>
+                <w:sz w:val="20"/>
+                <w:szCs w:val="20"/>
+              </w:rPr>
+              <w:t xml:space="preserve">Input</w:t>
+            </w:r>
+          </w:p>
+        </w:tc>
+        <w:tc>
+          <w:tcPr>
+            <w:tcW w:type="dxa" w:w="2200"/>
+            <w:tcBorders>
+              <w:top w:val="single" w:color="B0BEC5" w:sz="1"/>
+              <w:left w:val="single" w:color="B0BEC5" w:sz="1"/>
+              <w:bottom w:val="single" w:color="B0BEC5" w:sz="1"/>
+              <w:right w:val="single" w:color="B0BEC5" w:sz="1"/>
+            </w:tcBorders>
+            <w:shd w:fill="1B3A5C" w:val="clear"/>
+            <w:tcMar>
+              <w:top w:type="dxa" w:w="60"/>
+              <w:left w:type="dxa" w:w="100"/>
+              <w:bottom w:type="dxa" w:w="60"/>
+              <w:right w:type="dxa" w:w="100"/>
+            </w:tcMar>
+            <w:vAlign w:val="center"/>
+          </w:tcPr>
+          <w:p>
+            <w:pPr>
+              <w:spacing w:after="0" w:before="0"/>
+              <w:jc w:val="center"/>
+            </w:pPr>
+            <w:r>
+              <w:rPr>
+                <w:rFonts w:ascii="Arial" w:cs="Arial" w:eastAsia="Arial" w:hAnsi="Arial"/>
+                <w:b/>
+                <w:bCs/>
+                <w:color w:val="FFFFFF"/>
+                <w:sz w:val="20"/>
+                <w:szCs w:val="20"/>
+              </w:rPr>
+              <w:t xml:space="preserve">Expected Output</w:t>
+            </w:r>
+          </w:p>
+        </w:tc>
+        <w:tc>
+          <w:tcPr>
+            <w:tcW w:type="dxa" w:w="2200"/>
+            <w:tcBorders>
+              <w:top w:val="single" w:color="B0BEC5" w:sz="1"/>
+              <w:left w:val="single" w:color="B0BEC5" w:sz="1"/>
+              <w:bottom w:val="single" w:color="B0BEC5" w:sz="1"/>
+              <w:right w:val="single" w:color="B0BEC5" w:sz="1"/>
+            </w:tcBorders>
+            <w:shd w:fill="1B3A5C" w:val="clear"/>
+            <w:tcMar>
+              <w:top w:type="dxa" w:w="60"/>
+              <w:left w:type="dxa" w:w="100"/>
+              <w:bottom w:type="dxa" w:w="60"/>
+              <w:right w:type="dxa" w:w="100"/>
+            </w:tcMar>
+            <w:vAlign w:val="center"/>
+          </w:tcPr>
+          <w:p>
+            <w:pPr>
+              <w:spacing w:after="0" w:before="0"/>
+              <w:jc w:val="center"/>
+            </w:pPr>
+            <w:r>
+              <w:rPr>
+                <w:rFonts w:ascii="Arial" w:cs="Arial" w:eastAsia="Arial" w:hAnsi="Arial"/>
+                <w:b/>
+                <w:bCs/>
+                <w:color w:val="FFFFFF"/>
+                <w:sz w:val="20"/>
+                <w:szCs w:val="20"/>
+              </w:rPr>
+              <w:t xml:space="preserve">Actual Output</w:t>
+            </w:r>
+          </w:p>
+        </w:tc>
+        <w:tc>
+          <w:tcPr>
+            <w:tcW w:type="dxa" w:w="1000"/>
+            <w:tcBorders>
+              <w:top w:val="single" w:color="B0BEC5" w:sz="1"/>
+              <w:left w:val="single" w:color="B0BEC5" w:sz="1"/>
+              <w:bottom w:val="single" w:color="B0BEC5" w:sz="1"/>
+              <w:right w:val="single" w:color="B0BEC5" w:sz="1"/>
+            </w:tcBorders>
+            <w:shd w:fill="1B3A5C" w:val="clear"/>
+            <w:tcMar>
+              <w:top w:type="dxa" w:w="60"/>
+              <w:left w:type="dxa" w:w="100"/>
+              <w:bottom w:type="dxa" w:w="60"/>
+              <w:right w:type="dxa" w:w="100"/>
+            </w:tcMar>
+            <w:vAlign w:val="center"/>
+          </w:tcPr>
+          <w:p>
+            <w:pPr>
+              <w:spacing w:after="0" w:before="0"/>
+              <w:jc w:val="center"/>
+            </w:pPr>
+            <w:r>
+              <w:rPr>
+                <w:rFonts w:ascii="Arial" w:cs="Arial" w:eastAsia="Arial" w:hAnsi="Arial"/>
+                <w:b/>
+                <w:bCs/>
+                <w:color w:val="FFFFFF"/>
+                <w:sz w:val="20"/>
+                <w:szCs w:val="20"/>
+              </w:rPr>
+              <w:t xml:space="preserve">Result</w:t>
+            </w:r>
+          </w:p>
+        </w:tc>
+      </w:tr>
+      <w:tr>
+        <w:trPr>
+          <w:cantSplit/>
+        </w:trPr>
+        <w:tc>
+          <w:tcPr>
+            <w:tcW w:type="dxa" w:w="500"/>
+            <w:tcBorders>
+              <w:top w:val="single" w:color="B0BEC5" w:sz="1"/>
+              <w:left w:val="single" w:color="B0BEC5" w:sz="1"/>
+              <w:bottom w:val="single" w:color="B0BEC5" w:sz="1"/>
+              <w:right w:val="single" w:color="B0BEC5" w:sz="1"/>
+            </w:tcBorders>
+            <w:shd w:fill="F0F4F8" w:val="clear"/>
+            <w:tcMar>
+              <w:top w:type="dxa" w:w="50"/>
+              <w:left w:type="dxa" w:w="100"/>
+              <w:bottom w:type="dxa" w:w="50"/>
+              <w:right w:type="dxa" w:w="100"/>
+            </w:tcMar>
+            <w:vAlign w:val="center"/>
+          </w:tcPr>
+          <w:p>
+            <w:pPr>
+              <w:spacing w:after="0" w:before="0"/>
+              <w:jc w:val="center"/>
+            </w:pPr>
+            <w:r>
+              <w:rPr>
+                <w:rFonts w:ascii="Arial" w:cs="Arial" w:eastAsia="Arial" w:hAnsi="Arial"/>
+                <w:sz w:val="20"/>
+                <w:szCs w:val="20"/>
+              </w:rPr>
+              <w:t xml:space="preserve">1</w:t>
+            </w:r>
+          </w:p>
+        </w:tc>
+        <w:tc>
+          <w:tcPr>
+            <w:tcW w:type="dxa" w:w="2200"/>
+            <w:tcBorders>
+              <w:top w:val="single" w:color="B0BEC5" w:sz="1"/>
+              <w:left w:val="single" w:color="B0BEC5" w:sz="1"/>
+              <w:bottom w:val="single" w:color="B0BEC5" w:sz="1"/>
+              <w:right w:val="single" w:color="B0BEC5" w:sz="1"/>
+            </w:tcBorders>
+            <w:shd w:fill="F0F4F8" w:val="clear"/>
+            <w:tcMar>
+              <w:top w:type="dxa" w:w="50"/>
+              <w:left w:type="dxa" w:w="100"/>
+              <w:bottom w:type="dxa" w:w="50"/>
+              <w:right w:type="dxa" w:w="100"/>
+            </w:tcMar>
+            <w:vAlign w:val="center"/>
+          </w:tcPr>
+          <w:p>
+            <w:pPr>
+              <w:spacing w:after="0" w:before="0"/>
+              <w:jc w:val="left"/>
+            </w:pPr>
+            <w:r>
+              <w:rPr>
+                <w:rFonts w:ascii="Arial" w:cs="Arial" w:eastAsia="Arial" w:hAnsi="Arial"/>
+                <w:sz w:val="20"/>
+                <w:szCs w:val="20"/>
+              </w:rPr>
+              <w:t xml:space="preserve">Admin can access data management</w:t>
+            </w:r>
+          </w:p>
+        </w:tc>
+        <w:tc>
+          <w:tcPr>
+            <w:tcW w:type="dxa" w:w="2200"/>
+            <w:tcBorders>
+              <w:top w:val="single" w:color="B0BEC5" w:sz="1"/>
+              <w:left w:val="single" w:color="B0BEC5" w:sz="1"/>
+              <w:bottom w:val="single" w:color="B0BEC5" w:sz="1"/>
+              <w:right w:val="single" w:color="B0BEC5" w:sz="1"/>
+            </w:tcBorders>
+            <w:shd w:fill="F0F4F8" w:val="clear"/>
+            <w:tcMar>
+              <w:top w:type="dxa" w:w="50"/>
+              <w:left w:type="dxa" w:w="100"/>
+              <w:bottom w:type="dxa" w:w="50"/>
+              <w:right w:type="dxa" w:w="100"/>
+            </w:tcMar>
+            <w:vAlign w:val="center"/>
+          </w:tcPr>
+          <w:p>
+            <w:pPr>
+              <w:spacing w:after="0" w:before="0"/>
+              <w:jc w:val="left"/>
+            </w:pPr>
+            <w:r>
+              <w:rPr>
+                <w:rFonts w:ascii="Arial" w:cs="Arial" w:eastAsia="Arial" w:hAnsi="Arial"/>
+                <w:sz w:val="20"/>
+                <w:szCs w:val="20"/>
+              </w:rPr>
+              <w:t xml:space="preserve">login as A01</w:t>
+            </w:r>
+          </w:p>
+        </w:tc>
+        <w:tc>
+          <w:tcPr>
+            <w:tcW w:type="dxa" w:w="2200"/>
+            <w:tcBorders>
+              <w:top w:val="single" w:color="B0BEC5" w:sz="1"/>
+              <w:left w:val="single" w:color="B0BEC5" w:sz="1"/>
+              <w:bottom w:val="single" w:color="B0BEC5" w:sz="1"/>
+              <w:right w:val="single" w:color="B0BEC5" w:sz="1"/>
+            </w:tcBorders>
+            <w:shd w:fill="F0F4F8" w:val="clear"/>
+            <w:tcMar>
+              <w:top w:type="dxa" w:w="50"/>
+              <w:left w:type="dxa" w:w="100"/>
+              <w:bottom w:type="dxa" w:w="50"/>
+              <w:right w:type="dxa" w:w="100"/>
+            </w:tcMar>
+            <w:vAlign w:val="center"/>
+          </w:tcPr>
+          <w:p>
+            <w:pPr>
+              <w:spacing w:after="0" w:before="0"/>
+              <w:jc w:val="left"/>
+            </w:pPr>
+            <w:r>
+              <w:rPr>
+                <w:rFonts w:ascii="Arial" w:cs="Arial" w:eastAsia="Arial" w:hAnsi="Arial"/>
+                <w:sz w:val="20"/>
+                <w:szCs w:val="20"/>
+              </w:rPr>
+              <w:t xml:space="preserve">currentUserIsAdmin() = true</w:t>
+            </w:r>
+          </w:p>
+        </w:tc>
+        <w:tc>
+          <w:tcPr>
+            <w:tcW w:type="dxa" w:w="2200"/>
+            <w:tcBorders>
+              <w:top w:val="single" w:color="B0BEC5" w:sz="1"/>
+              <w:left w:val="single" w:color="B0BEC5" w:sz="1"/>
+              <w:bottom w:val="single" w:color="B0BEC5" w:sz="1"/>
+              <w:right w:val="single" w:color="B0BEC5" w:sz="1"/>
+            </w:tcBorders>
+            <w:shd w:fill="F0F4F8" w:val="clear"/>
+            <w:tcMar>
+              <w:top w:type="dxa" w:w="50"/>
+              <w:left w:type="dxa" w:w="100"/>
+              <w:bottom w:type="dxa" w:w="50"/>
+              <w:right w:type="dxa" w:w="100"/>
+            </w:tcMar>
+            <w:vAlign w:val="center"/>
+          </w:tcPr>
+          <w:p>
+            <w:pPr>
+              <w:spacing w:after="0" w:before="0"/>
+              <w:jc w:val="left"/>
+            </w:pPr>
+            <w:r>
+              <w:rPr>
+                <w:rFonts w:ascii="Arial" w:cs="Arial" w:eastAsia="Arial" w:hAnsi="Arial"/>
+                <w:sz w:val="20"/>
+                <w:szCs w:val="20"/>
+              </w:rPr>
+              <w:t xml:space="preserve">currentUserIsAdmin() = true</w:t>
+            </w:r>
+          </w:p>
+        </w:tc>
+        <w:tc>
+          <w:tcPr>
+            <w:tcW w:type="dxa" w:w="1000"/>
+            <w:tcBorders>
+              <w:top w:val="single" w:color="B0BEC5" w:sz="1"/>
+              <w:left w:val="single" w:color="B0BEC5" w:sz="1"/>
+              <w:bottom w:val="single" w:color="B0BEC5" w:sz="1"/>
+              <w:right w:val="single" w:color="B0BEC5" w:sz="1"/>
+            </w:tcBorders>
+            <w:tcMar>
+              <w:top w:type="dxa" w:w="50"/>
+              <w:left w:type="dxa" w:w="100"/>
+              <w:bottom w:type="dxa" w:w="50"/>
+              <w:right w:type="dxa" w:w="100"/>
+            </w:tcMar>
+            <w:vAlign w:val="center"/>
+          </w:tcPr>
+          <w:p>
+            <w:pPr>
+              <w:spacing w:after="0" w:before="0"/>
+              <w:jc w:val="center"/>
+            </w:pPr>
+            <w:r>
+              <w:rPr>
+                <w:rFonts w:ascii="Arial" w:cs="Arial" w:eastAsia="Arial" w:hAnsi="Arial"/>
+                <w:b/>
+                <w:bCs/>
+                <w:color w:val="2E7D32"/>
+                <w:sz w:val="20"/>
+                <w:szCs w:val="20"/>
+              </w:rPr>
+              <w:t xml:space="preserve">PASS</w:t>
+            </w:r>
+          </w:p>
+        </w:tc>
+      </w:tr>
+      <w:tr>
+        <w:trPr>
+          <w:cantSplit/>
+        </w:trPr>
+        <w:tc>
+          <w:tcPr>
+            <w:tcW w:type="dxa" w:w="500"/>
+            <w:tcBorders>
+              <w:top w:val="single" w:color="B0BEC5" w:sz="1"/>
+              <w:left w:val="single" w:color="B0BEC5" w:sz="1"/>
+              <w:bottom w:val="single" w:color="B0BEC5" w:sz="1"/>
+              <w:right w:val="single" w:color="B0BEC5" w:sz="1"/>
+            </w:tcBorders>
+            <w:tcMar>
+              <w:top w:type="dxa" w:w="50"/>
+              <w:left w:type="dxa" w:w="100"/>
+              <w:bottom w:type="dxa" w:w="50"/>
+              <w:right w:type="dxa" w:w="100"/>
+            </w:tcMar>
+            <w:vAlign w:val="center"/>
+          </w:tcPr>
+          <w:p>
+            <w:pPr>
+              <w:spacing w:after="0" w:before="0"/>
+              <w:jc w:val="center"/>
+            </w:pPr>
+            <w:r>
+              <w:rPr>
+                <w:rFonts w:ascii="Arial" w:cs="Arial" w:eastAsia="Arial" w:hAnsi="Arial"/>
+                <w:sz w:val="20"/>
+                <w:szCs w:val="20"/>
+              </w:rPr>
+              <w:t xml:space="preserve">2</w:t>
+            </w:r>
+          </w:p>
+        </w:tc>
+        <w:tc>
+          <w:tcPr>
+            <w:tcW w:type="dxa" w:w="2200"/>
+            <w:tcBorders>
+              <w:top w:val="single" w:color="B0BEC5" w:sz="1"/>
+              <w:left w:val="single" w:color="B0BEC5" w:sz="1"/>
+              <w:bottom w:val="single" w:color="B0BEC5" w:sz="1"/>
+              <w:right w:val="single" w:color="B0BEC5" w:sz="1"/>
+            </w:tcBorders>
+            <w:tcMar>
+              <w:top w:type="dxa" w:w="50"/>
+              <w:left w:type="dxa" w:w="100"/>
+              <w:bottom w:type="dxa" w:w="50"/>
+              <w:right w:type="dxa" w:w="100"/>
+            </w:tcMar>
+            <w:vAlign w:val="center"/>
+          </w:tcPr>
+          <w:p>
+            <w:pPr>
+              <w:spacing w:after="0" w:before="0"/>
+              <w:jc w:val="left"/>
+            </w:pPr>
+            <w:r>
+              <w:rPr>
+                <w:rFonts w:ascii="Arial" w:cs="Arial" w:eastAsia="Arial" w:hAnsi="Arial"/>
+                <w:sz w:val="20"/>
+                <w:szCs w:val="20"/>
+              </w:rPr>
+              <w:t xml:space="preserve">Player cannot access admin features</w:t>
+            </w:r>
+          </w:p>
+        </w:tc>
+        <w:tc>
+          <w:tcPr>
+            <w:tcW w:type="dxa" w:w="2200"/>
+            <w:tcBorders>
+              <w:top w:val="single" w:color="B0BEC5" w:sz="1"/>
+              <w:left w:val="single" w:color="B0BEC5" w:sz="1"/>
+              <w:bottom w:val="single" w:color="B0BEC5" w:sz="1"/>
+              <w:right w:val="single" w:color="B0BEC5" w:sz="1"/>
+            </w:tcBorders>
+            <w:tcMar>
+              <w:top w:type="dxa" w:w="50"/>
+              <w:left w:type="dxa" w:w="100"/>
+              <w:bottom w:type="dxa" w:w="50"/>
+              <w:right w:type="dxa" w:w="100"/>
+            </w:tcMar>
+            <w:vAlign w:val="center"/>
+          </w:tcPr>
+          <w:p>
+            <w:pPr>
+              <w:spacing w:after="0" w:before="0"/>
+              <w:jc w:val="left"/>
+            </w:pPr>
+            <w:r>
+              <w:rPr>
+                <w:rFonts w:ascii="Arial" w:cs="Arial" w:eastAsia="Arial" w:hAnsi="Arial"/>
+                <w:sz w:val="20"/>
+                <w:szCs w:val="20"/>
+              </w:rPr>
+              <w:t xml:space="preserve">login as P01</w:t>
+            </w:r>
+          </w:p>
+        </w:tc>
+        <w:tc>
+          <w:tcPr>
+            <w:tcW w:type="dxa" w:w="2200"/>
+            <w:tcBorders>
+              <w:top w:val="single" w:color="B0BEC5" w:sz="1"/>
+              <w:left w:val="single" w:color="B0BEC5" w:sz="1"/>
+              <w:bottom w:val="single" w:color="B0BEC5" w:sz="1"/>
+              <w:right w:val="single" w:color="B0BEC5" w:sz="1"/>
+            </w:tcBorders>
+            <w:tcMar>
+              <w:top w:type="dxa" w:w="50"/>
+              <w:left w:type="dxa" w:w="100"/>
+              <w:bottom w:type="dxa" w:w="50"/>
+              <w:right w:type="dxa" w:w="100"/>
+            </w:tcMar>
+            <w:vAlign w:val="center"/>
+          </w:tcPr>
+          <w:p>
+            <w:pPr>
+              <w:spacing w:after="0" w:before="0"/>
+              <w:jc w:val="left"/>
+            </w:pPr>
+            <w:r>
+              <w:rPr>
+                <w:rFonts w:ascii="Arial" w:cs="Arial" w:eastAsia="Arial" w:hAnsi="Arial"/>
+                <w:sz w:val="20"/>
+                <w:szCs w:val="20"/>
+              </w:rPr>
+              <w:t xml:space="preserve">isAdmin=false, isPlayer=true</w:t>
+            </w:r>
+          </w:p>
+        </w:tc>
+        <w:tc>
+          <w:tcPr>
+            <w:tcW w:type="dxa" w:w="2200"/>
+            <w:tcBorders>
+              <w:top w:val="single" w:color="B0BEC5" w:sz="1"/>
+              <w:left w:val="single" w:color="B0BEC5" w:sz="1"/>
+              <w:bottom w:val="single" w:color="B0BEC5" w:sz="1"/>
+              <w:right w:val="single" w:color="B0BEC5" w:sz="1"/>
+            </w:tcBorders>
+            <w:tcMar>
+              <w:top w:type="dxa" w:w="50"/>
+              <w:left w:type="dxa" w:w="100"/>
+              <w:bottom w:type="dxa" w:w="50"/>
+              <w:right w:type="dxa" w:w="100"/>
+            </w:tcMar>
+            <w:vAlign w:val="center"/>
+          </w:tcPr>
+          <w:p>
+            <w:pPr>
+              <w:spacing w:after="0" w:before="0"/>
+              <w:jc w:val="left"/>
+            </w:pPr>
+            <w:r>
+              <w:rPr>
+                <w:rFonts w:ascii="Arial" w:cs="Arial" w:eastAsia="Arial" w:hAnsi="Arial"/>
+                <w:sz w:val="20"/>
+                <w:szCs w:val="20"/>
+              </w:rPr>
+              <w:t xml:space="preserve">isAdmin=false, isPlayer=true</w:t>
+            </w:r>
+          </w:p>
+        </w:tc>
+        <w:tc>
+          <w:tcPr>
+            <w:tcW w:type="dxa" w:w="1000"/>
+            <w:tcBorders>
+              <w:top w:val="single" w:color="B0BEC5" w:sz="1"/>
+              <w:left w:val="single" w:color="B0BEC5" w:sz="1"/>
+              <w:bottom w:val="single" w:color="B0BEC5" w:sz="1"/>
+              <w:right w:val="single" w:color="B0BEC5" w:sz="1"/>
+            </w:tcBorders>
+            <w:tcMar>
+              <w:top w:type="dxa" w:w="50"/>
+              <w:left w:type="dxa" w:w="100"/>
+              <w:bottom w:type="dxa" w:w="50"/>
+              <w:right w:type="dxa" w:w="100"/>
+            </w:tcMar>
+            <w:vAlign w:val="center"/>
+          </w:tcPr>
+          <w:p>
+            <w:pPr>
+              <w:spacing w:after="0" w:before="0"/>
+              <w:jc w:val="center"/>
+            </w:pPr>
+            <w:r>
+              <w:rPr>
+                <w:rFonts w:ascii="Arial" w:cs="Arial" w:eastAsia="Arial" w:hAnsi="Arial"/>
+                <w:b/>
+                <w:bCs/>
+                <w:color w:val="2E7D32"/>
+                <w:sz w:val="20"/>
+                <w:szCs w:val="20"/>
+              </w:rPr>
+              <w:t xml:space="preserve">PASS</w:t>
+            </w:r>
+          </w:p>
+        </w:tc>
+      </w:tr>
+      <w:tr>
+        <w:trPr>
+          <w:cantSplit/>
+        </w:trPr>
+        <w:tc>
+          <w:tcPr>
+            <w:tcW w:type="dxa" w:w="500"/>
+            <w:tcBorders>
+              <w:top w:val="single" w:color="B0BEC5" w:sz="1"/>
+              <w:left w:val="single" w:color="B0BEC5" w:sz="1"/>
+              <w:bottom w:val="single" w:color="B0BEC5" w:sz="1"/>
+              <w:right w:val="single" w:color="B0BEC5" w:sz="1"/>
+            </w:tcBorders>
+            <w:shd w:fill="F0F4F8" w:val="clear"/>
+            <w:tcMar>
+              <w:top w:type="dxa" w:w="50"/>
+              <w:left w:type="dxa" w:w="100"/>
+              <w:bottom w:type="dxa" w:w="50"/>
+              <w:right w:type="dxa" w:w="100"/>
+            </w:tcMar>
+            <w:vAlign w:val="center"/>
+          </w:tcPr>
+          <w:p>
+            <w:pPr>
+              <w:spacing w:after="0" w:before="0"/>
+              <w:jc w:val="center"/>
+            </w:pPr>
+            <w:r>
+              <w:rPr>
+                <w:rFonts w:ascii="Arial" w:cs="Arial" w:eastAsia="Arial" w:hAnsi="Arial"/>
+                <w:sz w:val="20"/>
+                <w:szCs w:val="20"/>
+              </w:rPr>
+              <w:t xml:space="preserve">3</w:t>
+            </w:r>
+          </w:p>
+        </w:tc>
+        <w:tc>
+          <w:tcPr>
+            <w:tcW w:type="dxa" w:w="2200"/>
+            <w:tcBorders>
+              <w:top w:val="single" w:color="B0BEC5" w:sz="1"/>
+              <w:left w:val="single" w:color="B0BEC5" w:sz="1"/>
+              <w:bottom w:val="single" w:color="B0BEC5" w:sz="1"/>
+              <w:right w:val="single" w:color="B0BEC5" w:sz="1"/>
+            </w:tcBorders>
+            <w:shd w:fill="F0F4F8" w:val="clear"/>
+            <w:tcMar>
+              <w:top w:type="dxa" w:w="50"/>
+              <w:left w:type="dxa" w:w="100"/>
+              <w:bottom w:type="dxa" w:w="50"/>
+              <w:right w:type="dxa" w:w="100"/>
+            </w:tcMar>
+            <w:vAlign w:val="center"/>
+          </w:tcPr>
+          <w:p>
+            <w:pPr>
+              <w:spacing w:after="0" w:before="0"/>
+              <w:jc w:val="left"/>
+            </w:pPr>
+            <w:r>
+              <w:rPr>
+                <w:rFonts w:ascii="Arial" w:cs="Arial" w:eastAsia="Arial" w:hAnsi="Arial"/>
+                <w:sz w:val="20"/>
+                <w:szCs w:val="20"/>
+              </w:rPr>
+              <w:t xml:space="preserve">Unauthenticated state</w:t>
+            </w:r>
+          </w:p>
+        </w:tc>
+        <w:tc>
+          <w:tcPr>
+            <w:tcW w:type="dxa" w:w="2200"/>
+            <w:tcBorders>
+              <w:top w:val="single" w:color="B0BEC5" w:sz="1"/>
+              <w:left w:val="single" w:color="B0BEC5" w:sz="1"/>
+              <w:bottom w:val="single" w:color="B0BEC5" w:sz="1"/>
+              <w:right w:val="single" w:color="B0BEC5" w:sz="1"/>
+            </w:tcBorders>
+            <w:shd w:fill="F0F4F8" w:val="clear"/>
+            <w:tcMar>
+              <w:top w:type="dxa" w:w="50"/>
+              <w:left w:type="dxa" w:w="100"/>
+              <w:bottom w:type="dxa" w:w="50"/>
+              <w:right w:type="dxa" w:w="100"/>
+            </w:tcMar>
+            <w:vAlign w:val="center"/>
+          </w:tcPr>
+          <w:p>
+            <w:pPr>
+              <w:spacing w:after="0" w:before="0"/>
+              <w:jc w:val="left"/>
+            </w:pPr>
+            <w:r>
+              <w:rPr>
+                <w:rFonts w:ascii="Arial" w:cs="Arial" w:eastAsia="Arial" w:hAnsi="Arial"/>
+                <w:sz w:val="20"/>
+                <w:szCs w:val="20"/>
+              </w:rPr>
+              <w:t xml:space="preserve">no login</w:t>
+            </w:r>
+          </w:p>
+        </w:tc>
+        <w:tc>
+          <w:tcPr>
+            <w:tcW w:type="dxa" w:w="2200"/>
+            <w:tcBorders>
+              <w:top w:val="single" w:color="B0BEC5" w:sz="1"/>
+              <w:left w:val="single" w:color="B0BEC5" w:sz="1"/>
+              <w:bottom w:val="single" w:color="B0BEC5" w:sz="1"/>
+              <w:right w:val="single" w:color="B0BEC5" w:sz="1"/>
+            </w:tcBorders>
+            <w:shd w:fill="F0F4F8" w:val="clear"/>
+            <w:tcMar>
+              <w:top w:type="dxa" w:w="50"/>
+              <w:left w:type="dxa" w:w="100"/>
+              <w:bottom w:type="dxa" w:w="50"/>
+              <w:right w:type="dxa" w:w="100"/>
+            </w:tcMar>
+            <w:vAlign w:val="center"/>
+          </w:tcPr>
+          <w:p>
+            <w:pPr>
+              <w:spacing w:after="0" w:before="0"/>
+              <w:jc w:val="left"/>
+            </w:pPr>
+            <w:r>
+              <w:rPr>
+                <w:rFonts w:ascii="Arial" w:cs="Arial" w:eastAsia="Arial" w:hAnsi="Arial"/>
+                <w:sz w:val="20"/>
+                <w:szCs w:val="20"/>
+              </w:rPr>
+              <w:t xml:space="preserve">getCurrentUser() = null</w:t>
+            </w:r>
+          </w:p>
+        </w:tc>
+        <w:tc>
+          <w:tcPr>
+            <w:tcW w:type="dxa" w:w="2200"/>
+            <w:tcBorders>
+              <w:top w:val="single" w:color="B0BEC5" w:sz="1"/>
+              <w:left w:val="single" w:color="B0BEC5" w:sz="1"/>
+              <w:bottom w:val="single" w:color="B0BEC5" w:sz="1"/>
+              <w:right w:val="single" w:color="B0BEC5" w:sz="1"/>
+            </w:tcBorders>
+            <w:shd w:fill="F0F4F8" w:val="clear"/>
+            <w:tcMar>
+              <w:top w:type="dxa" w:w="50"/>
+              <w:left w:type="dxa" w:w="100"/>
+              <w:bottom w:type="dxa" w:w="50"/>
+              <w:right w:type="dxa" w:w="100"/>
+            </w:tcMar>
+            <w:vAlign w:val="center"/>
+          </w:tcPr>
+          <w:p>
+            <w:pPr>
+              <w:spacing w:after="0" w:before="0"/>
+              <w:jc w:val="left"/>
+            </w:pPr>
+            <w:r>
+              <w:rPr>
+                <w:rFonts w:ascii="Arial" w:cs="Arial" w:eastAsia="Arial" w:hAnsi="Arial"/>
+                <w:sz w:val="20"/>
+                <w:szCs w:val="20"/>
+              </w:rPr>
+              <w:t xml:space="preserve">getCurrentUser() = null</w:t>
+            </w:r>
+          </w:p>
+        </w:tc>
+        <w:tc>
+          <w:tcPr>
+            <w:tcW w:type="dxa" w:w="1000"/>
+            <w:tcBorders>
+              <w:top w:val="single" w:color="B0BEC5" w:sz="1"/>
+              <w:left w:val="single" w:color="B0BEC5" w:sz="1"/>
+              <w:bottom w:val="single" w:color="B0BEC5" w:sz="1"/>
+              <w:right w:val="single" w:color="B0BEC5" w:sz="1"/>
+            </w:tcBorders>
+            <w:tcMar>
+              <w:top w:type="dxa" w:w="50"/>
+              <w:left w:type="dxa" w:w="100"/>
+              <w:bottom w:type="dxa" w:w="50"/>
+              <w:right w:type="dxa" w:w="100"/>
+            </w:tcMar>
+            <w:vAlign w:val="center"/>
+          </w:tcPr>
+          <w:p>
+            <w:pPr>
+              <w:spacing w:after="0" w:before="0"/>
+              <w:jc w:val="center"/>
+            </w:pPr>
+            <w:r>
+              <w:rPr>
+                <w:rFonts w:ascii="Arial" w:cs="Arial" w:eastAsia="Arial" w:hAnsi="Arial"/>
+                <w:b/>
+                <w:bCs/>
+                <w:color w:val="2E7D32"/>
+                <w:sz w:val="20"/>
+                <w:szCs w:val="20"/>
+              </w:rPr>
+              <w:t xml:space="preserve">PASS</w:t>
+            </w:r>
+          </w:p>
+        </w:tc>
+      </w:tr>
+      <w:tr>
+        <w:trPr>
+          <w:cantSplit/>
+        </w:trPr>
+        <w:tc>
+          <w:tcPr>
+            <w:tcW w:type="dxa" w:w="500"/>
+            <w:tcBorders>
+              <w:top w:val="single" w:color="B0BEC5" w:sz="1"/>
+              <w:left w:val="single" w:color="B0BEC5" w:sz="1"/>
+              <w:bottom w:val="single" w:color="B0BEC5" w:sz="1"/>
+              <w:right w:val="single" w:color="B0BEC5" w:sz="1"/>
+            </w:tcBorders>
+            <w:tcMar>
+              <w:top w:type="dxa" w:w="50"/>
+              <w:left w:type="dxa" w:w="100"/>
+              <w:bottom w:type="dxa" w:w="50"/>
+              <w:right w:type="dxa" w:w="100"/>
+            </w:tcMar>
+            <w:vAlign w:val="center"/>
+          </w:tcPr>
+          <w:p>
+            <w:pPr>
+              <w:spacing w:after="0" w:before="0"/>
+              <w:jc w:val="center"/>
+            </w:pPr>
+            <w:r>
+              <w:rPr>
+                <w:rFonts w:ascii="Arial" w:cs="Arial" w:eastAsia="Arial" w:hAnsi="Arial"/>
+                <w:sz w:val="20"/>
+                <w:szCs w:val="20"/>
+              </w:rPr>
+              <w:t xml:space="preserve">4</w:t>
+            </w:r>
+          </w:p>
+        </w:tc>
+        <w:tc>
+          <w:tcPr>
+            <w:tcW w:type="dxa" w:w="2200"/>
+            <w:tcBorders>
+              <w:top w:val="single" w:color="B0BEC5" w:sz="1"/>
+              <w:left w:val="single" w:color="B0BEC5" w:sz="1"/>
+              <w:bottom w:val="single" w:color="B0BEC5" w:sz="1"/>
+              <w:right w:val="single" w:color="B0BEC5" w:sz="1"/>
+            </w:tcBorders>
+            <w:tcMar>
+              <w:top w:type="dxa" w:w="50"/>
+              <w:left w:type="dxa" w:w="100"/>
+              <w:bottom w:type="dxa" w:w="50"/>
+              <w:right w:type="dxa" w:w="100"/>
+            </w:tcMar>
+            <w:vAlign w:val="center"/>
+          </w:tcPr>
+          <w:p>
+            <w:pPr>
+              <w:spacing w:after="0" w:before="0"/>
+              <w:jc w:val="left"/>
+            </w:pPr>
+            <w:r>
+              <w:rPr>
+                <w:rFonts w:ascii="Arial" w:cs="Arial" w:eastAsia="Arial" w:hAnsi="Arial"/>
+                <w:sz w:val="20"/>
+                <w:szCs w:val="20"/>
+              </w:rPr>
+              <w:t xml:space="preserve">Admin logout clears session</w:t>
+            </w:r>
+          </w:p>
+        </w:tc>
+        <w:tc>
+          <w:tcPr>
+            <w:tcW w:type="dxa" w:w="2200"/>
+            <w:tcBorders>
+              <w:top w:val="single" w:color="B0BEC5" w:sz="1"/>
+              <w:left w:val="single" w:color="B0BEC5" w:sz="1"/>
+              <w:bottom w:val="single" w:color="B0BEC5" w:sz="1"/>
+              <w:right w:val="single" w:color="B0BEC5" w:sz="1"/>
+            </w:tcBorders>
+            <w:tcMar>
+              <w:top w:type="dxa" w:w="50"/>
+              <w:left w:type="dxa" w:w="100"/>
+              <w:bottom w:type="dxa" w:w="50"/>
+              <w:right w:type="dxa" w:w="100"/>
+            </w:tcMar>
+            <w:vAlign w:val="center"/>
+          </w:tcPr>
+          <w:p>
+            <w:pPr>
+              <w:spacing w:after="0" w:before="0"/>
+              <w:jc w:val="left"/>
+            </w:pPr>
+            <w:r>
+              <w:rPr>
+                <w:rFonts w:ascii="Arial" w:cs="Arial" w:eastAsia="Arial" w:hAnsi="Arial"/>
+                <w:sz w:val="20"/>
+                <w:szCs w:val="20"/>
+              </w:rPr>
+              <w:t xml:space="preserve">login A01 → logout()</w:t>
+            </w:r>
+          </w:p>
+        </w:tc>
+        <w:tc>
+          <w:tcPr>
+            <w:tcW w:type="dxa" w:w="2200"/>
+            <w:tcBorders>
+              <w:top w:val="single" w:color="B0BEC5" w:sz="1"/>
+              <w:left w:val="single" w:color="B0BEC5" w:sz="1"/>
+              <w:bottom w:val="single" w:color="B0BEC5" w:sz="1"/>
+              <w:right w:val="single" w:color="B0BEC5" w:sz="1"/>
+            </w:tcBorders>
+            <w:tcMar>
+              <w:top w:type="dxa" w:w="50"/>
+              <w:left w:type="dxa" w:w="100"/>
+              <w:bottom w:type="dxa" w:w="50"/>
+              <w:right w:type="dxa" w:w="100"/>
+            </w:tcMar>
+            <w:vAlign w:val="center"/>
+          </w:tcPr>
+          <w:p>
+            <w:pPr>
+              <w:spacing w:after="0" w:before="0"/>
+              <w:jc w:val="left"/>
+            </w:pPr>
+            <w:r>
+              <w:rPr>
+                <w:rFonts w:ascii="Arial" w:cs="Arial" w:eastAsia="Arial" w:hAnsi="Arial"/>
+                <w:sz w:val="20"/>
+                <w:szCs w:val="20"/>
+              </w:rPr>
+              <w:t xml:space="preserve">getCurrentUser() = null after logout</w:t>
+            </w:r>
+          </w:p>
+        </w:tc>
+        <w:tc>
+          <w:tcPr>
+            <w:tcW w:type="dxa" w:w="2200"/>
+            <w:tcBorders>
+              <w:top w:val="single" w:color="B0BEC5" w:sz="1"/>
+              <w:left w:val="single" w:color="B0BEC5" w:sz="1"/>
+              <w:bottom w:val="single" w:color="B0BEC5" w:sz="1"/>
+              <w:right w:val="single" w:color="B0BEC5" w:sz="1"/>
+            </w:tcBorders>
+            <w:tcMar>
+              <w:top w:type="dxa" w:w="50"/>
+              <w:left w:type="dxa" w:w="100"/>
+              <w:bottom w:type="dxa" w:w="50"/>
+              <w:right w:type="dxa" w:w="100"/>
+            </w:tcMar>
+            <w:vAlign w:val="center"/>
+          </w:tcPr>
+          <w:p>
+            <w:pPr>
+              <w:spacing w:after="0" w:before="0"/>
+              <w:jc w:val="left"/>
+            </w:pPr>
+            <w:r>
+              <w:rPr>
+                <w:rFonts w:ascii="Arial" w:cs="Arial" w:eastAsia="Arial" w:hAnsi="Arial"/>
+                <w:sz w:val="20"/>
+                <w:szCs w:val="20"/>
+              </w:rPr>
+              <w:t xml:space="preserve">getCurrentUser() = null</w:t>
+            </w:r>
+          </w:p>
+        </w:tc>
+        <w:tc>
+          <w:tcPr>
+            <w:tcW w:type="dxa" w:w="1000"/>
+            <w:tcBorders>
+              <w:top w:val="single" w:color="B0BEC5" w:sz="1"/>
+              <w:left w:val="single" w:color="B0BEC5" w:sz="1"/>
+              <w:bottom w:val="single" w:color="B0BEC5" w:sz="1"/>
+              <w:right w:val="single" w:color="B0BEC5" w:sz="1"/>
+            </w:tcBorders>
+            <w:tcMar>
+              <w:top w:type="dxa" w:w="50"/>
+              <w:left w:type="dxa" w:w="100"/>
+              <w:bottom w:type="dxa" w:w="50"/>
+              <w:right w:type="dxa" w:w="100"/>
+            </w:tcMar>
+            <w:vAlign w:val="center"/>
+          </w:tcPr>
+          <w:p>
+            <w:pPr>
+              <w:spacing w:after="0" w:before="0"/>
+              <w:jc w:val="center"/>
+            </w:pPr>
+            <w:r>
+              <w:rPr>
+                <w:rFonts w:ascii="Arial" w:cs="Arial" w:eastAsia="Arial" w:hAnsi="Arial"/>
+                <w:b/>
+                <w:bCs/>
+                <w:color w:val="2E7D32"/>
+                <w:sz w:val="20"/>
+                <w:szCs w:val="20"/>
+              </w:rPr>
+              <w:t xml:space="preserve">PASS</w:t>
+            </w:r>
+          </w:p>
+        </w:tc>
+      </w:tr>
+      <w:tr>
+        <w:trPr>
+          <w:cantSplit/>
+        </w:trPr>
+        <w:tc>
+          <w:tcPr>
+            <w:tcW w:type="dxa" w:w="500"/>
+            <w:tcBorders>
+              <w:top w:val="single" w:color="B0BEC5" w:sz="1"/>
+              <w:left w:val="single" w:color="B0BEC5" w:sz="1"/>
+              <w:bottom w:val="single" w:color="B0BEC5" w:sz="1"/>
+              <w:right w:val="single" w:color="B0BEC5" w:sz="1"/>
+            </w:tcBorders>
+            <w:shd w:fill="F0F4F8" w:val="clear"/>
+            <w:tcMar>
+              <w:top w:type="dxa" w:w="50"/>
+              <w:left w:type="dxa" w:w="100"/>
+              <w:bottom w:type="dxa" w:w="50"/>
+              <w:right w:type="dxa" w:w="100"/>
+            </w:tcMar>
+            <w:vAlign w:val="center"/>
+          </w:tcPr>
+          <w:p>
+            <w:pPr>
+              <w:spacing w:after="0" w:before="0"/>
+              <w:jc w:val="center"/>
+            </w:pPr>
+            <w:r>
+              <w:rPr>
+                <w:rFonts w:ascii="Arial" w:cs="Arial" w:eastAsia="Arial" w:hAnsi="Arial"/>
+                <w:sz w:val="20"/>
+                <w:szCs w:val="20"/>
+              </w:rPr>
+              <w:t xml:space="preserve">5</w:t>
+            </w:r>
+          </w:p>
+        </w:tc>
+        <w:tc>
+          <w:tcPr>
+            <w:tcW w:type="dxa" w:w="2200"/>
+            <w:tcBorders>
+              <w:top w:val="single" w:color="B0BEC5" w:sz="1"/>
+              <w:left w:val="single" w:color="B0BEC5" w:sz="1"/>
+              <w:bottom w:val="single" w:color="B0BEC5" w:sz="1"/>
+              <w:right w:val="single" w:color="B0BEC5" w:sz="1"/>
+            </w:tcBorders>
+            <w:shd w:fill="F0F4F8" w:val="clear"/>
+            <w:tcMar>
+              <w:top w:type="dxa" w:w="50"/>
+              <w:left w:type="dxa" w:w="100"/>
+              <w:bottom w:type="dxa" w:w="50"/>
+              <w:right w:type="dxa" w:w="100"/>
+            </w:tcMar>
+            <w:vAlign w:val="center"/>
+          </w:tcPr>
+          <w:p>
+            <w:pPr>
+              <w:spacing w:after="0" w:before="0"/>
+              <w:jc w:val="left"/>
+            </w:pPr>
+            <w:r>
+              <w:rPr>
+                <w:rFonts w:ascii="Arial" w:cs="Arial" w:eastAsia="Arial" w:hAnsi="Arial"/>
+                <w:sz w:val="20"/>
+                <w:szCs w:val="20"/>
+              </w:rPr>
+              <w:t xml:space="preserve">Player logout clears session</w:t>
+            </w:r>
+          </w:p>
+        </w:tc>
+        <w:tc>
+          <w:tcPr>
+            <w:tcW w:type="dxa" w:w="2200"/>
+            <w:tcBorders>
+              <w:top w:val="single" w:color="B0BEC5" w:sz="1"/>
+              <w:left w:val="single" w:color="B0BEC5" w:sz="1"/>
+              <w:bottom w:val="single" w:color="B0BEC5" w:sz="1"/>
+              <w:right w:val="single" w:color="B0BEC5" w:sz="1"/>
+            </w:tcBorders>
+            <w:shd w:fill="F0F4F8" w:val="clear"/>
+            <w:tcMar>
+              <w:top w:type="dxa" w:w="50"/>
+              <w:left w:type="dxa" w:w="100"/>
+              <w:bottom w:type="dxa" w:w="50"/>
+              <w:right w:type="dxa" w:w="100"/>
+            </w:tcMar>
+            <w:vAlign w:val="center"/>
+          </w:tcPr>
+          <w:p>
+            <w:pPr>
+              <w:spacing w:after="0" w:before="0"/>
+              <w:jc w:val="left"/>
+            </w:pPr>
+            <w:r>
+              <w:rPr>
+                <w:rFonts w:ascii="Arial" w:cs="Arial" w:eastAsia="Arial" w:hAnsi="Arial"/>
+                <w:sz w:val="20"/>
+                <w:szCs w:val="20"/>
+              </w:rPr>
+              <w:t xml:space="preserve">login P01 → logout()</w:t>
+            </w:r>
+          </w:p>
+        </w:tc>
+        <w:tc>
+          <w:tcPr>
+            <w:tcW w:type="dxa" w:w="2200"/>
+            <w:tcBorders>
+              <w:top w:val="single" w:color="B0BEC5" w:sz="1"/>
+              <w:left w:val="single" w:color="B0BEC5" w:sz="1"/>
+              <w:bottom w:val="single" w:color="B0BEC5" w:sz="1"/>
+              <w:right w:val="single" w:color="B0BEC5" w:sz="1"/>
+            </w:tcBorders>
+            <w:shd w:fill="F0F4F8" w:val="clear"/>
+            <w:tcMar>
+              <w:top w:type="dxa" w:w="50"/>
+              <w:left w:type="dxa" w:w="100"/>
+              <w:bottom w:type="dxa" w:w="50"/>
+              <w:right w:type="dxa" w:w="100"/>
+            </w:tcMar>
+            <w:vAlign w:val="center"/>
+          </w:tcPr>
+          <w:p>
+            <w:pPr>
+              <w:spacing w:after="0" w:before="0"/>
+              <w:jc w:val="left"/>
+            </w:pPr>
+            <w:r>
+              <w:rPr>
+                <w:rFonts w:ascii="Arial" w:cs="Arial" w:eastAsia="Arial" w:hAnsi="Arial"/>
+                <w:sz w:val="20"/>
+                <w:szCs w:val="20"/>
+              </w:rPr>
+              <w:t xml:space="preserve">getCurrentUser() = null after logout</w:t>
+            </w:r>
+          </w:p>
+        </w:tc>
+        <w:tc>
+          <w:tcPr>
+            <w:tcW w:type="dxa" w:w="2200"/>
+            <w:tcBorders>
+              <w:top w:val="single" w:color="B0BEC5" w:sz="1"/>
+              <w:left w:val="single" w:color="B0BEC5" w:sz="1"/>
+              <w:bottom w:val="single" w:color="B0BEC5" w:sz="1"/>
+              <w:right w:val="single" w:color="B0BEC5" w:sz="1"/>
+            </w:tcBorders>
+            <w:shd w:fill="F0F4F8" w:val="clear"/>
+            <w:tcMar>
+              <w:top w:type="dxa" w:w="50"/>
+              <w:left w:type="dxa" w:w="100"/>
+              <w:bottom w:type="dxa" w:w="50"/>
+              <w:right w:type="dxa" w:w="100"/>
+            </w:tcMar>
+            <w:vAlign w:val="center"/>
+          </w:tcPr>
+          <w:p>
+            <w:pPr>
+              <w:spacing w:after="0" w:before="0"/>
+              <w:jc w:val="left"/>
+            </w:pPr>
+            <w:r>
+              <w:rPr>
+                <w:rFonts w:ascii="Arial" w:cs="Arial" w:eastAsia="Arial" w:hAnsi="Arial"/>
+                <w:sz w:val="20"/>
+                <w:szCs w:val="20"/>
+              </w:rPr>
+              <w:t xml:space="preserve">getCurrentUser() = null</w:t>
+            </w:r>
+          </w:p>
+        </w:tc>
+        <w:tc>
+          <w:tcPr>
+            <w:tcW w:type="dxa" w:w="1000"/>
+            <w:tcBorders>
+              <w:top w:val="single" w:color="B0BEC5" w:sz="1"/>
+              <w:left w:val="single" w:color="B0BEC5" w:sz="1"/>
+              <w:bottom w:val="single" w:color="B0BEC5" w:sz="1"/>
+              <w:right w:val="single" w:color="B0BEC5" w:sz="1"/>
+            </w:tcBorders>
+            <w:tcMar>
+              <w:top w:type="dxa" w:w="50"/>
+              <w:left w:type="dxa" w:w="100"/>
+              <w:bottom w:type="dxa" w:w="50"/>
+              <w:right w:type="dxa" w:w="100"/>
+            </w:tcMar>
+            <w:vAlign w:val="center"/>
+          </w:tcPr>
+          <w:p>
+            <w:pPr>
+              <w:spacing w:after="0" w:before="0"/>
+              <w:jc w:val="center"/>
+            </w:pPr>
+            <w:r>
+              <w:rPr>
+                <w:rFonts w:ascii="Arial" w:cs="Arial" w:eastAsia="Arial" w:hAnsi="Arial"/>
+                <w:b/>
+                <w:bCs/>
+                <w:color w:val="2E7D32"/>
+                <w:sz w:val="20"/>
+                <w:szCs w:val="20"/>
+              </w:rPr>
+              <w:t xml:space="preserve">PASS</w:t>
+            </w:r>
+          </w:p>
+        </w:tc>
+      </w:tr>
+      <w:tr>
+        <w:trPr>
+          <w:cantSplit/>
+        </w:trPr>
+        <w:tc>
+          <w:tcPr>
+            <w:tcW w:type="dxa" w:w="500"/>
+            <w:tcBorders>
+              <w:top w:val="single" w:color="B0BEC5" w:sz="1"/>
+              <w:left w:val="single" w:color="B0BEC5" w:sz="1"/>
+              <w:bottom w:val="single" w:color="B0BEC5" w:sz="1"/>
+              <w:right w:val="single" w:color="B0BEC5" w:sz="1"/>
+            </w:tcBorders>
+            <w:tcMar>
+              <w:top w:type="dxa" w:w="50"/>
+              <w:left w:type="dxa" w:w="100"/>
+              <w:bottom w:type="dxa" w:w="50"/>
+              <w:right w:type="dxa" w:w="100"/>
+            </w:tcMar>
+            <w:vAlign w:val="center"/>
+          </w:tcPr>
+          <w:p>
+            <w:pPr>
+              <w:spacing w:after="0" w:before="0"/>
+              <w:jc w:val="center"/>
+            </w:pPr>
+            <w:r>
+              <w:rPr>
+                <w:rFonts w:ascii="Arial" w:cs="Arial" w:eastAsia="Arial" w:hAnsi="Arial"/>
+                <w:sz w:val="20"/>
+                <w:szCs w:val="20"/>
+              </w:rPr>
+              <w:t xml:space="preserve">6</w:t>
+            </w:r>
+          </w:p>
+        </w:tc>
+        <w:tc>
+          <w:tcPr>
+            <w:tcW w:type="dxa" w:w="2200"/>
+            <w:tcBorders>
+              <w:top w:val="single" w:color="B0BEC5" w:sz="1"/>
+              <w:left w:val="single" w:color="B0BEC5" w:sz="1"/>
+              <w:bottom w:val="single" w:color="B0BEC5" w:sz="1"/>
+              <w:right w:val="single" w:color="B0BEC5" w:sz="1"/>
+            </w:tcBorders>
+            <w:tcMar>
+              <w:top w:type="dxa" w:w="50"/>
+              <w:left w:type="dxa" w:w="100"/>
+              <w:bottom w:type="dxa" w:w="50"/>
+              <w:right w:type="dxa" w:w="100"/>
+            </w:tcMar>
+            <w:vAlign w:val="center"/>
+          </w:tcPr>
+          <w:p>
+            <w:pPr>
+              <w:spacing w:after="0" w:before="0"/>
+              <w:jc w:val="left"/>
+            </w:pPr>
+            <w:r>
+              <w:rPr>
+                <w:rFonts w:ascii="Arial" w:cs="Arial" w:eastAsia="Arial" w:hAnsi="Arial"/>
+                <w:sz w:val="20"/>
+                <w:szCs w:val="20"/>
+              </w:rPr>
+              <w:t xml:space="preserve">Multiple login switches role</w:t>
+            </w:r>
+          </w:p>
+        </w:tc>
+        <w:tc>
+          <w:tcPr>
+            <w:tcW w:type="dxa" w:w="2200"/>
+            <w:tcBorders>
+              <w:top w:val="single" w:color="B0BEC5" w:sz="1"/>
+              <w:left w:val="single" w:color="B0BEC5" w:sz="1"/>
+              <w:bottom w:val="single" w:color="B0BEC5" w:sz="1"/>
+              <w:right w:val="single" w:color="B0BEC5" w:sz="1"/>
+            </w:tcBorders>
+            <w:tcMar>
+              <w:top w:type="dxa" w:w="50"/>
+              <w:left w:type="dxa" w:w="100"/>
+              <w:bottom w:type="dxa" w:w="50"/>
+              <w:right w:type="dxa" w:w="100"/>
+            </w:tcMar>
+            <w:vAlign w:val="center"/>
+          </w:tcPr>
+          <w:p>
+            <w:pPr>
+              <w:spacing w:after="0" w:before="0"/>
+              <w:jc w:val="left"/>
+            </w:pPr>
+            <w:r>
+              <w:rPr>
+                <w:rFonts w:ascii="Arial" w:cs="Arial" w:eastAsia="Arial" w:hAnsi="Arial"/>
+                <w:sz w:val="20"/>
+                <w:szCs w:val="20"/>
+              </w:rPr>
+              <w:t xml:space="preserve">P01 → logout → A01 → logout → P02</w:t>
+            </w:r>
+          </w:p>
+        </w:tc>
+        <w:tc>
+          <w:tcPr>
+            <w:tcW w:type="dxa" w:w="2200"/>
+            <w:tcBorders>
+              <w:top w:val="single" w:color="B0BEC5" w:sz="1"/>
+              <w:left w:val="single" w:color="B0BEC5" w:sz="1"/>
+              <w:bottom w:val="single" w:color="B0BEC5" w:sz="1"/>
+              <w:right w:val="single" w:color="B0BEC5" w:sz="1"/>
+            </w:tcBorders>
+            <w:tcMar>
+              <w:top w:type="dxa" w:w="50"/>
+              <w:left w:type="dxa" w:w="100"/>
+              <w:bottom w:type="dxa" w:w="50"/>
+              <w:right w:type="dxa" w:w="100"/>
+            </w:tcMar>
+            <w:vAlign w:val="center"/>
+          </w:tcPr>
+          <w:p>
+            <w:pPr>
+              <w:spacing w:after="0" w:before="0"/>
+              <w:jc w:val="left"/>
+            </w:pPr>
+            <w:r>
+              <w:rPr>
+                <w:rFonts w:ascii="Arial" w:cs="Arial" w:eastAsia="Arial" w:hAnsi="Arial"/>
+                <w:sz w:val="20"/>
+                <w:szCs w:val="20"/>
+              </w:rPr>
+              <w:t xml:space="preserve">Player → Admin → Player</w:t>
+            </w:r>
+          </w:p>
+        </w:tc>
+        <w:tc>
+          <w:tcPr>
+            <w:tcW w:type="dxa" w:w="2200"/>
+            <w:tcBorders>
+              <w:top w:val="single" w:color="B0BEC5" w:sz="1"/>
+              <w:left w:val="single" w:color="B0BEC5" w:sz="1"/>
+              <w:bottom w:val="single" w:color="B0BEC5" w:sz="1"/>
+              <w:right w:val="single" w:color="B0BEC5" w:sz="1"/>
+            </w:tcBorders>
+            <w:tcMar>
+              <w:top w:type="dxa" w:w="50"/>
+              <w:left w:type="dxa" w:w="100"/>
+              <w:bottom w:type="dxa" w:w="50"/>
+              <w:right w:type="dxa" w:w="100"/>
+            </w:tcMar>
+            <w:vAlign w:val="center"/>
+          </w:tcPr>
+          <w:p>
+            <w:pPr>
+              <w:spacing w:after="0" w:before="0"/>
+              <w:jc w:val="left"/>
+            </w:pPr>
+            <w:r>
+              <w:rPr>
+                <w:rFonts w:ascii="Arial" w:cs="Arial" w:eastAsia="Arial" w:hAnsi="Arial"/>
+                <w:sz w:val="20"/>
+                <w:szCs w:val="20"/>
+              </w:rPr>
+              <w:t xml:space="preserve">Player → Admin → Player</w:t>
+            </w:r>
+          </w:p>
+        </w:tc>
+        <w:tc>
+          <w:tcPr>
+            <w:tcW w:type="dxa" w:w="1000"/>
+            <w:tcBorders>
+              <w:top w:val="single" w:color="B0BEC5" w:sz="1"/>
+              <w:left w:val="single" w:color="B0BEC5" w:sz="1"/>
+              <w:bottom w:val="single" w:color="B0BEC5" w:sz="1"/>
+              <w:right w:val="single" w:color="B0BEC5" w:sz="1"/>
+            </w:tcBorders>
+            <w:tcMar>
+              <w:top w:type="dxa" w:w="50"/>
+              <w:left w:type="dxa" w:w="100"/>
+              <w:bottom w:type="dxa" w:w="50"/>
+              <w:right w:type="dxa" w:w="100"/>
+            </w:tcMar>
+            <w:vAlign w:val="center"/>
+          </w:tcPr>
+          <w:p>
+            <w:pPr>
+              <w:spacing w:after="0" w:before="0"/>
+              <w:jc w:val="center"/>
+            </w:pPr>
+            <w:r>
+              <w:rPr>
+                <w:rFonts w:ascii="Arial" w:cs="Arial" w:eastAsia="Arial" w:hAnsi="Arial"/>
+                <w:b/>
+                <w:bCs/>
+                <w:color w:val="2E7D32"/>
+                <w:sz w:val="20"/>
+                <w:szCs w:val="20"/>
+              </w:rPr>
+              <w:t xml:space="preserve">PASS</w:t>
+            </w:r>
+          </w:p>
+        </w:tc>
+      </w:tr>
+    </w:tbl>
+    <w:p>
+      <w:pPr>
+        <w:pStyle w:val="Heading2"/>
+      </w:pPr>
+      <w:r>
+        <w:t xml:space="preserve">Notes</w:t>
+      </w:r>
+    </w:p>
+    <w:p>
+      <w:pPr>
+        <w:pStyle w:val="ListParagraph"/>
+        <w:numPr>
+          <w:ilvl w:val="0"/>
+          <w:numId w:val="2"/>
+        </w:numPr>
+        <w:spacing w:after="60"/>
       </w:pPr>
       <w:r>
         <w:rPr>
           <w:rFonts w:ascii="Arial" w:cs="Arial" w:eastAsia="Arial" w:hAnsi="Arial"/>
-          <w:i/>
-          <w:iCs/>
-          <w:color w:val="90A4AE"/>
           <w:sz w:val="22"/>
           <w:szCs w:val="22"/>
         </w:rPr>
-        <w:t xml:space="preserve">(Add test case table here after next test session)</w:t>
+        <w:t xml:space="preserve">All 6 test cases passed on first run.</w:t>
+      </w:r>
+    </w:p>
+    <w:p>
+      <w:pPr>
+        <w:pStyle w:val="ListParagraph"/>
+        <w:numPr>
+          <w:ilvl w:val="0"/>
+          <w:numId w:val="2"/>
+        </w:numPr>
+        <w:spacing w:after="60"/>
+      </w:pPr>
+      <w:r>
+        <w:rPr>
+          <w:rFonts w:ascii="Arial" w:cs="Arial" w:eastAsia="Arial" w:hAnsi="Arial"/>
+          <w:sz w:val="22"/>
+          <w:szCs w:val="22"/>
+        </w:rPr>
+        <w:t xml:space="preserve">Tested role switching across multiple login/logout cycles.</w:t>
+      </w:r>
+    </w:p>
+    <w:p>
+      <w:pPr>
+        <w:pStyle w:val="ListParagraph"/>
+        <w:numPr>
+          <w:ilvl w:val="0"/>
+          <w:numId w:val="2"/>
+        </w:numPr>
+        <w:spacing w:after="60"/>
+      </w:pPr>
+      <w:r>
+        <w:rPr>
+          <w:rFonts w:ascii="Arial" w:cs="Arial" w:eastAsia="Arial" w:hAnsi="Arial"/>
+          <w:sz w:val="22"/>
+          <w:szCs w:val="22"/>
+        </w:rPr>
+        <w:t xml:space="preserve">Session state correctly cleared after each logout.</w:t>
       </w:r>
     </w:p>
     <w:p>
@@ -2787,25 +4297,5 @@
       <w:szCs w:val="28"/>
     </w:rPr>
   </w:style>
-  <w:style w:type="paragraph" w:styleId="Heading3">
-    <w:name w:val="Heading 3"/>
-    <w:basedOn w:val="Normal"/>
-    <w:next w:val="Normal"/>
-    <w:qFormat/>
-    <w:pPr>
-      <w:keepNext w:val="false"/>
-      <w:keepLines w:val="false"/>
-      <w:spacing w:after="100" w:before="200"/>
-      <w:outlineLvl w:val="2"/>
-    </w:pPr>
-    <w:rPr>
-      <w:rFonts w:ascii="Arial" w:cs="Arial" w:eastAsia="Arial" w:hAnsi="Arial"/>
-      <w:b/>
-      <w:bCs/>
-      <w:color w:val="37474F"/>
-      <w:sz w:val="24"/>
-      <w:szCs w:val="24"/>
-    </w:rPr>
-  </w:style>
 </w:styles>
 </file>
</xml_diff>

<commit_message>
[Test]Test Player Rankings and Team Rankings functions.
</commit_message>
<xml_diff>
--- a/king/docs/test-cases.docx
+++ b/king/docs/test-cases.docx
@@ -11487,23 +11487,2457 @@
         <w:pStyle w:val="Heading1"/>
       </w:pPr>
       <w:r>
-        <w:t xml:space="preserve">Test Session 8: [To Be Filled]</w:t>
+        <w:t xml:space="preserve">Test Session 8: Rankings (F6)</w:t>
       </w:r>
     </w:p>
     <w:p>
       <w:pPr>
-        <w:spacing w:after="200"/>
+        <w:spacing w:after="120"/>
       </w:pPr>
       <w:r>
         <w:rPr>
           <w:rFonts w:ascii="Arial" w:cs="Arial" w:eastAsia="Arial" w:hAnsi="Arial"/>
-          <w:i/>
-          <w:iCs/>
-          <w:color w:val="90A4AE"/>
+          <w:b/>
+          <w:bCs/>
           <w:sz w:val="22"/>
           <w:szCs w:val="22"/>
         </w:rPr>
-        <w:t xml:space="preserve">(Add test session here after next test)</w:t>
+        <w:t xml:space="preserve">Date: </w:t>
+      </w:r>
+      <w:r>
+        <w:rPr>
+          <w:rFonts w:ascii="Arial" w:cs="Arial" w:eastAsia="Arial" w:hAnsi="Arial"/>
+          <w:sz w:val="22"/>
+          <w:szCs w:val="22"/>
+        </w:rPr>
+        <w:t xml:space="preserve">2026-06-08</w:t>
+      </w:r>
+    </w:p>
+    <w:p>
+      <w:pPr>
+        <w:spacing w:after="120"/>
+      </w:pPr>
+      <w:r>
+        <w:rPr>
+          <w:rFonts w:ascii="Arial" w:cs="Arial" w:eastAsia="Arial" w:hAnsi="Arial"/>
+          <w:b/>
+          <w:bCs/>
+          <w:sz w:val="22"/>
+          <w:szCs w:val="22"/>
+        </w:rPr>
+        <w:t xml:space="preserve">Test File: </w:t>
+      </w:r>
+      <w:r>
+        <w:rPr>
+          <w:rFonts w:ascii="Arial" w:cs="Arial" w:eastAsia="Arial" w:hAnsi="Arial"/>
+          <w:sz w:val="22"/>
+          <w:szCs w:val="22"/>
+        </w:rPr>
+        <w:t xml:space="preserve">RankingTest.java</w:t>
+      </w:r>
+    </w:p>
+    <w:p>
+      <w:pPr>
+        <w:spacing w:after="120"/>
+      </w:pPr>
+      <w:r>
+        <w:rPr>
+          <w:rFonts w:ascii="Arial" w:cs="Arial" w:eastAsia="Arial" w:hAnsi="Arial"/>
+          <w:b/>
+          <w:bCs/>
+          <w:sz w:val="22"/>
+          <w:szCs w:val="22"/>
+        </w:rPr>
+        <w:t xml:space="preserve">Component Under Test: </w:t>
+      </w:r>
+      <w:r>
+        <w:rPr>
+          <w:rFonts w:ascii="Arial" w:cs="Arial" w:eastAsia="Arial" w:hAnsi="Arial"/>
+          <w:sz w:val="22"/>
+          <w:szCs w:val="22"/>
+        </w:rPr>
+        <w:t xml:space="preserve">RankingService (rankPlayersByWinRate, rankPlayersByLevel, rankPlayersByMatchCount, rankPlayersByHeroCount, rankTeamsByWinRate, rankTeamsByAverageLevel, rankTeamsByTotalMatches, getTopNPlayers)</w:t>
+      </w:r>
+    </w:p>
+    <w:p>
+      <w:pPr>
+        <w:spacing w:after="120"/>
+      </w:pPr>
+      <w:r>
+        <w:rPr>
+          <w:rFonts w:ascii="Arial" w:cs="Arial" w:eastAsia="Arial" w:hAnsi="Arial"/>
+          <w:b/>
+          <w:bCs/>
+          <w:sz w:val="22"/>
+          <w:szCs w:val="22"/>
+        </w:rPr>
+        <w:t xml:space="preserve">Result: </w:t>
+      </w:r>
+      <w:r>
+        <w:rPr>
+          <w:rFonts w:ascii="Arial" w:cs="Arial" w:eastAsia="Arial" w:hAnsi="Arial"/>
+          <w:b/>
+          <w:bCs/>
+          <w:color w:val="2E7D32"/>
+          <w:sz w:val="22"/>
+          <w:szCs w:val="22"/>
+        </w:rPr>
+        <w:t xml:space="preserve">10 PASSED, 0 FAILED</w:t>
+      </w:r>
+    </w:p>
+    <w:p>
+      <w:pPr>
+        <w:pStyle w:val="Heading2"/>
+      </w:pPr>
+      <w:r>
+        <w:t xml:space="preserve">Test Cases</w:t>
+      </w:r>
+    </w:p>
+    <w:tbl>
+      <w:tblPr>
+        <w:tblW w:type="pct" w:w="100%"/>
+        <w:tblBorders>
+          <w:top w:val="single" w:color="auto" w:sz="4"/>
+          <w:left w:val="single" w:color="auto" w:sz="4"/>
+          <w:bottom w:val="single" w:color="auto" w:sz="4"/>
+          <w:right w:val="single" w:color="auto" w:sz="4"/>
+          <w:insideH w:val="single" w:color="auto" w:sz="4"/>
+          <w:insideV w:val="single" w:color="auto" w:sz="4"/>
+        </w:tblBorders>
+      </w:tblPr>
+      <w:tblGrid>
+        <w:gridCol w:w="500"/>
+        <w:gridCol w:w="2200"/>
+        <w:gridCol w:w="2200"/>
+        <w:gridCol w:w="2200"/>
+        <w:gridCol w:w="2200"/>
+        <w:gridCol w:w="1000"/>
+      </w:tblGrid>
+      <w:tr>
+        <w:trPr>
+          <w:cantSplit/>
+        </w:trPr>
+        <w:tc>
+          <w:tcPr>
+            <w:tcW w:type="dxa" w:w="500"/>
+            <w:tcBorders>
+              <w:top w:val="single" w:color="B0BEC5" w:sz="1"/>
+              <w:left w:val="single" w:color="B0BEC5" w:sz="1"/>
+              <w:bottom w:val="single" w:color="B0BEC5" w:sz="1"/>
+              <w:right w:val="single" w:color="B0BEC5" w:sz="1"/>
+            </w:tcBorders>
+            <w:shd w:fill="1B3A5C" w:val="clear"/>
+            <w:tcMar>
+              <w:top w:type="dxa" w:w="60"/>
+              <w:left w:type="dxa" w:w="100"/>
+              <w:bottom w:type="dxa" w:w="60"/>
+              <w:right w:type="dxa" w:w="100"/>
+            </w:tcMar>
+            <w:vAlign w:val="center"/>
+          </w:tcPr>
+          <w:p>
+            <w:pPr>
+              <w:spacing w:after="0" w:before="0"/>
+              <w:jc w:val="center"/>
+            </w:pPr>
+            <w:r>
+              <w:rPr>
+                <w:rFonts w:ascii="Arial" w:cs="Arial" w:eastAsia="Arial" w:hAnsi="Arial"/>
+                <w:b/>
+                <w:bCs/>
+                <w:color w:val="FFFFFF"/>
+                <w:sz w:val="20"/>
+                <w:szCs w:val="20"/>
+              </w:rPr>
+              <w:t xml:space="preserve">#</w:t>
+            </w:r>
+          </w:p>
+        </w:tc>
+        <w:tc>
+          <w:tcPr>
+            <w:tcW w:type="dxa" w:w="2200"/>
+            <w:tcBorders>
+              <w:top w:val="single" w:color="B0BEC5" w:sz="1"/>
+              <w:left w:val="single" w:color="B0BEC5" w:sz="1"/>
+              <w:bottom w:val="single" w:color="B0BEC5" w:sz="1"/>
+              <w:right w:val="single" w:color="B0BEC5" w:sz="1"/>
+            </w:tcBorders>
+            <w:shd w:fill="1B3A5C" w:val="clear"/>
+            <w:tcMar>
+              <w:top w:type="dxa" w:w="60"/>
+              <w:left w:type="dxa" w:w="100"/>
+              <w:bottom w:type="dxa" w:w="60"/>
+              <w:right w:type="dxa" w:w="100"/>
+            </w:tcMar>
+            <w:vAlign w:val="center"/>
+          </w:tcPr>
+          <w:p>
+            <w:pPr>
+              <w:spacing w:after="0" w:before="0"/>
+              <w:jc w:val="center"/>
+            </w:pPr>
+            <w:r>
+              <w:rPr>
+                <w:rFonts w:ascii="Arial" w:cs="Arial" w:eastAsia="Arial" w:hAnsi="Arial"/>
+                <w:b/>
+                <w:bCs/>
+                <w:color w:val="FFFFFF"/>
+                <w:sz w:val="20"/>
+                <w:szCs w:val="20"/>
+              </w:rPr>
+              <w:t xml:space="preserve">Test Case</w:t>
+            </w:r>
+          </w:p>
+        </w:tc>
+        <w:tc>
+          <w:tcPr>
+            <w:tcW w:type="dxa" w:w="2200"/>
+            <w:tcBorders>
+              <w:top w:val="single" w:color="B0BEC5" w:sz="1"/>
+              <w:left w:val="single" w:color="B0BEC5" w:sz="1"/>
+              <w:bottom w:val="single" w:color="B0BEC5" w:sz="1"/>
+              <w:right w:val="single" w:color="B0BEC5" w:sz="1"/>
+            </w:tcBorders>
+            <w:shd w:fill="1B3A5C" w:val="clear"/>
+            <w:tcMar>
+              <w:top w:type="dxa" w:w="60"/>
+              <w:left w:type="dxa" w:w="100"/>
+              <w:bottom w:type="dxa" w:w="60"/>
+              <w:right w:type="dxa" w:w="100"/>
+            </w:tcMar>
+            <w:vAlign w:val="center"/>
+          </w:tcPr>
+          <w:p>
+            <w:pPr>
+              <w:spacing w:after="0" w:before="0"/>
+              <w:jc w:val="center"/>
+            </w:pPr>
+            <w:r>
+              <w:rPr>
+                <w:rFonts w:ascii="Arial" w:cs="Arial" w:eastAsia="Arial" w:hAnsi="Arial"/>
+                <w:b/>
+                <w:bCs/>
+                <w:color w:val="FFFFFF"/>
+                <w:sz w:val="20"/>
+                <w:szCs w:val="20"/>
+              </w:rPr>
+              <w:t xml:space="preserve">Input</w:t>
+            </w:r>
+          </w:p>
+        </w:tc>
+        <w:tc>
+          <w:tcPr>
+            <w:tcW w:type="dxa" w:w="2200"/>
+            <w:tcBorders>
+              <w:top w:val="single" w:color="B0BEC5" w:sz="1"/>
+              <w:left w:val="single" w:color="B0BEC5" w:sz="1"/>
+              <w:bottom w:val="single" w:color="B0BEC5" w:sz="1"/>
+              <w:right w:val="single" w:color="B0BEC5" w:sz="1"/>
+            </w:tcBorders>
+            <w:shd w:fill="1B3A5C" w:val="clear"/>
+            <w:tcMar>
+              <w:top w:type="dxa" w:w="60"/>
+              <w:left w:type="dxa" w:w="100"/>
+              <w:bottom w:type="dxa" w:w="60"/>
+              <w:right w:type="dxa" w:w="100"/>
+            </w:tcMar>
+            <w:vAlign w:val="center"/>
+          </w:tcPr>
+          <w:p>
+            <w:pPr>
+              <w:spacing w:after="0" w:before="0"/>
+              <w:jc w:val="center"/>
+            </w:pPr>
+            <w:r>
+              <w:rPr>
+                <w:rFonts w:ascii="Arial" w:cs="Arial" w:eastAsia="Arial" w:hAnsi="Arial"/>
+                <w:b/>
+                <w:bCs/>
+                <w:color w:val="FFFFFF"/>
+                <w:sz w:val="20"/>
+                <w:szCs w:val="20"/>
+              </w:rPr>
+              <w:t xml:space="preserve">Expected Output</w:t>
+            </w:r>
+          </w:p>
+        </w:tc>
+        <w:tc>
+          <w:tcPr>
+            <w:tcW w:type="dxa" w:w="2200"/>
+            <w:tcBorders>
+              <w:top w:val="single" w:color="B0BEC5" w:sz="1"/>
+              <w:left w:val="single" w:color="B0BEC5" w:sz="1"/>
+              <w:bottom w:val="single" w:color="B0BEC5" w:sz="1"/>
+              <w:right w:val="single" w:color="B0BEC5" w:sz="1"/>
+            </w:tcBorders>
+            <w:shd w:fill="1B3A5C" w:val="clear"/>
+            <w:tcMar>
+              <w:top w:type="dxa" w:w="60"/>
+              <w:left w:type="dxa" w:w="100"/>
+              <w:bottom w:type="dxa" w:w="60"/>
+              <w:right w:type="dxa" w:w="100"/>
+            </w:tcMar>
+            <w:vAlign w:val="center"/>
+          </w:tcPr>
+          <w:p>
+            <w:pPr>
+              <w:spacing w:after="0" w:before="0"/>
+              <w:jc w:val="center"/>
+            </w:pPr>
+            <w:r>
+              <w:rPr>
+                <w:rFonts w:ascii="Arial" w:cs="Arial" w:eastAsia="Arial" w:hAnsi="Arial"/>
+                <w:b/>
+                <w:bCs/>
+                <w:color w:val="FFFFFF"/>
+                <w:sz w:val="20"/>
+                <w:szCs w:val="20"/>
+              </w:rPr>
+              <w:t xml:space="preserve">Actual Output</w:t>
+            </w:r>
+          </w:p>
+        </w:tc>
+        <w:tc>
+          <w:tcPr>
+            <w:tcW w:type="dxa" w:w="1000"/>
+            <w:tcBorders>
+              <w:top w:val="single" w:color="B0BEC5" w:sz="1"/>
+              <w:left w:val="single" w:color="B0BEC5" w:sz="1"/>
+              <w:bottom w:val="single" w:color="B0BEC5" w:sz="1"/>
+              <w:right w:val="single" w:color="B0BEC5" w:sz="1"/>
+            </w:tcBorders>
+            <w:shd w:fill="1B3A5C" w:val="clear"/>
+            <w:tcMar>
+              <w:top w:type="dxa" w:w="60"/>
+              <w:left w:type="dxa" w:w="100"/>
+              <w:bottom w:type="dxa" w:w="60"/>
+              <w:right w:type="dxa" w:w="100"/>
+            </w:tcMar>
+            <w:vAlign w:val="center"/>
+          </w:tcPr>
+          <w:p>
+            <w:pPr>
+              <w:spacing w:after="0" w:before="0"/>
+              <w:jc w:val="center"/>
+            </w:pPr>
+            <w:r>
+              <w:rPr>
+                <w:rFonts w:ascii="Arial" w:cs="Arial" w:eastAsia="Arial" w:hAnsi="Arial"/>
+                <w:b/>
+                <w:bCs/>
+                <w:color w:val="FFFFFF"/>
+                <w:sz w:val="20"/>
+                <w:szCs w:val="20"/>
+              </w:rPr>
+              <w:t xml:space="preserve">Result</w:t>
+            </w:r>
+          </w:p>
+        </w:tc>
+      </w:tr>
+      <w:tr>
+        <w:trPr>
+          <w:cantSplit/>
+        </w:trPr>
+        <w:tc>
+          <w:tcPr>
+            <w:tcW w:type="dxa" w:w="500"/>
+            <w:tcBorders>
+              <w:top w:val="single" w:color="B0BEC5" w:sz="1"/>
+              <w:left w:val="single" w:color="B0BEC5" w:sz="1"/>
+              <w:bottom w:val="single" w:color="B0BEC5" w:sz="1"/>
+              <w:right w:val="single" w:color="B0BEC5" w:sz="1"/>
+            </w:tcBorders>
+            <w:shd w:fill="F0F4F8" w:val="clear"/>
+            <w:tcMar>
+              <w:top w:type="dxa" w:w="50"/>
+              <w:left w:type="dxa" w:w="100"/>
+              <w:bottom w:type="dxa" w:w="50"/>
+              <w:right w:type="dxa" w:w="100"/>
+            </w:tcMar>
+            <w:vAlign w:val="center"/>
+          </w:tcPr>
+          <w:p>
+            <w:pPr>
+              <w:spacing w:after="0" w:before="0"/>
+              <w:jc w:val="center"/>
+            </w:pPr>
+            <w:r>
+              <w:rPr>
+                <w:rFonts w:ascii="Arial" w:cs="Arial" w:eastAsia="Arial" w:hAnsi="Arial"/>
+                <w:sz w:val="20"/>
+                <w:szCs w:val="20"/>
+              </w:rPr>
+              <w:t xml:space="preserve">1</w:t>
+            </w:r>
+          </w:p>
+        </w:tc>
+        <w:tc>
+          <w:tcPr>
+            <w:tcW w:type="dxa" w:w="2200"/>
+            <w:tcBorders>
+              <w:top w:val="single" w:color="B0BEC5" w:sz="1"/>
+              <w:left w:val="single" w:color="B0BEC5" w:sz="1"/>
+              <w:bottom w:val="single" w:color="B0BEC5" w:sz="1"/>
+              <w:right w:val="single" w:color="B0BEC5" w:sz="1"/>
+            </w:tcBorders>
+            <w:shd w:fill="F0F4F8" w:val="clear"/>
+            <w:tcMar>
+              <w:top w:type="dxa" w:w="50"/>
+              <w:left w:type="dxa" w:w="100"/>
+              <w:bottom w:type="dxa" w:w="50"/>
+              <w:right w:type="dxa" w:w="100"/>
+            </w:tcMar>
+            <w:vAlign w:val="center"/>
+          </w:tcPr>
+          <w:p>
+            <w:pPr>
+              <w:spacing w:after="0" w:before="0"/>
+              <w:jc w:val="left"/>
+            </w:pPr>
+            <w:r>
+              <w:rPr>
+                <w:rFonts w:ascii="Arial" w:cs="Arial" w:eastAsia="Arial" w:hAnsi="Arial"/>
+                <w:sz w:val="20"/>
+                <w:szCs w:val="20"/>
+              </w:rPr>
+              <w:t xml:space="preserve">rankPlayersByWinRate</w:t>
+            </w:r>
+          </w:p>
+        </w:tc>
+        <w:tc>
+          <w:tcPr>
+            <w:tcW w:type="dxa" w:w="2200"/>
+            <w:tcBorders>
+              <w:top w:val="single" w:color="B0BEC5" w:sz="1"/>
+              <w:left w:val="single" w:color="B0BEC5" w:sz="1"/>
+              <w:bottom w:val="single" w:color="B0BEC5" w:sz="1"/>
+              <w:right w:val="single" w:color="B0BEC5" w:sz="1"/>
+            </w:tcBorders>
+            <w:shd w:fill="F0F4F8" w:val="clear"/>
+            <w:tcMar>
+              <w:top w:type="dxa" w:w="50"/>
+              <w:left w:type="dxa" w:w="100"/>
+              <w:bottom w:type="dxa" w:w="50"/>
+              <w:right w:type="dxa" w:w="100"/>
+            </w:tcMar>
+            <w:vAlign w:val="center"/>
+          </w:tcPr>
+          <w:p>
+            <w:pPr>
+              <w:spacing w:after="0" w:before="0"/>
+              <w:jc w:val="left"/>
+            </w:pPr>
+            <w:r>
+              <w:rPr>
+                <w:rFonts w:ascii="Arial" w:cs="Arial" w:eastAsia="Arial" w:hAnsi="Arial"/>
+                <w:sz w:val="20"/>
+                <w:szCs w:val="20"/>
+              </w:rPr>
+              <w:t xml:space="preserve">rs.rankPlayersByWinRate()</w:t>
+            </w:r>
+          </w:p>
+        </w:tc>
+        <w:tc>
+          <w:tcPr>
+            <w:tcW w:type="dxa" w:w="2200"/>
+            <w:tcBorders>
+              <w:top w:val="single" w:color="B0BEC5" w:sz="1"/>
+              <w:left w:val="single" w:color="B0BEC5" w:sz="1"/>
+              <w:bottom w:val="single" w:color="B0BEC5" w:sz="1"/>
+              <w:right w:val="single" w:color="B0BEC5" w:sz="1"/>
+            </w:tcBorders>
+            <w:shd w:fill="F0F4F8" w:val="clear"/>
+            <w:tcMar>
+              <w:top w:type="dxa" w:w="50"/>
+              <w:left w:type="dxa" w:w="100"/>
+              <w:bottom w:type="dxa" w:w="50"/>
+              <w:right w:type="dxa" w:w="100"/>
+            </w:tcMar>
+            <w:vAlign w:val="center"/>
+          </w:tcPr>
+          <w:p>
+            <w:pPr>
+              <w:spacing w:after="0" w:before="0"/>
+              <w:jc w:val="left"/>
+            </w:pPr>
+            <w:r>
+              <w:rPr>
+                <w:rFonts w:ascii="Arial" w:cs="Arial" w:eastAsia="Arial" w:hAnsi="Arial"/>
+                <w:sz w:val="20"/>
+                <w:szCs w:val="20"/>
+              </w:rPr>
+              <w:t xml:space="preserve">top=Chen Jie, winRate=0.78</w:t>
+            </w:r>
+          </w:p>
+        </w:tc>
+        <w:tc>
+          <w:tcPr>
+            <w:tcW w:type="dxa" w:w="2200"/>
+            <w:tcBorders>
+              <w:top w:val="single" w:color="B0BEC5" w:sz="1"/>
+              <w:left w:val="single" w:color="B0BEC5" w:sz="1"/>
+              <w:bottom w:val="single" w:color="B0BEC5" w:sz="1"/>
+              <w:right w:val="single" w:color="B0BEC5" w:sz="1"/>
+            </w:tcBorders>
+            <w:shd w:fill="F0F4F8" w:val="clear"/>
+            <w:tcMar>
+              <w:top w:type="dxa" w:w="50"/>
+              <w:left w:type="dxa" w:w="100"/>
+              <w:bottom w:type="dxa" w:w="50"/>
+              <w:right w:type="dxa" w:w="100"/>
+            </w:tcMar>
+            <w:vAlign w:val="center"/>
+          </w:tcPr>
+          <w:p>
+            <w:pPr>
+              <w:spacing w:after="0" w:before="0"/>
+              <w:jc w:val="left"/>
+            </w:pPr>
+            <w:r>
+              <w:rPr>
+                <w:rFonts w:ascii="Arial" w:cs="Arial" w:eastAsia="Arial" w:hAnsi="Arial"/>
+                <w:sz w:val="20"/>
+                <w:szCs w:val="20"/>
+              </w:rPr>
+              <w:t xml:space="preserve">top=Chen Jie(0.78)</w:t>
+            </w:r>
+          </w:p>
+        </w:tc>
+        <w:tc>
+          <w:tcPr>
+            <w:tcW w:type="dxa" w:w="1000"/>
+            <w:tcBorders>
+              <w:top w:val="single" w:color="B0BEC5" w:sz="1"/>
+              <w:left w:val="single" w:color="B0BEC5" w:sz="1"/>
+              <w:bottom w:val="single" w:color="B0BEC5" w:sz="1"/>
+              <w:right w:val="single" w:color="B0BEC5" w:sz="1"/>
+            </w:tcBorders>
+            <w:tcMar>
+              <w:top w:type="dxa" w:w="50"/>
+              <w:left w:type="dxa" w:w="100"/>
+              <w:bottom w:type="dxa" w:w="50"/>
+              <w:right w:type="dxa" w:w="100"/>
+            </w:tcMar>
+            <w:vAlign w:val="center"/>
+          </w:tcPr>
+          <w:p>
+            <w:pPr>
+              <w:spacing w:after="0" w:before="0"/>
+              <w:jc w:val="center"/>
+            </w:pPr>
+            <w:r>
+              <w:rPr>
+                <w:rFonts w:ascii="Arial" w:cs="Arial" w:eastAsia="Arial" w:hAnsi="Arial"/>
+                <w:b/>
+                <w:bCs/>
+                <w:color w:val="2E7D32"/>
+                <w:sz w:val="20"/>
+                <w:szCs w:val="20"/>
+              </w:rPr>
+              <w:t xml:space="preserve">PASS</w:t>
+            </w:r>
+          </w:p>
+        </w:tc>
+      </w:tr>
+      <w:tr>
+        <w:trPr>
+          <w:cantSplit/>
+        </w:trPr>
+        <w:tc>
+          <w:tcPr>
+            <w:tcW w:type="dxa" w:w="500"/>
+            <w:tcBorders>
+              <w:top w:val="single" w:color="B0BEC5" w:sz="1"/>
+              <w:left w:val="single" w:color="B0BEC5" w:sz="1"/>
+              <w:bottom w:val="single" w:color="B0BEC5" w:sz="1"/>
+              <w:right w:val="single" w:color="B0BEC5" w:sz="1"/>
+            </w:tcBorders>
+            <w:tcMar>
+              <w:top w:type="dxa" w:w="50"/>
+              <w:left w:type="dxa" w:w="100"/>
+              <w:bottom w:type="dxa" w:w="50"/>
+              <w:right w:type="dxa" w:w="100"/>
+            </w:tcMar>
+            <w:vAlign w:val="center"/>
+          </w:tcPr>
+          <w:p>
+            <w:pPr>
+              <w:spacing w:after="0" w:before="0"/>
+              <w:jc w:val="center"/>
+            </w:pPr>
+            <w:r>
+              <w:rPr>
+                <w:rFonts w:ascii="Arial" w:cs="Arial" w:eastAsia="Arial" w:hAnsi="Arial"/>
+                <w:sz w:val="20"/>
+                <w:szCs w:val="20"/>
+              </w:rPr>
+              <w:t xml:space="preserve">2</w:t>
+            </w:r>
+          </w:p>
+        </w:tc>
+        <w:tc>
+          <w:tcPr>
+            <w:tcW w:type="dxa" w:w="2200"/>
+            <w:tcBorders>
+              <w:top w:val="single" w:color="B0BEC5" w:sz="1"/>
+              <w:left w:val="single" w:color="B0BEC5" w:sz="1"/>
+              <w:bottom w:val="single" w:color="B0BEC5" w:sz="1"/>
+              <w:right w:val="single" w:color="B0BEC5" w:sz="1"/>
+            </w:tcBorders>
+            <w:tcMar>
+              <w:top w:type="dxa" w:w="50"/>
+              <w:left w:type="dxa" w:w="100"/>
+              <w:bottom w:type="dxa" w:w="50"/>
+              <w:right w:type="dxa" w:w="100"/>
+            </w:tcMar>
+            <w:vAlign w:val="center"/>
+          </w:tcPr>
+          <w:p>
+            <w:pPr>
+              <w:spacing w:after="0" w:before="0"/>
+              <w:jc w:val="left"/>
+            </w:pPr>
+            <w:r>
+              <w:rPr>
+                <w:rFonts w:ascii="Arial" w:cs="Arial" w:eastAsia="Arial" w:hAnsi="Arial"/>
+                <w:sz w:val="20"/>
+                <w:szCs w:val="20"/>
+              </w:rPr>
+              <w:t xml:space="preserve">rankPlayersByLevel</w:t>
+            </w:r>
+          </w:p>
+        </w:tc>
+        <w:tc>
+          <w:tcPr>
+            <w:tcW w:type="dxa" w:w="2200"/>
+            <w:tcBorders>
+              <w:top w:val="single" w:color="B0BEC5" w:sz="1"/>
+              <w:left w:val="single" w:color="B0BEC5" w:sz="1"/>
+              <w:bottom w:val="single" w:color="B0BEC5" w:sz="1"/>
+              <w:right w:val="single" w:color="B0BEC5" w:sz="1"/>
+            </w:tcBorders>
+            <w:tcMar>
+              <w:top w:type="dxa" w:w="50"/>
+              <w:left w:type="dxa" w:w="100"/>
+              <w:bottom w:type="dxa" w:w="50"/>
+              <w:right w:type="dxa" w:w="100"/>
+            </w:tcMar>
+            <w:vAlign w:val="center"/>
+          </w:tcPr>
+          <w:p>
+            <w:pPr>
+              <w:spacing w:after="0" w:before="0"/>
+              <w:jc w:val="left"/>
+            </w:pPr>
+            <w:r>
+              <w:rPr>
+                <w:rFonts w:ascii="Arial" w:cs="Arial" w:eastAsia="Arial" w:hAnsi="Arial"/>
+                <w:sz w:val="20"/>
+                <w:szCs w:val="20"/>
+              </w:rPr>
+              <w:t xml:space="preserve">rs.rankPlayersByLevel()</w:t>
+            </w:r>
+          </w:p>
+        </w:tc>
+        <w:tc>
+          <w:tcPr>
+            <w:tcW w:type="dxa" w:w="2200"/>
+            <w:tcBorders>
+              <w:top w:val="single" w:color="B0BEC5" w:sz="1"/>
+              <w:left w:val="single" w:color="B0BEC5" w:sz="1"/>
+              <w:bottom w:val="single" w:color="B0BEC5" w:sz="1"/>
+              <w:right w:val="single" w:color="B0BEC5" w:sz="1"/>
+            </w:tcBorders>
+            <w:tcMar>
+              <w:top w:type="dxa" w:w="50"/>
+              <w:left w:type="dxa" w:w="100"/>
+              <w:bottom w:type="dxa" w:w="50"/>
+              <w:right w:type="dxa" w:w="100"/>
+            </w:tcMar>
+            <w:vAlign w:val="center"/>
+          </w:tcPr>
+          <w:p>
+            <w:pPr>
+              <w:spacing w:after="0" w:before="0"/>
+              <w:jc w:val="left"/>
+            </w:pPr>
+            <w:r>
+              <w:rPr>
+                <w:rFonts w:ascii="Arial" w:cs="Arial" w:eastAsia="Arial" w:hAnsi="Arial"/>
+                <w:sz w:val="20"/>
+                <w:szCs w:val="20"/>
+              </w:rPr>
+              <w:t xml:space="preserve">top level=32 (Chen Jie)</w:t>
+            </w:r>
+          </w:p>
+        </w:tc>
+        <w:tc>
+          <w:tcPr>
+            <w:tcW w:type="dxa" w:w="2200"/>
+            <w:tcBorders>
+              <w:top w:val="single" w:color="B0BEC5" w:sz="1"/>
+              <w:left w:val="single" w:color="B0BEC5" w:sz="1"/>
+              <w:bottom w:val="single" w:color="B0BEC5" w:sz="1"/>
+              <w:right w:val="single" w:color="B0BEC5" w:sz="1"/>
+            </w:tcBorders>
+            <w:tcMar>
+              <w:top w:type="dxa" w:w="50"/>
+              <w:left w:type="dxa" w:w="100"/>
+              <w:bottom w:type="dxa" w:w="50"/>
+              <w:right w:type="dxa" w:w="100"/>
+            </w:tcMar>
+            <w:vAlign w:val="center"/>
+          </w:tcPr>
+          <w:p>
+            <w:pPr>
+              <w:spacing w:after="0" w:before="0"/>
+              <w:jc w:val="left"/>
+            </w:pPr>
+            <w:r>
+              <w:rPr>
+                <w:rFonts w:ascii="Arial" w:cs="Arial" w:eastAsia="Arial" w:hAnsi="Arial"/>
+                <w:sz w:val="20"/>
+                <w:szCs w:val="20"/>
+              </w:rPr>
+              <w:t xml:space="preserve">top level=32 (Chen Jie)</w:t>
+            </w:r>
+          </w:p>
+        </w:tc>
+        <w:tc>
+          <w:tcPr>
+            <w:tcW w:type="dxa" w:w="1000"/>
+            <w:tcBorders>
+              <w:top w:val="single" w:color="B0BEC5" w:sz="1"/>
+              <w:left w:val="single" w:color="B0BEC5" w:sz="1"/>
+              <w:bottom w:val="single" w:color="B0BEC5" w:sz="1"/>
+              <w:right w:val="single" w:color="B0BEC5" w:sz="1"/>
+            </w:tcBorders>
+            <w:tcMar>
+              <w:top w:type="dxa" w:w="50"/>
+              <w:left w:type="dxa" w:w="100"/>
+              <w:bottom w:type="dxa" w:w="50"/>
+              <w:right w:type="dxa" w:w="100"/>
+            </w:tcMar>
+            <w:vAlign w:val="center"/>
+          </w:tcPr>
+          <w:p>
+            <w:pPr>
+              <w:spacing w:after="0" w:before="0"/>
+              <w:jc w:val="center"/>
+            </w:pPr>
+            <w:r>
+              <w:rPr>
+                <w:rFonts w:ascii="Arial" w:cs="Arial" w:eastAsia="Arial" w:hAnsi="Arial"/>
+                <w:b/>
+                <w:bCs/>
+                <w:color w:val="2E7D32"/>
+                <w:sz w:val="20"/>
+                <w:szCs w:val="20"/>
+              </w:rPr>
+              <w:t xml:space="preserve">PASS</w:t>
+            </w:r>
+          </w:p>
+        </w:tc>
+      </w:tr>
+      <w:tr>
+        <w:trPr>
+          <w:cantSplit/>
+        </w:trPr>
+        <w:tc>
+          <w:tcPr>
+            <w:tcW w:type="dxa" w:w="500"/>
+            <w:tcBorders>
+              <w:top w:val="single" w:color="B0BEC5" w:sz="1"/>
+              <w:left w:val="single" w:color="B0BEC5" w:sz="1"/>
+              <w:bottom w:val="single" w:color="B0BEC5" w:sz="1"/>
+              <w:right w:val="single" w:color="B0BEC5" w:sz="1"/>
+            </w:tcBorders>
+            <w:shd w:fill="F0F4F8" w:val="clear"/>
+            <w:tcMar>
+              <w:top w:type="dxa" w:w="50"/>
+              <w:left w:type="dxa" w:w="100"/>
+              <w:bottom w:type="dxa" w:w="50"/>
+              <w:right w:type="dxa" w:w="100"/>
+            </w:tcMar>
+            <w:vAlign w:val="center"/>
+          </w:tcPr>
+          <w:p>
+            <w:pPr>
+              <w:spacing w:after="0" w:before="0"/>
+              <w:jc w:val="center"/>
+            </w:pPr>
+            <w:r>
+              <w:rPr>
+                <w:rFonts w:ascii="Arial" w:cs="Arial" w:eastAsia="Arial" w:hAnsi="Arial"/>
+                <w:sz w:val="20"/>
+                <w:szCs w:val="20"/>
+              </w:rPr>
+              <w:t xml:space="preserve">3</w:t>
+            </w:r>
+          </w:p>
+        </w:tc>
+        <w:tc>
+          <w:tcPr>
+            <w:tcW w:type="dxa" w:w="2200"/>
+            <w:tcBorders>
+              <w:top w:val="single" w:color="B0BEC5" w:sz="1"/>
+              <w:left w:val="single" w:color="B0BEC5" w:sz="1"/>
+              <w:bottom w:val="single" w:color="B0BEC5" w:sz="1"/>
+              <w:right w:val="single" w:color="B0BEC5" w:sz="1"/>
+            </w:tcBorders>
+            <w:shd w:fill="F0F4F8" w:val="clear"/>
+            <w:tcMar>
+              <w:top w:type="dxa" w:w="50"/>
+              <w:left w:type="dxa" w:w="100"/>
+              <w:bottom w:type="dxa" w:w="50"/>
+              <w:right w:type="dxa" w:w="100"/>
+            </w:tcMar>
+            <w:vAlign w:val="center"/>
+          </w:tcPr>
+          <w:p>
+            <w:pPr>
+              <w:spacing w:after="0" w:before="0"/>
+              <w:jc w:val="left"/>
+            </w:pPr>
+            <w:r>
+              <w:rPr>
+                <w:rFonts w:ascii="Arial" w:cs="Arial" w:eastAsia="Arial" w:hAnsi="Arial"/>
+                <w:sz w:val="20"/>
+                <w:szCs w:val="20"/>
+              </w:rPr>
+              <w:t xml:space="preserve">rankPlayersByMatchCount</w:t>
+            </w:r>
+          </w:p>
+        </w:tc>
+        <w:tc>
+          <w:tcPr>
+            <w:tcW w:type="dxa" w:w="2200"/>
+            <w:tcBorders>
+              <w:top w:val="single" w:color="B0BEC5" w:sz="1"/>
+              <w:left w:val="single" w:color="B0BEC5" w:sz="1"/>
+              <w:bottom w:val="single" w:color="B0BEC5" w:sz="1"/>
+              <w:right w:val="single" w:color="B0BEC5" w:sz="1"/>
+            </w:tcBorders>
+            <w:shd w:fill="F0F4F8" w:val="clear"/>
+            <w:tcMar>
+              <w:top w:type="dxa" w:w="50"/>
+              <w:left w:type="dxa" w:w="100"/>
+              <w:bottom w:type="dxa" w:w="50"/>
+              <w:right w:type="dxa" w:w="100"/>
+            </w:tcMar>
+            <w:vAlign w:val="center"/>
+          </w:tcPr>
+          <w:p>
+            <w:pPr>
+              <w:spacing w:after="0" w:before="0"/>
+              <w:jc w:val="left"/>
+            </w:pPr>
+            <w:r>
+              <w:rPr>
+                <w:rFonts w:ascii="Arial" w:cs="Arial" w:eastAsia="Arial" w:hAnsi="Arial"/>
+                <w:sz w:val="20"/>
+                <w:szCs w:val="20"/>
+              </w:rPr>
+              <w:t xml:space="preserve">rs.rankPlayersByMatchCount()</w:t>
+            </w:r>
+          </w:p>
+        </w:tc>
+        <w:tc>
+          <w:tcPr>
+            <w:tcW w:type="dxa" w:w="2200"/>
+            <w:tcBorders>
+              <w:top w:val="single" w:color="B0BEC5" w:sz="1"/>
+              <w:left w:val="single" w:color="B0BEC5" w:sz="1"/>
+              <w:bottom w:val="single" w:color="B0BEC5" w:sz="1"/>
+              <w:right w:val="single" w:color="B0BEC5" w:sz="1"/>
+            </w:tcBorders>
+            <w:shd w:fill="F0F4F8" w:val="clear"/>
+            <w:tcMar>
+              <w:top w:type="dxa" w:w="50"/>
+              <w:left w:type="dxa" w:w="100"/>
+              <w:bottom w:type="dxa" w:w="50"/>
+              <w:right w:type="dxa" w:w="100"/>
+            </w:tcMar>
+            <w:vAlign w:val="center"/>
+          </w:tcPr>
+          <w:p>
+            <w:pPr>
+              <w:spacing w:after="0" w:before="0"/>
+              <w:jc w:val="left"/>
+            </w:pPr>
+            <w:r>
+              <w:rPr>
+                <w:rFonts w:ascii="Arial" w:cs="Arial" w:eastAsia="Arial" w:hAnsi="Arial"/>
+                <w:sz w:val="20"/>
+                <w:szCs w:val="20"/>
+              </w:rPr>
+              <w:t xml:space="preserve">descending order</w:t>
+            </w:r>
+          </w:p>
+        </w:tc>
+        <w:tc>
+          <w:tcPr>
+            <w:tcW w:type="dxa" w:w="2200"/>
+            <w:tcBorders>
+              <w:top w:val="single" w:color="B0BEC5" w:sz="1"/>
+              <w:left w:val="single" w:color="B0BEC5" w:sz="1"/>
+              <w:bottom w:val="single" w:color="B0BEC5" w:sz="1"/>
+              <w:right w:val="single" w:color="B0BEC5" w:sz="1"/>
+            </w:tcBorders>
+            <w:shd w:fill="F0F4F8" w:val="clear"/>
+            <w:tcMar>
+              <w:top w:type="dxa" w:w="50"/>
+              <w:left w:type="dxa" w:w="100"/>
+              <w:bottom w:type="dxa" w:w="50"/>
+              <w:right w:type="dxa" w:w="100"/>
+            </w:tcMar>
+            <w:vAlign w:val="center"/>
+          </w:tcPr>
+          <w:p>
+            <w:pPr>
+              <w:spacing w:after="0" w:before="0"/>
+              <w:jc w:val="left"/>
+            </w:pPr>
+            <w:r>
+              <w:rPr>
+                <w:rFonts w:ascii="Arial" w:cs="Arial" w:eastAsia="Arial" w:hAnsi="Arial"/>
+                <w:sz w:val="20"/>
+                <w:szCs w:val="20"/>
+              </w:rPr>
+              <w:t xml:space="preserve">descending order verified</w:t>
+            </w:r>
+          </w:p>
+        </w:tc>
+        <w:tc>
+          <w:tcPr>
+            <w:tcW w:type="dxa" w:w="1000"/>
+            <w:tcBorders>
+              <w:top w:val="single" w:color="B0BEC5" w:sz="1"/>
+              <w:left w:val="single" w:color="B0BEC5" w:sz="1"/>
+              <w:bottom w:val="single" w:color="B0BEC5" w:sz="1"/>
+              <w:right w:val="single" w:color="B0BEC5" w:sz="1"/>
+            </w:tcBorders>
+            <w:tcMar>
+              <w:top w:type="dxa" w:w="50"/>
+              <w:left w:type="dxa" w:w="100"/>
+              <w:bottom w:type="dxa" w:w="50"/>
+              <w:right w:type="dxa" w:w="100"/>
+            </w:tcMar>
+            <w:vAlign w:val="center"/>
+          </w:tcPr>
+          <w:p>
+            <w:pPr>
+              <w:spacing w:after="0" w:before="0"/>
+              <w:jc w:val="center"/>
+            </w:pPr>
+            <w:r>
+              <w:rPr>
+                <w:rFonts w:ascii="Arial" w:cs="Arial" w:eastAsia="Arial" w:hAnsi="Arial"/>
+                <w:b/>
+                <w:bCs/>
+                <w:color w:val="2E7D32"/>
+                <w:sz w:val="20"/>
+                <w:szCs w:val="20"/>
+              </w:rPr>
+              <w:t xml:space="preserve">PASS</w:t>
+            </w:r>
+          </w:p>
+        </w:tc>
+      </w:tr>
+      <w:tr>
+        <w:trPr>
+          <w:cantSplit/>
+        </w:trPr>
+        <w:tc>
+          <w:tcPr>
+            <w:tcW w:type="dxa" w:w="500"/>
+            <w:tcBorders>
+              <w:top w:val="single" w:color="B0BEC5" w:sz="1"/>
+              <w:left w:val="single" w:color="B0BEC5" w:sz="1"/>
+              <w:bottom w:val="single" w:color="B0BEC5" w:sz="1"/>
+              <w:right w:val="single" w:color="B0BEC5" w:sz="1"/>
+            </w:tcBorders>
+            <w:tcMar>
+              <w:top w:type="dxa" w:w="50"/>
+              <w:left w:type="dxa" w:w="100"/>
+              <w:bottom w:type="dxa" w:w="50"/>
+              <w:right w:type="dxa" w:w="100"/>
+            </w:tcMar>
+            <w:vAlign w:val="center"/>
+          </w:tcPr>
+          <w:p>
+            <w:pPr>
+              <w:spacing w:after="0" w:before="0"/>
+              <w:jc w:val="center"/>
+            </w:pPr>
+            <w:r>
+              <w:rPr>
+                <w:rFonts w:ascii="Arial" w:cs="Arial" w:eastAsia="Arial" w:hAnsi="Arial"/>
+                <w:sz w:val="20"/>
+                <w:szCs w:val="20"/>
+              </w:rPr>
+              <w:t xml:space="preserve">4</w:t>
+            </w:r>
+          </w:p>
+        </w:tc>
+        <w:tc>
+          <w:tcPr>
+            <w:tcW w:type="dxa" w:w="2200"/>
+            <w:tcBorders>
+              <w:top w:val="single" w:color="B0BEC5" w:sz="1"/>
+              <w:left w:val="single" w:color="B0BEC5" w:sz="1"/>
+              <w:bottom w:val="single" w:color="B0BEC5" w:sz="1"/>
+              <w:right w:val="single" w:color="B0BEC5" w:sz="1"/>
+            </w:tcBorders>
+            <w:tcMar>
+              <w:top w:type="dxa" w:w="50"/>
+              <w:left w:type="dxa" w:w="100"/>
+              <w:bottom w:type="dxa" w:w="50"/>
+              <w:right w:type="dxa" w:w="100"/>
+            </w:tcMar>
+            <w:vAlign w:val="center"/>
+          </w:tcPr>
+          <w:p>
+            <w:pPr>
+              <w:spacing w:after="0" w:before="0"/>
+              <w:jc w:val="left"/>
+            </w:pPr>
+            <w:r>
+              <w:rPr>
+                <w:rFonts w:ascii="Arial" w:cs="Arial" w:eastAsia="Arial" w:hAnsi="Arial"/>
+                <w:sz w:val="20"/>
+                <w:szCs w:val="20"/>
+              </w:rPr>
+              <w:t xml:space="preserve">rankPlayersByHeroCount</w:t>
+            </w:r>
+          </w:p>
+        </w:tc>
+        <w:tc>
+          <w:tcPr>
+            <w:tcW w:type="dxa" w:w="2200"/>
+            <w:tcBorders>
+              <w:top w:val="single" w:color="B0BEC5" w:sz="1"/>
+              <w:left w:val="single" w:color="B0BEC5" w:sz="1"/>
+              <w:bottom w:val="single" w:color="B0BEC5" w:sz="1"/>
+              <w:right w:val="single" w:color="B0BEC5" w:sz="1"/>
+            </w:tcBorders>
+            <w:tcMar>
+              <w:top w:type="dxa" w:w="50"/>
+              <w:left w:type="dxa" w:w="100"/>
+              <w:bottom w:type="dxa" w:w="50"/>
+              <w:right w:type="dxa" w:w="100"/>
+            </w:tcMar>
+            <w:vAlign w:val="center"/>
+          </w:tcPr>
+          <w:p>
+            <w:pPr>
+              <w:spacing w:after="0" w:before="0"/>
+              <w:jc w:val="left"/>
+            </w:pPr>
+            <w:r>
+              <w:rPr>
+                <w:rFonts w:ascii="Arial" w:cs="Arial" w:eastAsia="Arial" w:hAnsi="Arial"/>
+                <w:sz w:val="20"/>
+                <w:szCs w:val="20"/>
+              </w:rPr>
+              <w:t xml:space="preserve">rs.rankPlayersByHeroCount()</w:t>
+            </w:r>
+          </w:p>
+        </w:tc>
+        <w:tc>
+          <w:tcPr>
+            <w:tcW w:type="dxa" w:w="2200"/>
+            <w:tcBorders>
+              <w:top w:val="single" w:color="B0BEC5" w:sz="1"/>
+              <w:left w:val="single" w:color="B0BEC5" w:sz="1"/>
+              <w:bottom w:val="single" w:color="B0BEC5" w:sz="1"/>
+              <w:right w:val="single" w:color="B0BEC5" w:sz="1"/>
+            </w:tcBorders>
+            <w:tcMar>
+              <w:top w:type="dxa" w:w="50"/>
+              <w:left w:type="dxa" w:w="100"/>
+              <w:bottom w:type="dxa" w:w="50"/>
+              <w:right w:type="dxa" w:w="100"/>
+            </w:tcMar>
+            <w:vAlign w:val="center"/>
+          </w:tcPr>
+          <w:p>
+            <w:pPr>
+              <w:spacing w:after="0" w:before="0"/>
+              <w:jc w:val="left"/>
+            </w:pPr>
+            <w:r>
+              <w:rPr>
+                <w:rFonts w:ascii="Arial" w:cs="Arial" w:eastAsia="Arial" w:hAnsi="Arial"/>
+                <w:sz w:val="20"/>
+                <w:szCs w:val="20"/>
+              </w:rPr>
+              <w:t xml:space="preserve">descending order</w:t>
+            </w:r>
+          </w:p>
+        </w:tc>
+        <w:tc>
+          <w:tcPr>
+            <w:tcW w:type="dxa" w:w="2200"/>
+            <w:tcBorders>
+              <w:top w:val="single" w:color="B0BEC5" w:sz="1"/>
+              <w:left w:val="single" w:color="B0BEC5" w:sz="1"/>
+              <w:bottom w:val="single" w:color="B0BEC5" w:sz="1"/>
+              <w:right w:val="single" w:color="B0BEC5" w:sz="1"/>
+            </w:tcBorders>
+            <w:tcMar>
+              <w:top w:type="dxa" w:w="50"/>
+              <w:left w:type="dxa" w:w="100"/>
+              <w:bottom w:type="dxa" w:w="50"/>
+              <w:right w:type="dxa" w:w="100"/>
+            </w:tcMar>
+            <w:vAlign w:val="center"/>
+          </w:tcPr>
+          <w:p>
+            <w:pPr>
+              <w:spacing w:after="0" w:before="0"/>
+              <w:jc w:val="left"/>
+            </w:pPr>
+            <w:r>
+              <w:rPr>
+                <w:rFonts w:ascii="Arial" w:cs="Arial" w:eastAsia="Arial" w:hAnsi="Arial"/>
+                <w:sz w:val="20"/>
+                <w:szCs w:val="20"/>
+              </w:rPr>
+              <w:t xml:space="preserve">descending order verified</w:t>
+            </w:r>
+          </w:p>
+        </w:tc>
+        <w:tc>
+          <w:tcPr>
+            <w:tcW w:type="dxa" w:w="1000"/>
+            <w:tcBorders>
+              <w:top w:val="single" w:color="B0BEC5" w:sz="1"/>
+              <w:left w:val="single" w:color="B0BEC5" w:sz="1"/>
+              <w:bottom w:val="single" w:color="B0BEC5" w:sz="1"/>
+              <w:right w:val="single" w:color="B0BEC5" w:sz="1"/>
+            </w:tcBorders>
+            <w:tcMar>
+              <w:top w:type="dxa" w:w="50"/>
+              <w:left w:type="dxa" w:w="100"/>
+              <w:bottom w:type="dxa" w:w="50"/>
+              <w:right w:type="dxa" w:w="100"/>
+            </w:tcMar>
+            <w:vAlign w:val="center"/>
+          </w:tcPr>
+          <w:p>
+            <w:pPr>
+              <w:spacing w:after="0" w:before="0"/>
+              <w:jc w:val="center"/>
+            </w:pPr>
+            <w:r>
+              <w:rPr>
+                <w:rFonts w:ascii="Arial" w:cs="Arial" w:eastAsia="Arial" w:hAnsi="Arial"/>
+                <w:b/>
+                <w:bCs/>
+                <w:color w:val="2E7D32"/>
+                <w:sz w:val="20"/>
+                <w:szCs w:val="20"/>
+              </w:rPr>
+              <w:t xml:space="preserve">PASS</w:t>
+            </w:r>
+          </w:p>
+        </w:tc>
+      </w:tr>
+      <w:tr>
+        <w:trPr>
+          <w:cantSplit/>
+        </w:trPr>
+        <w:tc>
+          <w:tcPr>
+            <w:tcW w:type="dxa" w:w="500"/>
+            <w:tcBorders>
+              <w:top w:val="single" w:color="B0BEC5" w:sz="1"/>
+              <w:left w:val="single" w:color="B0BEC5" w:sz="1"/>
+              <w:bottom w:val="single" w:color="B0BEC5" w:sz="1"/>
+              <w:right w:val="single" w:color="B0BEC5" w:sz="1"/>
+            </w:tcBorders>
+            <w:shd w:fill="F0F4F8" w:val="clear"/>
+            <w:tcMar>
+              <w:top w:type="dxa" w:w="50"/>
+              <w:left w:type="dxa" w:w="100"/>
+              <w:bottom w:type="dxa" w:w="50"/>
+              <w:right w:type="dxa" w:w="100"/>
+            </w:tcMar>
+            <w:vAlign w:val="center"/>
+          </w:tcPr>
+          <w:p>
+            <w:pPr>
+              <w:spacing w:after="0" w:before="0"/>
+              <w:jc w:val="center"/>
+            </w:pPr>
+            <w:r>
+              <w:rPr>
+                <w:rFonts w:ascii="Arial" w:cs="Arial" w:eastAsia="Arial" w:hAnsi="Arial"/>
+                <w:sz w:val="20"/>
+                <w:szCs w:val="20"/>
+              </w:rPr>
+              <w:t xml:space="preserve">5</w:t>
+            </w:r>
+          </w:p>
+        </w:tc>
+        <w:tc>
+          <w:tcPr>
+            <w:tcW w:type="dxa" w:w="2200"/>
+            <w:tcBorders>
+              <w:top w:val="single" w:color="B0BEC5" w:sz="1"/>
+              <w:left w:val="single" w:color="B0BEC5" w:sz="1"/>
+              <w:bottom w:val="single" w:color="B0BEC5" w:sz="1"/>
+              <w:right w:val="single" w:color="B0BEC5" w:sz="1"/>
+            </w:tcBorders>
+            <w:shd w:fill="F0F4F8" w:val="clear"/>
+            <w:tcMar>
+              <w:top w:type="dxa" w:w="50"/>
+              <w:left w:type="dxa" w:w="100"/>
+              <w:bottom w:type="dxa" w:w="50"/>
+              <w:right w:type="dxa" w:w="100"/>
+            </w:tcMar>
+            <w:vAlign w:val="center"/>
+          </w:tcPr>
+          <w:p>
+            <w:pPr>
+              <w:spacing w:after="0" w:before="0"/>
+              <w:jc w:val="left"/>
+            </w:pPr>
+            <w:r>
+              <w:rPr>
+                <w:rFonts w:ascii="Arial" w:cs="Arial" w:eastAsia="Arial" w:hAnsi="Arial"/>
+                <w:sz w:val="20"/>
+                <w:szCs w:val="20"/>
+              </w:rPr>
+              <w:t xml:space="preserve">getTopNPlayers winRate</w:t>
+            </w:r>
+          </w:p>
+        </w:tc>
+        <w:tc>
+          <w:tcPr>
+            <w:tcW w:type="dxa" w:w="2200"/>
+            <w:tcBorders>
+              <w:top w:val="single" w:color="B0BEC5" w:sz="1"/>
+              <w:left w:val="single" w:color="B0BEC5" w:sz="1"/>
+              <w:bottom w:val="single" w:color="B0BEC5" w:sz="1"/>
+              <w:right w:val="single" w:color="B0BEC5" w:sz="1"/>
+            </w:tcBorders>
+            <w:shd w:fill="F0F4F8" w:val="clear"/>
+            <w:tcMar>
+              <w:top w:type="dxa" w:w="50"/>
+              <w:left w:type="dxa" w:w="100"/>
+              <w:bottom w:type="dxa" w:w="50"/>
+              <w:right w:type="dxa" w:w="100"/>
+            </w:tcMar>
+            <w:vAlign w:val="center"/>
+          </w:tcPr>
+          <w:p>
+            <w:pPr>
+              <w:spacing w:after="0" w:before="0"/>
+              <w:jc w:val="left"/>
+            </w:pPr>
+            <w:r>
+              <w:rPr>
+                <w:rFonts w:ascii="Arial" w:cs="Arial" w:eastAsia="Arial" w:hAnsi="Arial"/>
+                <w:sz w:val="20"/>
+                <w:szCs w:val="20"/>
+              </w:rPr>
+              <w:t xml:space="preserve">getTopNPlayers(3, "winRate")</w:t>
+            </w:r>
+          </w:p>
+        </w:tc>
+        <w:tc>
+          <w:tcPr>
+            <w:tcW w:type="dxa" w:w="2200"/>
+            <w:tcBorders>
+              <w:top w:val="single" w:color="B0BEC5" w:sz="1"/>
+              <w:left w:val="single" w:color="B0BEC5" w:sz="1"/>
+              <w:bottom w:val="single" w:color="B0BEC5" w:sz="1"/>
+              <w:right w:val="single" w:color="B0BEC5" w:sz="1"/>
+            </w:tcBorders>
+            <w:shd w:fill="F0F4F8" w:val="clear"/>
+            <w:tcMar>
+              <w:top w:type="dxa" w:w="50"/>
+              <w:left w:type="dxa" w:w="100"/>
+              <w:bottom w:type="dxa" w:w="50"/>
+              <w:right w:type="dxa" w:w="100"/>
+            </w:tcMar>
+            <w:vAlign w:val="center"/>
+          </w:tcPr>
+          <w:p>
+            <w:pPr>
+              <w:spacing w:after="0" w:before="0"/>
+              <w:jc w:val="left"/>
+            </w:pPr>
+            <w:r>
+              <w:rPr>
+                <w:rFonts w:ascii="Arial" w:cs="Arial" w:eastAsia="Arial" w:hAnsi="Arial"/>
+                <w:sz w:val="20"/>
+                <w:szCs w:val="20"/>
+              </w:rPr>
+              <w:t xml:space="preserve">3 players, sorted</w:t>
+            </w:r>
+          </w:p>
+        </w:tc>
+        <w:tc>
+          <w:tcPr>
+            <w:tcW w:type="dxa" w:w="2200"/>
+            <w:tcBorders>
+              <w:top w:val="single" w:color="B0BEC5" w:sz="1"/>
+              <w:left w:val="single" w:color="B0BEC5" w:sz="1"/>
+              <w:bottom w:val="single" w:color="B0BEC5" w:sz="1"/>
+              <w:right w:val="single" w:color="B0BEC5" w:sz="1"/>
+            </w:tcBorders>
+            <w:shd w:fill="F0F4F8" w:val="clear"/>
+            <w:tcMar>
+              <w:top w:type="dxa" w:w="50"/>
+              <w:left w:type="dxa" w:w="100"/>
+              <w:bottom w:type="dxa" w:w="50"/>
+              <w:right w:type="dxa" w:w="100"/>
+            </w:tcMar>
+            <w:vAlign w:val="center"/>
+          </w:tcPr>
+          <w:p>
+            <w:pPr>
+              <w:spacing w:after="0" w:before="0"/>
+              <w:jc w:val="left"/>
+            </w:pPr>
+            <w:r>
+              <w:rPr>
+                <w:rFonts w:ascii="Arial" w:cs="Arial" w:eastAsia="Arial" w:hAnsi="Arial"/>
+                <w:sz w:val="20"/>
+                <w:szCs w:val="20"/>
+              </w:rPr>
+              <w:t xml:space="preserve">3 players, sorted</w:t>
+            </w:r>
+          </w:p>
+        </w:tc>
+        <w:tc>
+          <w:tcPr>
+            <w:tcW w:type="dxa" w:w="1000"/>
+            <w:tcBorders>
+              <w:top w:val="single" w:color="B0BEC5" w:sz="1"/>
+              <w:left w:val="single" w:color="B0BEC5" w:sz="1"/>
+              <w:bottom w:val="single" w:color="B0BEC5" w:sz="1"/>
+              <w:right w:val="single" w:color="B0BEC5" w:sz="1"/>
+            </w:tcBorders>
+            <w:tcMar>
+              <w:top w:type="dxa" w:w="50"/>
+              <w:left w:type="dxa" w:w="100"/>
+              <w:bottom w:type="dxa" w:w="50"/>
+              <w:right w:type="dxa" w:w="100"/>
+            </w:tcMar>
+            <w:vAlign w:val="center"/>
+          </w:tcPr>
+          <w:p>
+            <w:pPr>
+              <w:spacing w:after="0" w:before="0"/>
+              <w:jc w:val="center"/>
+            </w:pPr>
+            <w:r>
+              <w:rPr>
+                <w:rFonts w:ascii="Arial" w:cs="Arial" w:eastAsia="Arial" w:hAnsi="Arial"/>
+                <w:b/>
+                <w:bCs/>
+                <w:color w:val="2E7D32"/>
+                <w:sz w:val="20"/>
+                <w:szCs w:val="20"/>
+              </w:rPr>
+              <w:t xml:space="preserve">PASS</w:t>
+            </w:r>
+          </w:p>
+        </w:tc>
+      </w:tr>
+      <w:tr>
+        <w:trPr>
+          <w:cantSplit/>
+        </w:trPr>
+        <w:tc>
+          <w:tcPr>
+            <w:tcW w:type="dxa" w:w="500"/>
+            <w:tcBorders>
+              <w:top w:val="single" w:color="B0BEC5" w:sz="1"/>
+              <w:left w:val="single" w:color="B0BEC5" w:sz="1"/>
+              <w:bottom w:val="single" w:color="B0BEC5" w:sz="1"/>
+              <w:right w:val="single" w:color="B0BEC5" w:sz="1"/>
+            </w:tcBorders>
+            <w:tcMar>
+              <w:top w:type="dxa" w:w="50"/>
+              <w:left w:type="dxa" w:w="100"/>
+              <w:bottom w:type="dxa" w:w="50"/>
+              <w:right w:type="dxa" w:w="100"/>
+            </w:tcMar>
+            <w:vAlign w:val="center"/>
+          </w:tcPr>
+          <w:p>
+            <w:pPr>
+              <w:spacing w:after="0" w:before="0"/>
+              <w:jc w:val="center"/>
+            </w:pPr>
+            <w:r>
+              <w:rPr>
+                <w:rFonts w:ascii="Arial" w:cs="Arial" w:eastAsia="Arial" w:hAnsi="Arial"/>
+                <w:sz w:val="20"/>
+                <w:szCs w:val="20"/>
+              </w:rPr>
+              <w:t xml:space="preserve">6</w:t>
+            </w:r>
+          </w:p>
+        </w:tc>
+        <w:tc>
+          <w:tcPr>
+            <w:tcW w:type="dxa" w:w="2200"/>
+            <w:tcBorders>
+              <w:top w:val="single" w:color="B0BEC5" w:sz="1"/>
+              <w:left w:val="single" w:color="B0BEC5" w:sz="1"/>
+              <w:bottom w:val="single" w:color="B0BEC5" w:sz="1"/>
+              <w:right w:val="single" w:color="B0BEC5" w:sz="1"/>
+            </w:tcBorders>
+            <w:tcMar>
+              <w:top w:type="dxa" w:w="50"/>
+              <w:left w:type="dxa" w:w="100"/>
+              <w:bottom w:type="dxa" w:w="50"/>
+              <w:right w:type="dxa" w:w="100"/>
+            </w:tcMar>
+            <w:vAlign w:val="center"/>
+          </w:tcPr>
+          <w:p>
+            <w:pPr>
+              <w:spacing w:after="0" w:before="0"/>
+              <w:jc w:val="left"/>
+            </w:pPr>
+            <w:r>
+              <w:rPr>
+                <w:rFonts w:ascii="Arial" w:cs="Arial" w:eastAsia="Arial" w:hAnsi="Arial"/>
+                <w:sz w:val="20"/>
+                <w:szCs w:val="20"/>
+              </w:rPr>
+              <w:t xml:space="preserve">getTopNPlayers invalid criteria</w:t>
+            </w:r>
+          </w:p>
+        </w:tc>
+        <w:tc>
+          <w:tcPr>
+            <w:tcW w:type="dxa" w:w="2200"/>
+            <w:tcBorders>
+              <w:top w:val="single" w:color="B0BEC5" w:sz="1"/>
+              <w:left w:val="single" w:color="B0BEC5" w:sz="1"/>
+              <w:bottom w:val="single" w:color="B0BEC5" w:sz="1"/>
+              <w:right w:val="single" w:color="B0BEC5" w:sz="1"/>
+            </w:tcBorders>
+            <w:tcMar>
+              <w:top w:type="dxa" w:w="50"/>
+              <w:left w:type="dxa" w:w="100"/>
+              <w:bottom w:type="dxa" w:w="50"/>
+              <w:right w:type="dxa" w:w="100"/>
+            </w:tcMar>
+            <w:vAlign w:val="center"/>
+          </w:tcPr>
+          <w:p>
+            <w:pPr>
+              <w:spacing w:after="0" w:before="0"/>
+              <w:jc w:val="left"/>
+            </w:pPr>
+            <w:r>
+              <w:rPr>
+                <w:rFonts w:ascii="Arial" w:cs="Arial" w:eastAsia="Arial" w:hAnsi="Arial"/>
+                <w:sz w:val="20"/>
+                <w:szCs w:val="20"/>
+              </w:rPr>
+              <w:t xml:space="preserve">getTopNPlayers(5, "invalid")</w:t>
+            </w:r>
+          </w:p>
+        </w:tc>
+        <w:tc>
+          <w:tcPr>
+            <w:tcW w:type="dxa" w:w="2200"/>
+            <w:tcBorders>
+              <w:top w:val="single" w:color="B0BEC5" w:sz="1"/>
+              <w:left w:val="single" w:color="B0BEC5" w:sz="1"/>
+              <w:bottom w:val="single" w:color="B0BEC5" w:sz="1"/>
+              <w:right w:val="single" w:color="B0BEC5" w:sz="1"/>
+            </w:tcBorders>
+            <w:tcMar>
+              <w:top w:type="dxa" w:w="50"/>
+              <w:left w:type="dxa" w:w="100"/>
+              <w:bottom w:type="dxa" w:w="50"/>
+              <w:right w:type="dxa" w:w="100"/>
+            </w:tcMar>
+            <w:vAlign w:val="center"/>
+          </w:tcPr>
+          <w:p>
+            <w:pPr>
+              <w:spacing w:after="0" w:before="0"/>
+              <w:jc w:val="left"/>
+            </w:pPr>
+            <w:r>
+              <w:rPr>
+                <w:rFonts w:ascii="Arial" w:cs="Arial" w:eastAsia="Arial" w:hAnsi="Arial"/>
+                <w:sz w:val="20"/>
+                <w:szCs w:val="20"/>
+              </w:rPr>
+              <w:t xml:space="preserve">empty list</w:t>
+            </w:r>
+          </w:p>
+        </w:tc>
+        <w:tc>
+          <w:tcPr>
+            <w:tcW w:type="dxa" w:w="2200"/>
+            <w:tcBorders>
+              <w:top w:val="single" w:color="B0BEC5" w:sz="1"/>
+              <w:left w:val="single" w:color="B0BEC5" w:sz="1"/>
+              <w:bottom w:val="single" w:color="B0BEC5" w:sz="1"/>
+              <w:right w:val="single" w:color="B0BEC5" w:sz="1"/>
+            </w:tcBorders>
+            <w:tcMar>
+              <w:top w:type="dxa" w:w="50"/>
+              <w:left w:type="dxa" w:w="100"/>
+              <w:bottom w:type="dxa" w:w="50"/>
+              <w:right w:type="dxa" w:w="100"/>
+            </w:tcMar>
+            <w:vAlign w:val="center"/>
+          </w:tcPr>
+          <w:p>
+            <w:pPr>
+              <w:spacing w:after="0" w:before="0"/>
+              <w:jc w:val="left"/>
+            </w:pPr>
+            <w:r>
+              <w:rPr>
+                <w:rFonts w:ascii="Arial" w:cs="Arial" w:eastAsia="Arial" w:hAnsi="Arial"/>
+                <w:sz w:val="20"/>
+                <w:szCs w:val="20"/>
+              </w:rPr>
+              <w:t xml:space="preserve">empty list</w:t>
+            </w:r>
+          </w:p>
+        </w:tc>
+        <w:tc>
+          <w:tcPr>
+            <w:tcW w:type="dxa" w:w="1000"/>
+            <w:tcBorders>
+              <w:top w:val="single" w:color="B0BEC5" w:sz="1"/>
+              <w:left w:val="single" w:color="B0BEC5" w:sz="1"/>
+              <w:bottom w:val="single" w:color="B0BEC5" w:sz="1"/>
+              <w:right w:val="single" w:color="B0BEC5" w:sz="1"/>
+            </w:tcBorders>
+            <w:tcMar>
+              <w:top w:type="dxa" w:w="50"/>
+              <w:left w:type="dxa" w:w="100"/>
+              <w:bottom w:type="dxa" w:w="50"/>
+              <w:right w:type="dxa" w:w="100"/>
+            </w:tcMar>
+            <w:vAlign w:val="center"/>
+          </w:tcPr>
+          <w:p>
+            <w:pPr>
+              <w:spacing w:after="0" w:before="0"/>
+              <w:jc w:val="center"/>
+            </w:pPr>
+            <w:r>
+              <w:rPr>
+                <w:rFonts w:ascii="Arial" w:cs="Arial" w:eastAsia="Arial" w:hAnsi="Arial"/>
+                <w:b/>
+                <w:bCs/>
+                <w:color w:val="2E7D32"/>
+                <w:sz w:val="20"/>
+                <w:szCs w:val="20"/>
+              </w:rPr>
+              <w:t xml:space="preserve">PASS</w:t>
+            </w:r>
+          </w:p>
+        </w:tc>
+      </w:tr>
+      <w:tr>
+        <w:trPr>
+          <w:cantSplit/>
+        </w:trPr>
+        <w:tc>
+          <w:tcPr>
+            <w:tcW w:type="dxa" w:w="500"/>
+            <w:tcBorders>
+              <w:top w:val="single" w:color="B0BEC5" w:sz="1"/>
+              <w:left w:val="single" w:color="B0BEC5" w:sz="1"/>
+              <w:bottom w:val="single" w:color="B0BEC5" w:sz="1"/>
+              <w:right w:val="single" w:color="B0BEC5" w:sz="1"/>
+            </w:tcBorders>
+            <w:shd w:fill="F0F4F8" w:val="clear"/>
+            <w:tcMar>
+              <w:top w:type="dxa" w:w="50"/>
+              <w:left w:type="dxa" w:w="100"/>
+              <w:bottom w:type="dxa" w:w="50"/>
+              <w:right w:type="dxa" w:w="100"/>
+            </w:tcMar>
+            <w:vAlign w:val="center"/>
+          </w:tcPr>
+          <w:p>
+            <w:pPr>
+              <w:spacing w:after="0" w:before="0"/>
+              <w:jc w:val="center"/>
+            </w:pPr>
+            <w:r>
+              <w:rPr>
+                <w:rFonts w:ascii="Arial" w:cs="Arial" w:eastAsia="Arial" w:hAnsi="Arial"/>
+                <w:sz w:val="20"/>
+                <w:szCs w:val="20"/>
+              </w:rPr>
+              <w:t xml:space="preserve">7</w:t>
+            </w:r>
+          </w:p>
+        </w:tc>
+        <w:tc>
+          <w:tcPr>
+            <w:tcW w:type="dxa" w:w="2200"/>
+            <w:tcBorders>
+              <w:top w:val="single" w:color="B0BEC5" w:sz="1"/>
+              <w:left w:val="single" w:color="B0BEC5" w:sz="1"/>
+              <w:bottom w:val="single" w:color="B0BEC5" w:sz="1"/>
+              <w:right w:val="single" w:color="B0BEC5" w:sz="1"/>
+            </w:tcBorders>
+            <w:shd w:fill="F0F4F8" w:val="clear"/>
+            <w:tcMar>
+              <w:top w:type="dxa" w:w="50"/>
+              <w:left w:type="dxa" w:w="100"/>
+              <w:bottom w:type="dxa" w:w="50"/>
+              <w:right w:type="dxa" w:w="100"/>
+            </w:tcMar>
+            <w:vAlign w:val="center"/>
+          </w:tcPr>
+          <w:p>
+            <w:pPr>
+              <w:spacing w:after="0" w:before="0"/>
+              <w:jc w:val="left"/>
+            </w:pPr>
+            <w:r>
+              <w:rPr>
+                <w:rFonts w:ascii="Arial" w:cs="Arial" w:eastAsia="Arial" w:hAnsi="Arial"/>
+                <w:sz w:val="20"/>
+                <w:szCs w:val="20"/>
+              </w:rPr>
+              <w:t xml:space="preserve">rankTeamsByWinRate</w:t>
+            </w:r>
+          </w:p>
+        </w:tc>
+        <w:tc>
+          <w:tcPr>
+            <w:tcW w:type="dxa" w:w="2200"/>
+            <w:tcBorders>
+              <w:top w:val="single" w:color="B0BEC5" w:sz="1"/>
+              <w:left w:val="single" w:color="B0BEC5" w:sz="1"/>
+              <w:bottom w:val="single" w:color="B0BEC5" w:sz="1"/>
+              <w:right w:val="single" w:color="B0BEC5" w:sz="1"/>
+            </w:tcBorders>
+            <w:shd w:fill="F0F4F8" w:val="clear"/>
+            <w:tcMar>
+              <w:top w:type="dxa" w:w="50"/>
+              <w:left w:type="dxa" w:w="100"/>
+              <w:bottom w:type="dxa" w:w="50"/>
+              <w:right w:type="dxa" w:w="100"/>
+            </w:tcMar>
+            <w:vAlign w:val="center"/>
+          </w:tcPr>
+          <w:p>
+            <w:pPr>
+              <w:spacing w:after="0" w:before="0"/>
+              <w:jc w:val="left"/>
+            </w:pPr>
+            <w:r>
+              <w:rPr>
+                <w:rFonts w:ascii="Arial" w:cs="Arial" w:eastAsia="Arial" w:hAnsi="Arial"/>
+                <w:sz w:val="20"/>
+                <w:szCs w:val="20"/>
+              </w:rPr>
+              <w:t xml:space="preserve">rs.rankTeamsByWinRate()</w:t>
+            </w:r>
+          </w:p>
+        </w:tc>
+        <w:tc>
+          <w:tcPr>
+            <w:tcW w:type="dxa" w:w="2200"/>
+            <w:tcBorders>
+              <w:top w:val="single" w:color="B0BEC5" w:sz="1"/>
+              <w:left w:val="single" w:color="B0BEC5" w:sz="1"/>
+              <w:bottom w:val="single" w:color="B0BEC5" w:sz="1"/>
+              <w:right w:val="single" w:color="B0BEC5" w:sz="1"/>
+            </w:tcBorders>
+            <w:shd w:fill="F0F4F8" w:val="clear"/>
+            <w:tcMar>
+              <w:top w:type="dxa" w:w="50"/>
+              <w:left w:type="dxa" w:w="100"/>
+              <w:bottom w:type="dxa" w:w="50"/>
+              <w:right w:type="dxa" w:w="100"/>
+            </w:tcMar>
+            <w:vAlign w:val="center"/>
+          </w:tcPr>
+          <w:p>
+            <w:pPr>
+              <w:spacing w:after="0" w:before="0"/>
+              <w:jc w:val="left"/>
+            </w:pPr>
+            <w:r>
+              <w:rPr>
+                <w:rFonts w:ascii="Arial" w:cs="Arial" w:eastAsia="Arial" w:hAnsi="Arial"/>
+                <w:sz w:val="20"/>
+                <w:szCs w:val="20"/>
+              </w:rPr>
+              <w:t xml:space="preserve">descending order</w:t>
+            </w:r>
+          </w:p>
+        </w:tc>
+        <w:tc>
+          <w:tcPr>
+            <w:tcW w:type="dxa" w:w="2200"/>
+            <w:tcBorders>
+              <w:top w:val="single" w:color="B0BEC5" w:sz="1"/>
+              <w:left w:val="single" w:color="B0BEC5" w:sz="1"/>
+              <w:bottom w:val="single" w:color="B0BEC5" w:sz="1"/>
+              <w:right w:val="single" w:color="B0BEC5" w:sz="1"/>
+            </w:tcBorders>
+            <w:shd w:fill="F0F4F8" w:val="clear"/>
+            <w:tcMar>
+              <w:top w:type="dxa" w:w="50"/>
+              <w:left w:type="dxa" w:w="100"/>
+              <w:bottom w:type="dxa" w:w="50"/>
+              <w:right w:type="dxa" w:w="100"/>
+            </w:tcMar>
+            <w:vAlign w:val="center"/>
+          </w:tcPr>
+          <w:p>
+            <w:pPr>
+              <w:spacing w:after="0" w:before="0"/>
+              <w:jc w:val="left"/>
+            </w:pPr>
+            <w:r>
+              <w:rPr>
+                <w:rFonts w:ascii="Arial" w:cs="Arial" w:eastAsia="Arial" w:hAnsi="Arial"/>
+                <w:sz w:val="20"/>
+                <w:szCs w:val="20"/>
+              </w:rPr>
+              <w:t xml:space="preserve">descending order verified</w:t>
+            </w:r>
+          </w:p>
+        </w:tc>
+        <w:tc>
+          <w:tcPr>
+            <w:tcW w:type="dxa" w:w="1000"/>
+            <w:tcBorders>
+              <w:top w:val="single" w:color="B0BEC5" w:sz="1"/>
+              <w:left w:val="single" w:color="B0BEC5" w:sz="1"/>
+              <w:bottom w:val="single" w:color="B0BEC5" w:sz="1"/>
+              <w:right w:val="single" w:color="B0BEC5" w:sz="1"/>
+            </w:tcBorders>
+            <w:tcMar>
+              <w:top w:type="dxa" w:w="50"/>
+              <w:left w:type="dxa" w:w="100"/>
+              <w:bottom w:type="dxa" w:w="50"/>
+              <w:right w:type="dxa" w:w="100"/>
+            </w:tcMar>
+            <w:vAlign w:val="center"/>
+          </w:tcPr>
+          <w:p>
+            <w:pPr>
+              <w:spacing w:after="0" w:before="0"/>
+              <w:jc w:val="center"/>
+            </w:pPr>
+            <w:r>
+              <w:rPr>
+                <w:rFonts w:ascii="Arial" w:cs="Arial" w:eastAsia="Arial" w:hAnsi="Arial"/>
+                <w:b/>
+                <w:bCs/>
+                <w:color w:val="2E7D32"/>
+                <w:sz w:val="20"/>
+                <w:szCs w:val="20"/>
+              </w:rPr>
+              <w:t xml:space="preserve">PASS</w:t>
+            </w:r>
+          </w:p>
+        </w:tc>
+      </w:tr>
+      <w:tr>
+        <w:trPr>
+          <w:cantSplit/>
+        </w:trPr>
+        <w:tc>
+          <w:tcPr>
+            <w:tcW w:type="dxa" w:w="500"/>
+            <w:tcBorders>
+              <w:top w:val="single" w:color="B0BEC5" w:sz="1"/>
+              <w:left w:val="single" w:color="B0BEC5" w:sz="1"/>
+              <w:bottom w:val="single" w:color="B0BEC5" w:sz="1"/>
+              <w:right w:val="single" w:color="B0BEC5" w:sz="1"/>
+            </w:tcBorders>
+            <w:tcMar>
+              <w:top w:type="dxa" w:w="50"/>
+              <w:left w:type="dxa" w:w="100"/>
+              <w:bottom w:type="dxa" w:w="50"/>
+              <w:right w:type="dxa" w:w="100"/>
+            </w:tcMar>
+            <w:vAlign w:val="center"/>
+          </w:tcPr>
+          <w:p>
+            <w:pPr>
+              <w:spacing w:after="0" w:before="0"/>
+              <w:jc w:val="center"/>
+            </w:pPr>
+            <w:r>
+              <w:rPr>
+                <w:rFonts w:ascii="Arial" w:cs="Arial" w:eastAsia="Arial" w:hAnsi="Arial"/>
+                <w:sz w:val="20"/>
+                <w:szCs w:val="20"/>
+              </w:rPr>
+              <w:t xml:space="preserve">8</w:t>
+            </w:r>
+          </w:p>
+        </w:tc>
+        <w:tc>
+          <w:tcPr>
+            <w:tcW w:type="dxa" w:w="2200"/>
+            <w:tcBorders>
+              <w:top w:val="single" w:color="B0BEC5" w:sz="1"/>
+              <w:left w:val="single" w:color="B0BEC5" w:sz="1"/>
+              <w:bottom w:val="single" w:color="B0BEC5" w:sz="1"/>
+              <w:right w:val="single" w:color="B0BEC5" w:sz="1"/>
+            </w:tcBorders>
+            <w:tcMar>
+              <w:top w:type="dxa" w:w="50"/>
+              <w:left w:type="dxa" w:w="100"/>
+              <w:bottom w:type="dxa" w:w="50"/>
+              <w:right w:type="dxa" w:w="100"/>
+            </w:tcMar>
+            <w:vAlign w:val="center"/>
+          </w:tcPr>
+          <w:p>
+            <w:pPr>
+              <w:spacing w:after="0" w:before="0"/>
+              <w:jc w:val="left"/>
+            </w:pPr>
+            <w:r>
+              <w:rPr>
+                <w:rFonts w:ascii="Arial" w:cs="Arial" w:eastAsia="Arial" w:hAnsi="Arial"/>
+                <w:sz w:val="20"/>
+                <w:szCs w:val="20"/>
+              </w:rPr>
+              <w:t xml:space="preserve">rankTeamsByAverageLevel</w:t>
+            </w:r>
+          </w:p>
+        </w:tc>
+        <w:tc>
+          <w:tcPr>
+            <w:tcW w:type="dxa" w:w="2200"/>
+            <w:tcBorders>
+              <w:top w:val="single" w:color="B0BEC5" w:sz="1"/>
+              <w:left w:val="single" w:color="B0BEC5" w:sz="1"/>
+              <w:bottom w:val="single" w:color="B0BEC5" w:sz="1"/>
+              <w:right w:val="single" w:color="B0BEC5" w:sz="1"/>
+            </w:tcBorders>
+            <w:tcMar>
+              <w:top w:type="dxa" w:w="50"/>
+              <w:left w:type="dxa" w:w="100"/>
+              <w:bottom w:type="dxa" w:w="50"/>
+              <w:right w:type="dxa" w:w="100"/>
+            </w:tcMar>
+            <w:vAlign w:val="center"/>
+          </w:tcPr>
+          <w:p>
+            <w:pPr>
+              <w:spacing w:after="0" w:before="0"/>
+              <w:jc w:val="left"/>
+            </w:pPr>
+            <w:r>
+              <w:rPr>
+                <w:rFonts w:ascii="Arial" w:cs="Arial" w:eastAsia="Arial" w:hAnsi="Arial"/>
+                <w:sz w:val="20"/>
+                <w:szCs w:val="20"/>
+              </w:rPr>
+              <w:t xml:space="preserve">rs.rankTeamsByAverageLevel()</w:t>
+            </w:r>
+          </w:p>
+        </w:tc>
+        <w:tc>
+          <w:tcPr>
+            <w:tcW w:type="dxa" w:w="2200"/>
+            <w:tcBorders>
+              <w:top w:val="single" w:color="B0BEC5" w:sz="1"/>
+              <w:left w:val="single" w:color="B0BEC5" w:sz="1"/>
+              <w:bottom w:val="single" w:color="B0BEC5" w:sz="1"/>
+              <w:right w:val="single" w:color="B0BEC5" w:sz="1"/>
+            </w:tcBorders>
+            <w:tcMar>
+              <w:top w:type="dxa" w:w="50"/>
+              <w:left w:type="dxa" w:w="100"/>
+              <w:bottom w:type="dxa" w:w="50"/>
+              <w:right w:type="dxa" w:w="100"/>
+            </w:tcMar>
+            <w:vAlign w:val="center"/>
+          </w:tcPr>
+          <w:p>
+            <w:pPr>
+              <w:spacing w:after="0" w:before="0"/>
+              <w:jc w:val="left"/>
+            </w:pPr>
+            <w:r>
+              <w:rPr>
+                <w:rFonts w:ascii="Arial" w:cs="Arial" w:eastAsia="Arial" w:hAnsi="Arial"/>
+                <w:sz w:val="20"/>
+                <w:szCs w:val="20"/>
+              </w:rPr>
+              <w:t xml:space="preserve">descending order</w:t>
+            </w:r>
+          </w:p>
+        </w:tc>
+        <w:tc>
+          <w:tcPr>
+            <w:tcW w:type="dxa" w:w="2200"/>
+            <w:tcBorders>
+              <w:top w:val="single" w:color="B0BEC5" w:sz="1"/>
+              <w:left w:val="single" w:color="B0BEC5" w:sz="1"/>
+              <w:bottom w:val="single" w:color="B0BEC5" w:sz="1"/>
+              <w:right w:val="single" w:color="B0BEC5" w:sz="1"/>
+            </w:tcBorders>
+            <w:tcMar>
+              <w:top w:type="dxa" w:w="50"/>
+              <w:left w:type="dxa" w:w="100"/>
+              <w:bottom w:type="dxa" w:w="50"/>
+              <w:right w:type="dxa" w:w="100"/>
+            </w:tcMar>
+            <w:vAlign w:val="center"/>
+          </w:tcPr>
+          <w:p>
+            <w:pPr>
+              <w:spacing w:after="0" w:before="0"/>
+              <w:jc w:val="left"/>
+            </w:pPr>
+            <w:r>
+              <w:rPr>
+                <w:rFonts w:ascii="Arial" w:cs="Arial" w:eastAsia="Arial" w:hAnsi="Arial"/>
+                <w:sz w:val="20"/>
+                <w:szCs w:val="20"/>
+              </w:rPr>
+              <w:t xml:space="preserve">descending order verified</w:t>
+            </w:r>
+          </w:p>
+        </w:tc>
+        <w:tc>
+          <w:tcPr>
+            <w:tcW w:type="dxa" w:w="1000"/>
+            <w:tcBorders>
+              <w:top w:val="single" w:color="B0BEC5" w:sz="1"/>
+              <w:left w:val="single" w:color="B0BEC5" w:sz="1"/>
+              <w:bottom w:val="single" w:color="B0BEC5" w:sz="1"/>
+              <w:right w:val="single" w:color="B0BEC5" w:sz="1"/>
+            </w:tcBorders>
+            <w:tcMar>
+              <w:top w:type="dxa" w:w="50"/>
+              <w:left w:type="dxa" w:w="100"/>
+              <w:bottom w:type="dxa" w:w="50"/>
+              <w:right w:type="dxa" w:w="100"/>
+            </w:tcMar>
+            <w:vAlign w:val="center"/>
+          </w:tcPr>
+          <w:p>
+            <w:pPr>
+              <w:spacing w:after="0" w:before="0"/>
+              <w:jc w:val="center"/>
+            </w:pPr>
+            <w:r>
+              <w:rPr>
+                <w:rFonts w:ascii="Arial" w:cs="Arial" w:eastAsia="Arial" w:hAnsi="Arial"/>
+                <w:b/>
+                <w:bCs/>
+                <w:color w:val="2E7D32"/>
+                <w:sz w:val="20"/>
+                <w:szCs w:val="20"/>
+              </w:rPr>
+              <w:t xml:space="preserve">PASS</w:t>
+            </w:r>
+          </w:p>
+        </w:tc>
+      </w:tr>
+      <w:tr>
+        <w:trPr>
+          <w:cantSplit/>
+        </w:trPr>
+        <w:tc>
+          <w:tcPr>
+            <w:tcW w:type="dxa" w:w="500"/>
+            <w:tcBorders>
+              <w:top w:val="single" w:color="B0BEC5" w:sz="1"/>
+              <w:left w:val="single" w:color="B0BEC5" w:sz="1"/>
+              <w:bottom w:val="single" w:color="B0BEC5" w:sz="1"/>
+              <w:right w:val="single" w:color="B0BEC5" w:sz="1"/>
+            </w:tcBorders>
+            <w:shd w:fill="F0F4F8" w:val="clear"/>
+            <w:tcMar>
+              <w:top w:type="dxa" w:w="50"/>
+              <w:left w:type="dxa" w:w="100"/>
+              <w:bottom w:type="dxa" w:w="50"/>
+              <w:right w:type="dxa" w:w="100"/>
+            </w:tcMar>
+            <w:vAlign w:val="center"/>
+          </w:tcPr>
+          <w:p>
+            <w:pPr>
+              <w:spacing w:after="0" w:before="0"/>
+              <w:jc w:val="center"/>
+            </w:pPr>
+            <w:r>
+              <w:rPr>
+                <w:rFonts w:ascii="Arial" w:cs="Arial" w:eastAsia="Arial" w:hAnsi="Arial"/>
+                <w:sz w:val="20"/>
+                <w:szCs w:val="20"/>
+              </w:rPr>
+              <w:t xml:space="preserve">9</w:t>
+            </w:r>
+          </w:p>
+        </w:tc>
+        <w:tc>
+          <w:tcPr>
+            <w:tcW w:type="dxa" w:w="2200"/>
+            <w:tcBorders>
+              <w:top w:val="single" w:color="B0BEC5" w:sz="1"/>
+              <w:left w:val="single" w:color="B0BEC5" w:sz="1"/>
+              <w:bottom w:val="single" w:color="B0BEC5" w:sz="1"/>
+              <w:right w:val="single" w:color="B0BEC5" w:sz="1"/>
+            </w:tcBorders>
+            <w:shd w:fill="F0F4F8" w:val="clear"/>
+            <w:tcMar>
+              <w:top w:type="dxa" w:w="50"/>
+              <w:left w:type="dxa" w:w="100"/>
+              <w:bottom w:type="dxa" w:w="50"/>
+              <w:right w:type="dxa" w:w="100"/>
+            </w:tcMar>
+            <w:vAlign w:val="center"/>
+          </w:tcPr>
+          <w:p>
+            <w:pPr>
+              <w:spacing w:after="0" w:before="0"/>
+              <w:jc w:val="left"/>
+            </w:pPr>
+            <w:r>
+              <w:rPr>
+                <w:rFonts w:ascii="Arial" w:cs="Arial" w:eastAsia="Arial" w:hAnsi="Arial"/>
+                <w:sz w:val="20"/>
+                <w:szCs w:val="20"/>
+              </w:rPr>
+              <w:t xml:space="preserve">rankTeamsByTotalMatches</w:t>
+            </w:r>
+          </w:p>
+        </w:tc>
+        <w:tc>
+          <w:tcPr>
+            <w:tcW w:type="dxa" w:w="2200"/>
+            <w:tcBorders>
+              <w:top w:val="single" w:color="B0BEC5" w:sz="1"/>
+              <w:left w:val="single" w:color="B0BEC5" w:sz="1"/>
+              <w:bottom w:val="single" w:color="B0BEC5" w:sz="1"/>
+              <w:right w:val="single" w:color="B0BEC5" w:sz="1"/>
+            </w:tcBorders>
+            <w:shd w:fill="F0F4F8" w:val="clear"/>
+            <w:tcMar>
+              <w:top w:type="dxa" w:w="50"/>
+              <w:left w:type="dxa" w:w="100"/>
+              <w:bottom w:type="dxa" w:w="50"/>
+              <w:right w:type="dxa" w:w="100"/>
+            </w:tcMar>
+            <w:vAlign w:val="center"/>
+          </w:tcPr>
+          <w:p>
+            <w:pPr>
+              <w:spacing w:after="0" w:before="0"/>
+              <w:jc w:val="left"/>
+            </w:pPr>
+            <w:r>
+              <w:rPr>
+                <w:rFonts w:ascii="Arial" w:cs="Arial" w:eastAsia="Arial" w:hAnsi="Arial"/>
+                <w:sz w:val="20"/>
+                <w:szCs w:val="20"/>
+              </w:rPr>
+              <w:t xml:space="preserve">rs.rankTeamsByTotalMatches()</w:t>
+            </w:r>
+          </w:p>
+        </w:tc>
+        <w:tc>
+          <w:tcPr>
+            <w:tcW w:type="dxa" w:w="2200"/>
+            <w:tcBorders>
+              <w:top w:val="single" w:color="B0BEC5" w:sz="1"/>
+              <w:left w:val="single" w:color="B0BEC5" w:sz="1"/>
+              <w:bottom w:val="single" w:color="B0BEC5" w:sz="1"/>
+              <w:right w:val="single" w:color="B0BEC5" w:sz="1"/>
+            </w:tcBorders>
+            <w:shd w:fill="F0F4F8" w:val="clear"/>
+            <w:tcMar>
+              <w:top w:type="dxa" w:w="50"/>
+              <w:left w:type="dxa" w:w="100"/>
+              <w:bottom w:type="dxa" w:w="50"/>
+              <w:right w:type="dxa" w:w="100"/>
+            </w:tcMar>
+            <w:vAlign w:val="center"/>
+          </w:tcPr>
+          <w:p>
+            <w:pPr>
+              <w:spacing w:after="0" w:before="0"/>
+              <w:jc w:val="left"/>
+            </w:pPr>
+            <w:r>
+              <w:rPr>
+                <w:rFonts w:ascii="Arial" w:cs="Arial" w:eastAsia="Arial" w:hAnsi="Arial"/>
+                <w:sz w:val="20"/>
+                <w:szCs w:val="20"/>
+              </w:rPr>
+              <w:t xml:space="preserve">descending order</w:t>
+            </w:r>
+          </w:p>
+        </w:tc>
+        <w:tc>
+          <w:tcPr>
+            <w:tcW w:type="dxa" w:w="2200"/>
+            <w:tcBorders>
+              <w:top w:val="single" w:color="B0BEC5" w:sz="1"/>
+              <w:left w:val="single" w:color="B0BEC5" w:sz="1"/>
+              <w:bottom w:val="single" w:color="B0BEC5" w:sz="1"/>
+              <w:right w:val="single" w:color="B0BEC5" w:sz="1"/>
+            </w:tcBorders>
+            <w:shd w:fill="F0F4F8" w:val="clear"/>
+            <w:tcMar>
+              <w:top w:type="dxa" w:w="50"/>
+              <w:left w:type="dxa" w:w="100"/>
+              <w:bottom w:type="dxa" w:w="50"/>
+              <w:right w:type="dxa" w:w="100"/>
+            </w:tcMar>
+            <w:vAlign w:val="center"/>
+          </w:tcPr>
+          <w:p>
+            <w:pPr>
+              <w:spacing w:after="0" w:before="0"/>
+              <w:jc w:val="left"/>
+            </w:pPr>
+            <w:r>
+              <w:rPr>
+                <w:rFonts w:ascii="Arial" w:cs="Arial" w:eastAsia="Arial" w:hAnsi="Arial"/>
+                <w:sz w:val="20"/>
+                <w:szCs w:val="20"/>
+              </w:rPr>
+              <w:t xml:space="preserve">descending order verified</w:t>
+            </w:r>
+          </w:p>
+        </w:tc>
+        <w:tc>
+          <w:tcPr>
+            <w:tcW w:type="dxa" w:w="1000"/>
+            <w:tcBorders>
+              <w:top w:val="single" w:color="B0BEC5" w:sz="1"/>
+              <w:left w:val="single" w:color="B0BEC5" w:sz="1"/>
+              <w:bottom w:val="single" w:color="B0BEC5" w:sz="1"/>
+              <w:right w:val="single" w:color="B0BEC5" w:sz="1"/>
+            </w:tcBorders>
+            <w:tcMar>
+              <w:top w:type="dxa" w:w="50"/>
+              <w:left w:type="dxa" w:w="100"/>
+              <w:bottom w:type="dxa" w:w="50"/>
+              <w:right w:type="dxa" w:w="100"/>
+            </w:tcMar>
+            <w:vAlign w:val="center"/>
+          </w:tcPr>
+          <w:p>
+            <w:pPr>
+              <w:spacing w:after="0" w:before="0"/>
+              <w:jc w:val="center"/>
+            </w:pPr>
+            <w:r>
+              <w:rPr>
+                <w:rFonts w:ascii="Arial" w:cs="Arial" w:eastAsia="Arial" w:hAnsi="Arial"/>
+                <w:b/>
+                <w:bCs/>
+                <w:color w:val="2E7D32"/>
+                <w:sz w:val="20"/>
+                <w:szCs w:val="20"/>
+              </w:rPr>
+              <w:t xml:space="preserve">PASS</w:t>
+            </w:r>
+          </w:p>
+        </w:tc>
+      </w:tr>
+      <w:tr>
+        <w:trPr>
+          <w:cantSplit/>
+        </w:trPr>
+        <w:tc>
+          <w:tcPr>
+            <w:tcW w:type="dxa" w:w="500"/>
+            <w:tcBorders>
+              <w:top w:val="single" w:color="B0BEC5" w:sz="1"/>
+              <w:left w:val="single" w:color="B0BEC5" w:sz="1"/>
+              <w:bottom w:val="single" w:color="B0BEC5" w:sz="1"/>
+              <w:right w:val="single" w:color="B0BEC5" w:sz="1"/>
+            </w:tcBorders>
+            <w:tcMar>
+              <w:top w:type="dxa" w:w="50"/>
+              <w:left w:type="dxa" w:w="100"/>
+              <w:bottom w:type="dxa" w:w="50"/>
+              <w:right w:type="dxa" w:w="100"/>
+            </w:tcMar>
+            <w:vAlign w:val="center"/>
+          </w:tcPr>
+          <w:p>
+            <w:pPr>
+              <w:spacing w:after="0" w:before="0"/>
+              <w:jc w:val="center"/>
+            </w:pPr>
+            <w:r>
+              <w:rPr>
+                <w:rFonts w:ascii="Arial" w:cs="Arial" w:eastAsia="Arial" w:hAnsi="Arial"/>
+                <w:sz w:val="20"/>
+                <w:szCs w:val="20"/>
+              </w:rPr>
+              <w:t xml:space="preserve">10</w:t>
+            </w:r>
+          </w:p>
+        </w:tc>
+        <w:tc>
+          <w:tcPr>
+            <w:tcW w:type="dxa" w:w="2200"/>
+            <w:tcBorders>
+              <w:top w:val="single" w:color="B0BEC5" w:sz="1"/>
+              <w:left w:val="single" w:color="B0BEC5" w:sz="1"/>
+              <w:bottom w:val="single" w:color="B0BEC5" w:sz="1"/>
+              <w:right w:val="single" w:color="B0BEC5" w:sz="1"/>
+            </w:tcBorders>
+            <w:tcMar>
+              <w:top w:type="dxa" w:w="50"/>
+              <w:left w:type="dxa" w:w="100"/>
+              <w:bottom w:type="dxa" w:w="50"/>
+              <w:right w:type="dxa" w:w="100"/>
+            </w:tcMar>
+            <w:vAlign w:val="center"/>
+          </w:tcPr>
+          <w:p>
+            <w:pPr>
+              <w:spacing w:after="0" w:before="0"/>
+              <w:jc w:val="left"/>
+            </w:pPr>
+            <w:r>
+              <w:rPr>
+                <w:rFonts w:ascii="Arial" w:cs="Arial" w:eastAsia="Arial" w:hAnsi="Arial"/>
+                <w:sz w:val="20"/>
+                <w:szCs w:val="20"/>
+              </w:rPr>
+              <w:t xml:space="preserve">getTopNPlayers level</w:t>
+            </w:r>
+          </w:p>
+        </w:tc>
+        <w:tc>
+          <w:tcPr>
+            <w:tcW w:type="dxa" w:w="2200"/>
+            <w:tcBorders>
+              <w:top w:val="single" w:color="B0BEC5" w:sz="1"/>
+              <w:left w:val="single" w:color="B0BEC5" w:sz="1"/>
+              <w:bottom w:val="single" w:color="B0BEC5" w:sz="1"/>
+              <w:right w:val="single" w:color="B0BEC5" w:sz="1"/>
+            </w:tcBorders>
+            <w:tcMar>
+              <w:top w:type="dxa" w:w="50"/>
+              <w:left w:type="dxa" w:w="100"/>
+              <w:bottom w:type="dxa" w:w="50"/>
+              <w:right w:type="dxa" w:w="100"/>
+            </w:tcMar>
+            <w:vAlign w:val="center"/>
+          </w:tcPr>
+          <w:p>
+            <w:pPr>
+              <w:spacing w:after="0" w:before="0"/>
+              <w:jc w:val="left"/>
+            </w:pPr>
+            <w:r>
+              <w:rPr>
+                <w:rFonts w:ascii="Arial" w:cs="Arial" w:eastAsia="Arial" w:hAnsi="Arial"/>
+                <w:sz w:val="20"/>
+                <w:szCs w:val="20"/>
+              </w:rPr>
+              <w:t xml:space="preserve">getTopNPlayers(2, "level")</w:t>
+            </w:r>
+          </w:p>
+        </w:tc>
+        <w:tc>
+          <w:tcPr>
+            <w:tcW w:type="dxa" w:w="2200"/>
+            <w:tcBorders>
+              <w:top w:val="single" w:color="B0BEC5" w:sz="1"/>
+              <w:left w:val="single" w:color="B0BEC5" w:sz="1"/>
+              <w:bottom w:val="single" w:color="B0BEC5" w:sz="1"/>
+              <w:right w:val="single" w:color="B0BEC5" w:sz="1"/>
+            </w:tcBorders>
+            <w:tcMar>
+              <w:top w:type="dxa" w:w="50"/>
+              <w:left w:type="dxa" w:w="100"/>
+              <w:bottom w:type="dxa" w:w="50"/>
+              <w:right w:type="dxa" w:w="100"/>
+            </w:tcMar>
+            <w:vAlign w:val="center"/>
+          </w:tcPr>
+          <w:p>
+            <w:pPr>
+              <w:spacing w:after="0" w:before="0"/>
+              <w:jc w:val="left"/>
+            </w:pPr>
+            <w:r>
+              <w:rPr>
+                <w:rFonts w:ascii="Arial" w:cs="Arial" w:eastAsia="Arial" w:hAnsi="Arial"/>
+                <w:sz w:val="20"/>
+                <w:szCs w:val="20"/>
+              </w:rPr>
+              <w:t xml:space="preserve">2 players, sorted by level</w:t>
+            </w:r>
+          </w:p>
+        </w:tc>
+        <w:tc>
+          <w:tcPr>
+            <w:tcW w:type="dxa" w:w="2200"/>
+            <w:tcBorders>
+              <w:top w:val="single" w:color="B0BEC5" w:sz="1"/>
+              <w:left w:val="single" w:color="B0BEC5" w:sz="1"/>
+              <w:bottom w:val="single" w:color="B0BEC5" w:sz="1"/>
+              <w:right w:val="single" w:color="B0BEC5" w:sz="1"/>
+            </w:tcBorders>
+            <w:tcMar>
+              <w:top w:type="dxa" w:w="50"/>
+              <w:left w:type="dxa" w:w="100"/>
+              <w:bottom w:type="dxa" w:w="50"/>
+              <w:right w:type="dxa" w:w="100"/>
+            </w:tcMar>
+            <w:vAlign w:val="center"/>
+          </w:tcPr>
+          <w:p>
+            <w:pPr>
+              <w:spacing w:after="0" w:before="0"/>
+              <w:jc w:val="left"/>
+            </w:pPr>
+            <w:r>
+              <w:rPr>
+                <w:rFonts w:ascii="Arial" w:cs="Arial" w:eastAsia="Arial" w:hAnsi="Arial"/>
+                <w:sz w:val="20"/>
+                <w:szCs w:val="20"/>
+              </w:rPr>
+              <w:t xml:space="preserve">2 players, sorted by level</w:t>
+            </w:r>
+          </w:p>
+        </w:tc>
+        <w:tc>
+          <w:tcPr>
+            <w:tcW w:type="dxa" w:w="1000"/>
+            <w:tcBorders>
+              <w:top w:val="single" w:color="B0BEC5" w:sz="1"/>
+              <w:left w:val="single" w:color="B0BEC5" w:sz="1"/>
+              <w:bottom w:val="single" w:color="B0BEC5" w:sz="1"/>
+              <w:right w:val="single" w:color="B0BEC5" w:sz="1"/>
+            </w:tcBorders>
+            <w:tcMar>
+              <w:top w:type="dxa" w:w="50"/>
+              <w:left w:type="dxa" w:w="100"/>
+              <w:bottom w:type="dxa" w:w="50"/>
+              <w:right w:type="dxa" w:w="100"/>
+            </w:tcMar>
+            <w:vAlign w:val="center"/>
+          </w:tcPr>
+          <w:p>
+            <w:pPr>
+              <w:spacing w:after="0" w:before="0"/>
+              <w:jc w:val="center"/>
+            </w:pPr>
+            <w:r>
+              <w:rPr>
+                <w:rFonts w:ascii="Arial" w:cs="Arial" w:eastAsia="Arial" w:hAnsi="Arial"/>
+                <w:b/>
+                <w:bCs/>
+                <w:color w:val="2E7D32"/>
+                <w:sz w:val="20"/>
+                <w:szCs w:val="20"/>
+              </w:rPr>
+              <w:t xml:space="preserve">PASS</w:t>
+            </w:r>
+          </w:p>
+        </w:tc>
+      </w:tr>
+    </w:tbl>
+    <w:p>
+      <w:pPr>
+        <w:pStyle w:val="Heading2"/>
+      </w:pPr>
+      <w:r>
+        <w:t xml:space="preserve">Notes</w:t>
+      </w:r>
+    </w:p>
+    <w:p>
+      <w:pPr>
+        <w:pStyle w:val="ListParagraph"/>
+        <w:numPr>
+          <w:ilvl w:val="0"/>
+          <w:numId w:val="2"/>
+        </w:numPr>
+        <w:spacing w:after="60"/>
+      </w:pPr>
+      <w:r>
+        <w:rPr>
+          <w:rFonts w:ascii="Arial" w:cs="Arial" w:eastAsia="Arial" w:hAnsi="Arial"/>
+          <w:sz w:val="22"/>
+          <w:szCs w:val="22"/>
+        </w:rPr>
+        <w:t xml:space="preserve">All 10 test cases passed on first run.</w:t>
+      </w:r>
+    </w:p>
+    <w:p>
+      <w:pPr>
+        <w:pStyle w:val="ListParagraph"/>
+        <w:numPr>
+          <w:ilvl w:val="0"/>
+          <w:numId w:val="2"/>
+        </w:numPr>
+        <w:spacing w:after="60"/>
+      </w:pPr>
+      <w:r>
+        <w:rPr>
+          <w:rFonts w:ascii="Arial" w:cs="Arial" w:eastAsia="Arial" w:hAnsi="Arial"/>
+          <w:sz w:val="22"/>
+          <w:szCs w:val="22"/>
+        </w:rPr>
+        <w:t xml:space="preserve">Player ranking: Chen Jie has highest winRate (0.78) and highest level (32).</w:t>
+      </w:r>
+    </w:p>
+    <w:p>
+      <w:pPr>
+        <w:pStyle w:val="ListParagraph"/>
+        <w:numPr>
+          <w:ilvl w:val="0"/>
+          <w:numId w:val="2"/>
+        </w:numPr>
+        <w:spacing w:after="60"/>
+      </w:pPr>
+      <w:r>
+        <w:rPr>
+          <w:rFonts w:ascii="Arial" w:cs="Arial" w:eastAsia="Arial" w:hAnsi="Arial"/>
+          <w:sz w:val="22"/>
+          <w:szCs w:val="22"/>
+        </w:rPr>
+        <w:t xml:space="preserve">Team rankings verified: all sorted in descending order using Java Comparator.</w:t>
+      </w:r>
+    </w:p>
+    <w:p>
+      <w:pPr>
+        <w:pStyle w:val="ListParagraph"/>
+        <w:numPr>
+          <w:ilvl w:val="0"/>
+          <w:numId w:val="2"/>
+        </w:numPr>
+        <w:spacing w:after="60"/>
+      </w:pPr>
+      <w:r>
+        <w:rPr>
+          <w:rFonts w:ascii="Arial" w:cs="Arial" w:eastAsia="Arial" w:hAnsi="Arial"/>
+          <w:sz w:val="22"/>
+          <w:szCs w:val="22"/>
+        </w:rPr>
+        <w:t xml:space="preserve">getTopNPlayers correctly handles invalid criteria by returning empty list.</w:t>
       </w:r>
     </w:p>
     <w:sectPr>

</xml_diff>

<commit_message>
[Test]Test the Admin Data Mgmt and Player Self-Mgmt functions
</commit_message>
<xml_diff>
--- a/king/docs/test-cases.docx
+++ b/king/docs/test-cases.docx
@@ -13938,6 +13938,3302 @@
           <w:szCs w:val="22"/>
         </w:rPr>
         <w:t xml:space="preserve">getTopNPlayers correctly handles invalid criteria by returning empty list.</w:t>
+      </w:r>
+    </w:p>
+    <w:p>
+      <w:pPr>
+        <w:pStyle w:val="Heading1"/>
+      </w:pPr>
+      <w:r>
+        <w:t xml:space="preserve">Test Session 9: Admin Data Management (F7a)</w:t>
+      </w:r>
+    </w:p>
+    <w:p>
+      <w:pPr>
+        <w:spacing w:after="120"/>
+      </w:pPr>
+      <w:r>
+        <w:rPr>
+          <w:rFonts w:ascii="Arial" w:cs="Arial" w:eastAsia="Arial" w:hAnsi="Arial"/>
+          <w:b/>
+          <w:bCs/>
+          <w:sz w:val="22"/>
+          <w:szCs w:val="22"/>
+        </w:rPr>
+        <w:t xml:space="preserve">Date: </w:t>
+      </w:r>
+      <w:r>
+        <w:rPr>
+          <w:rFonts w:ascii="Arial" w:cs="Arial" w:eastAsia="Arial" w:hAnsi="Arial"/>
+          <w:sz w:val="22"/>
+          <w:szCs w:val="22"/>
+        </w:rPr>
+        <w:t xml:space="preserve">2026-06-08</w:t>
+      </w:r>
+    </w:p>
+    <w:p>
+      <w:pPr>
+        <w:spacing w:after="120"/>
+      </w:pPr>
+      <w:r>
+        <w:rPr>
+          <w:rFonts w:ascii="Arial" w:cs="Arial" w:eastAsia="Arial" w:hAnsi="Arial"/>
+          <w:b/>
+          <w:bCs/>
+          <w:sz w:val="22"/>
+          <w:szCs w:val="22"/>
+        </w:rPr>
+        <w:t xml:space="preserve">Test File: </w:t>
+      </w:r>
+      <w:r>
+        <w:rPr>
+          <w:rFonts w:ascii="Arial" w:cs="Arial" w:eastAsia="Arial" w:hAnsi="Arial"/>
+          <w:sz w:val="22"/>
+          <w:szCs w:val="22"/>
+        </w:rPr>
+        <w:t xml:space="preserve">DataMgmtTest.java</w:t>
+      </w:r>
+    </w:p>
+    <w:p>
+      <w:pPr>
+        <w:spacing w:after="120"/>
+      </w:pPr>
+      <w:r>
+        <w:rPr>
+          <w:rFonts w:ascii="Arial" w:cs="Arial" w:eastAsia="Arial" w:hAnsi="Arial"/>
+          <w:b/>
+          <w:bCs/>
+          <w:sz w:val="22"/>
+          <w:szCs w:val="22"/>
+        </w:rPr>
+        <w:t xml:space="preserve">Component Under Test: </w:t>
+      </w:r>
+      <w:r>
+        <w:rPr>
+          <w:rFonts w:ascii="Arial" w:cs="Arial" w:eastAsia="Arial" w:hAnsi="Arial"/>
+          <w:sz w:val="22"/>
+          <w:szCs w:val="22"/>
+        </w:rPr>
+        <w:t xml:space="preserve">GameDataManager (addPlayer, removePlayer, addHero, removeHero, addTeam, removeTeam) + AuthenticationService</w:t>
+      </w:r>
+    </w:p>
+    <w:p>
+      <w:pPr>
+        <w:spacing w:after="120"/>
+      </w:pPr>
+      <w:r>
+        <w:rPr>
+          <w:rFonts w:ascii="Arial" w:cs="Arial" w:eastAsia="Arial" w:hAnsi="Arial"/>
+          <w:b/>
+          <w:bCs/>
+          <w:sz w:val="22"/>
+          <w:szCs w:val="22"/>
+        </w:rPr>
+        <w:t xml:space="preserve">Result: </w:t>
+      </w:r>
+      <w:r>
+        <w:rPr>
+          <w:rFonts w:ascii="Arial" w:cs="Arial" w:eastAsia="Arial" w:hAnsi="Arial"/>
+          <w:b/>
+          <w:bCs/>
+          <w:color w:val="2E7D32"/>
+          <w:sz w:val="22"/>
+          <w:szCs w:val="22"/>
+        </w:rPr>
+        <w:t xml:space="preserve">6 PASSED, 0 FAILED</w:t>
+      </w:r>
+    </w:p>
+    <w:p>
+      <w:pPr>
+        <w:pStyle w:val="Heading2"/>
+      </w:pPr>
+      <w:r>
+        <w:t xml:space="preserve">Test Cases</w:t>
+      </w:r>
+    </w:p>
+    <w:tbl>
+      <w:tblPr>
+        <w:tblW w:type="pct" w:w="100%"/>
+        <w:tblBorders>
+          <w:top w:val="single" w:color="auto" w:sz="4"/>
+          <w:left w:val="single" w:color="auto" w:sz="4"/>
+          <w:bottom w:val="single" w:color="auto" w:sz="4"/>
+          <w:right w:val="single" w:color="auto" w:sz="4"/>
+          <w:insideH w:val="single" w:color="auto" w:sz="4"/>
+          <w:insideV w:val="single" w:color="auto" w:sz="4"/>
+        </w:tblBorders>
+      </w:tblPr>
+      <w:tblGrid>
+        <w:gridCol w:w="500"/>
+        <w:gridCol w:w="2200"/>
+        <w:gridCol w:w="2200"/>
+        <w:gridCol w:w="2200"/>
+        <w:gridCol w:w="2200"/>
+        <w:gridCol w:w="1000"/>
+      </w:tblGrid>
+      <w:tr>
+        <w:trPr>
+          <w:cantSplit/>
+        </w:trPr>
+        <w:tc>
+          <w:tcPr>
+            <w:tcW w:type="dxa" w:w="500"/>
+            <w:tcBorders>
+              <w:top w:val="single" w:color="B0BEC5" w:sz="1"/>
+              <w:left w:val="single" w:color="B0BEC5" w:sz="1"/>
+              <w:bottom w:val="single" w:color="B0BEC5" w:sz="1"/>
+              <w:right w:val="single" w:color="B0BEC5" w:sz="1"/>
+            </w:tcBorders>
+            <w:shd w:fill="1B3A5C" w:val="clear"/>
+            <w:tcMar>
+              <w:top w:type="dxa" w:w="60"/>
+              <w:left w:type="dxa" w:w="100"/>
+              <w:bottom w:type="dxa" w:w="60"/>
+              <w:right w:type="dxa" w:w="100"/>
+            </w:tcMar>
+            <w:vAlign w:val="center"/>
+          </w:tcPr>
+          <w:p>
+            <w:pPr>
+              <w:spacing w:after="0" w:before="0"/>
+              <w:jc w:val="center"/>
+            </w:pPr>
+            <w:r>
+              <w:rPr>
+                <w:rFonts w:ascii="Arial" w:cs="Arial" w:eastAsia="Arial" w:hAnsi="Arial"/>
+                <w:b/>
+                <w:bCs/>
+                <w:color w:val="FFFFFF"/>
+                <w:sz w:val="20"/>
+                <w:szCs w:val="20"/>
+              </w:rPr>
+              <w:t xml:space="preserve">#</w:t>
+            </w:r>
+          </w:p>
+        </w:tc>
+        <w:tc>
+          <w:tcPr>
+            <w:tcW w:type="dxa" w:w="2200"/>
+            <w:tcBorders>
+              <w:top w:val="single" w:color="B0BEC5" w:sz="1"/>
+              <w:left w:val="single" w:color="B0BEC5" w:sz="1"/>
+              <w:bottom w:val="single" w:color="B0BEC5" w:sz="1"/>
+              <w:right w:val="single" w:color="B0BEC5" w:sz="1"/>
+            </w:tcBorders>
+            <w:shd w:fill="1B3A5C" w:val="clear"/>
+            <w:tcMar>
+              <w:top w:type="dxa" w:w="60"/>
+              <w:left w:type="dxa" w:w="100"/>
+              <w:bottom w:type="dxa" w:w="60"/>
+              <w:right w:type="dxa" w:w="100"/>
+            </w:tcMar>
+            <w:vAlign w:val="center"/>
+          </w:tcPr>
+          <w:p>
+            <w:pPr>
+              <w:spacing w:after="0" w:before="0"/>
+              <w:jc w:val="center"/>
+            </w:pPr>
+            <w:r>
+              <w:rPr>
+                <w:rFonts w:ascii="Arial" w:cs="Arial" w:eastAsia="Arial" w:hAnsi="Arial"/>
+                <w:b/>
+                <w:bCs/>
+                <w:color w:val="FFFFFF"/>
+                <w:sz w:val="20"/>
+                <w:szCs w:val="20"/>
+              </w:rPr>
+              <w:t xml:space="preserve">Test Case</w:t>
+            </w:r>
+          </w:p>
+        </w:tc>
+        <w:tc>
+          <w:tcPr>
+            <w:tcW w:type="dxa" w:w="2200"/>
+            <w:tcBorders>
+              <w:top w:val="single" w:color="B0BEC5" w:sz="1"/>
+              <w:left w:val="single" w:color="B0BEC5" w:sz="1"/>
+              <w:bottom w:val="single" w:color="B0BEC5" w:sz="1"/>
+              <w:right w:val="single" w:color="B0BEC5" w:sz="1"/>
+            </w:tcBorders>
+            <w:shd w:fill="1B3A5C" w:val="clear"/>
+            <w:tcMar>
+              <w:top w:type="dxa" w:w="60"/>
+              <w:left w:type="dxa" w:w="100"/>
+              <w:bottom w:type="dxa" w:w="60"/>
+              <w:right w:type="dxa" w:w="100"/>
+            </w:tcMar>
+            <w:vAlign w:val="center"/>
+          </w:tcPr>
+          <w:p>
+            <w:pPr>
+              <w:spacing w:after="0" w:before="0"/>
+              <w:jc w:val="center"/>
+            </w:pPr>
+            <w:r>
+              <w:rPr>
+                <w:rFonts w:ascii="Arial" w:cs="Arial" w:eastAsia="Arial" w:hAnsi="Arial"/>
+                <w:b/>
+                <w:bCs/>
+                <w:color w:val="FFFFFF"/>
+                <w:sz w:val="20"/>
+                <w:szCs w:val="20"/>
+              </w:rPr>
+              <w:t xml:space="preserve">Input</w:t>
+            </w:r>
+          </w:p>
+        </w:tc>
+        <w:tc>
+          <w:tcPr>
+            <w:tcW w:type="dxa" w:w="2200"/>
+            <w:tcBorders>
+              <w:top w:val="single" w:color="B0BEC5" w:sz="1"/>
+              <w:left w:val="single" w:color="B0BEC5" w:sz="1"/>
+              <w:bottom w:val="single" w:color="B0BEC5" w:sz="1"/>
+              <w:right w:val="single" w:color="B0BEC5" w:sz="1"/>
+            </w:tcBorders>
+            <w:shd w:fill="1B3A5C" w:val="clear"/>
+            <w:tcMar>
+              <w:top w:type="dxa" w:w="60"/>
+              <w:left w:type="dxa" w:w="100"/>
+              <w:bottom w:type="dxa" w:w="60"/>
+              <w:right w:type="dxa" w:w="100"/>
+            </w:tcMar>
+            <w:vAlign w:val="center"/>
+          </w:tcPr>
+          <w:p>
+            <w:pPr>
+              <w:spacing w:after="0" w:before="0"/>
+              <w:jc w:val="center"/>
+            </w:pPr>
+            <w:r>
+              <w:rPr>
+                <w:rFonts w:ascii="Arial" w:cs="Arial" w:eastAsia="Arial" w:hAnsi="Arial"/>
+                <w:b/>
+                <w:bCs/>
+                <w:color w:val="FFFFFF"/>
+                <w:sz w:val="20"/>
+                <w:szCs w:val="20"/>
+              </w:rPr>
+              <w:t xml:space="preserve">Expected Output</w:t>
+            </w:r>
+          </w:p>
+        </w:tc>
+        <w:tc>
+          <w:tcPr>
+            <w:tcW w:type="dxa" w:w="2200"/>
+            <w:tcBorders>
+              <w:top w:val="single" w:color="B0BEC5" w:sz="1"/>
+              <w:left w:val="single" w:color="B0BEC5" w:sz="1"/>
+              <w:bottom w:val="single" w:color="B0BEC5" w:sz="1"/>
+              <w:right w:val="single" w:color="B0BEC5" w:sz="1"/>
+            </w:tcBorders>
+            <w:shd w:fill="1B3A5C" w:val="clear"/>
+            <w:tcMar>
+              <w:top w:type="dxa" w:w="60"/>
+              <w:left w:type="dxa" w:w="100"/>
+              <w:bottom w:type="dxa" w:w="60"/>
+              <w:right w:type="dxa" w:w="100"/>
+            </w:tcMar>
+            <w:vAlign w:val="center"/>
+          </w:tcPr>
+          <w:p>
+            <w:pPr>
+              <w:spacing w:after="0" w:before="0"/>
+              <w:jc w:val="center"/>
+            </w:pPr>
+            <w:r>
+              <w:rPr>
+                <w:rFonts w:ascii="Arial" w:cs="Arial" w:eastAsia="Arial" w:hAnsi="Arial"/>
+                <w:b/>
+                <w:bCs/>
+                <w:color w:val="FFFFFF"/>
+                <w:sz w:val="20"/>
+                <w:szCs w:val="20"/>
+              </w:rPr>
+              <w:t xml:space="preserve">Actual Output</w:t>
+            </w:r>
+          </w:p>
+        </w:tc>
+        <w:tc>
+          <w:tcPr>
+            <w:tcW w:type="dxa" w:w="1000"/>
+            <w:tcBorders>
+              <w:top w:val="single" w:color="B0BEC5" w:sz="1"/>
+              <w:left w:val="single" w:color="B0BEC5" w:sz="1"/>
+              <w:bottom w:val="single" w:color="B0BEC5" w:sz="1"/>
+              <w:right w:val="single" w:color="B0BEC5" w:sz="1"/>
+            </w:tcBorders>
+            <w:shd w:fill="1B3A5C" w:val="clear"/>
+            <w:tcMar>
+              <w:top w:type="dxa" w:w="60"/>
+              <w:left w:type="dxa" w:w="100"/>
+              <w:bottom w:type="dxa" w:w="60"/>
+              <w:right w:type="dxa" w:w="100"/>
+            </w:tcMar>
+            <w:vAlign w:val="center"/>
+          </w:tcPr>
+          <w:p>
+            <w:pPr>
+              <w:spacing w:after="0" w:before="0"/>
+              <w:jc w:val="center"/>
+            </w:pPr>
+            <w:r>
+              <w:rPr>
+                <w:rFonts w:ascii="Arial" w:cs="Arial" w:eastAsia="Arial" w:hAnsi="Arial"/>
+                <w:b/>
+                <w:bCs/>
+                <w:color w:val="FFFFFF"/>
+                <w:sz w:val="20"/>
+                <w:szCs w:val="20"/>
+              </w:rPr>
+              <w:t xml:space="preserve">Result</w:t>
+            </w:r>
+          </w:p>
+        </w:tc>
+      </w:tr>
+      <w:tr>
+        <w:trPr>
+          <w:cantSplit/>
+        </w:trPr>
+        <w:tc>
+          <w:tcPr>
+            <w:tcW w:type="dxa" w:w="500"/>
+            <w:tcBorders>
+              <w:top w:val="single" w:color="B0BEC5" w:sz="1"/>
+              <w:left w:val="single" w:color="B0BEC5" w:sz="1"/>
+              <w:bottom w:val="single" w:color="B0BEC5" w:sz="1"/>
+              <w:right w:val="single" w:color="B0BEC5" w:sz="1"/>
+            </w:tcBorders>
+            <w:shd w:fill="F0F4F8" w:val="clear"/>
+            <w:tcMar>
+              <w:top w:type="dxa" w:w="50"/>
+              <w:left w:type="dxa" w:w="100"/>
+              <w:bottom w:type="dxa" w:w="50"/>
+              <w:right w:type="dxa" w:w="100"/>
+            </w:tcMar>
+            <w:vAlign w:val="center"/>
+          </w:tcPr>
+          <w:p>
+            <w:pPr>
+              <w:spacing w:after="0" w:before="0"/>
+              <w:jc w:val="center"/>
+            </w:pPr>
+            <w:r>
+              <w:rPr>
+                <w:rFonts w:ascii="Arial" w:cs="Arial" w:eastAsia="Arial" w:hAnsi="Arial"/>
+                <w:sz w:val="20"/>
+                <w:szCs w:val="20"/>
+              </w:rPr>
+              <w:t xml:space="preserve">1</w:t>
+            </w:r>
+          </w:p>
+        </w:tc>
+        <w:tc>
+          <w:tcPr>
+            <w:tcW w:type="dxa" w:w="2200"/>
+            <w:tcBorders>
+              <w:top w:val="single" w:color="B0BEC5" w:sz="1"/>
+              <w:left w:val="single" w:color="B0BEC5" w:sz="1"/>
+              <w:bottom w:val="single" w:color="B0BEC5" w:sz="1"/>
+              <w:right w:val="single" w:color="B0BEC5" w:sz="1"/>
+            </w:tcBorders>
+            <w:shd w:fill="F0F4F8" w:val="clear"/>
+            <w:tcMar>
+              <w:top w:type="dxa" w:w="50"/>
+              <w:left w:type="dxa" w:w="100"/>
+              <w:bottom w:type="dxa" w:w="50"/>
+              <w:right w:type="dxa" w:w="100"/>
+            </w:tcMar>
+            <w:vAlign w:val="center"/>
+          </w:tcPr>
+          <w:p>
+            <w:pPr>
+              <w:spacing w:after="0" w:before="0"/>
+              <w:jc w:val="left"/>
+            </w:pPr>
+            <w:r>
+              <w:rPr>
+                <w:rFonts w:ascii="Arial" w:cs="Arial" w:eastAsia="Arial" w:hAnsi="Arial"/>
+                <w:sz w:val="20"/>
+                <w:szCs w:val="20"/>
+              </w:rPr>
+              <w:t xml:space="preserve">Admin adds new player</w:t>
+            </w:r>
+          </w:p>
+        </w:tc>
+        <w:tc>
+          <w:tcPr>
+            <w:tcW w:type="dxa" w:w="2200"/>
+            <w:tcBorders>
+              <w:top w:val="single" w:color="B0BEC5" w:sz="1"/>
+              <w:left w:val="single" w:color="B0BEC5" w:sz="1"/>
+              <w:bottom w:val="single" w:color="B0BEC5" w:sz="1"/>
+              <w:right w:val="single" w:color="B0BEC5" w:sz="1"/>
+            </w:tcBorders>
+            <w:shd w:fill="F0F4F8" w:val="clear"/>
+            <w:tcMar>
+              <w:top w:type="dxa" w:w="50"/>
+              <w:left w:type="dxa" w:w="100"/>
+              <w:bottom w:type="dxa" w:w="50"/>
+              <w:right w:type="dxa" w:w="100"/>
+            </w:tcMar>
+            <w:vAlign w:val="center"/>
+          </w:tcPr>
+          <w:p>
+            <w:pPr>
+              <w:spacing w:after="0" w:before="0"/>
+              <w:jc w:val="left"/>
+            </w:pPr>
+            <w:r>
+              <w:rPr>
+                <w:rFonts w:ascii="Arial" w:cs="Arial" w:eastAsia="Arial" w:hAnsi="Arial"/>
+                <w:sz w:val="20"/>
+                <w:szCs w:val="20"/>
+              </w:rPr>
+              <w:t xml:space="preserve">addPlayer(P99)</w:t>
+            </w:r>
+          </w:p>
+        </w:tc>
+        <w:tc>
+          <w:tcPr>
+            <w:tcW w:type="dxa" w:w="2200"/>
+            <w:tcBorders>
+              <w:top w:val="single" w:color="B0BEC5" w:sz="1"/>
+              <w:left w:val="single" w:color="B0BEC5" w:sz="1"/>
+              <w:bottom w:val="single" w:color="B0BEC5" w:sz="1"/>
+              <w:right w:val="single" w:color="B0BEC5" w:sz="1"/>
+            </w:tcBorders>
+            <w:shd w:fill="F0F4F8" w:val="clear"/>
+            <w:tcMar>
+              <w:top w:type="dxa" w:w="50"/>
+              <w:left w:type="dxa" w:w="100"/>
+              <w:bottom w:type="dxa" w:w="50"/>
+              <w:right w:type="dxa" w:w="100"/>
+            </w:tcMar>
+            <w:vAlign w:val="center"/>
+          </w:tcPr>
+          <w:p>
+            <w:pPr>
+              <w:spacing w:after="0" w:before="0"/>
+              <w:jc w:val="left"/>
+            </w:pPr>
+            <w:r>
+              <w:rPr>
+                <w:rFonts w:ascii="Arial" w:cs="Arial" w:eastAsia="Arial" w:hAnsi="Arial"/>
+                <w:sz w:val="20"/>
+                <w:szCs w:val="20"/>
+              </w:rPr>
+              <w:t xml:space="preserve">player added, findable</w:t>
+            </w:r>
+          </w:p>
+        </w:tc>
+        <w:tc>
+          <w:tcPr>
+            <w:tcW w:type="dxa" w:w="2200"/>
+            <w:tcBorders>
+              <w:top w:val="single" w:color="B0BEC5" w:sz="1"/>
+              <w:left w:val="single" w:color="B0BEC5" w:sz="1"/>
+              <w:bottom w:val="single" w:color="B0BEC5" w:sz="1"/>
+              <w:right w:val="single" w:color="B0BEC5" w:sz="1"/>
+            </w:tcBorders>
+            <w:shd w:fill="F0F4F8" w:val="clear"/>
+            <w:tcMar>
+              <w:top w:type="dxa" w:w="50"/>
+              <w:left w:type="dxa" w:w="100"/>
+              <w:bottom w:type="dxa" w:w="50"/>
+              <w:right w:type="dxa" w:w="100"/>
+            </w:tcMar>
+            <w:vAlign w:val="center"/>
+          </w:tcPr>
+          <w:p>
+            <w:pPr>
+              <w:spacing w:after="0" w:before="0"/>
+              <w:jc w:val="left"/>
+            </w:pPr>
+            <w:r>
+              <w:rPr>
+                <w:rFonts w:ascii="Arial" w:cs="Arial" w:eastAsia="Arial" w:hAnsi="Arial"/>
+                <w:sz w:val="20"/>
+                <w:szCs w:val="20"/>
+              </w:rPr>
+              <w:t xml:space="preserve">P99 added and found</w:t>
+            </w:r>
+          </w:p>
+        </w:tc>
+        <w:tc>
+          <w:tcPr>
+            <w:tcW w:type="dxa" w:w="1000"/>
+            <w:tcBorders>
+              <w:top w:val="single" w:color="B0BEC5" w:sz="1"/>
+              <w:left w:val="single" w:color="B0BEC5" w:sz="1"/>
+              <w:bottom w:val="single" w:color="B0BEC5" w:sz="1"/>
+              <w:right w:val="single" w:color="B0BEC5" w:sz="1"/>
+            </w:tcBorders>
+            <w:tcMar>
+              <w:top w:type="dxa" w:w="50"/>
+              <w:left w:type="dxa" w:w="100"/>
+              <w:bottom w:type="dxa" w:w="50"/>
+              <w:right w:type="dxa" w:w="100"/>
+            </w:tcMar>
+            <w:vAlign w:val="center"/>
+          </w:tcPr>
+          <w:p>
+            <w:pPr>
+              <w:spacing w:after="0" w:before="0"/>
+              <w:jc w:val="center"/>
+            </w:pPr>
+            <w:r>
+              <w:rPr>
+                <w:rFonts w:ascii="Arial" w:cs="Arial" w:eastAsia="Arial" w:hAnsi="Arial"/>
+                <w:b/>
+                <w:bCs/>
+                <w:color w:val="2E7D32"/>
+                <w:sz w:val="20"/>
+                <w:szCs w:val="20"/>
+              </w:rPr>
+              <w:t xml:space="preserve">PASS</w:t>
+            </w:r>
+          </w:p>
+        </w:tc>
+      </w:tr>
+      <w:tr>
+        <w:trPr>
+          <w:cantSplit/>
+        </w:trPr>
+        <w:tc>
+          <w:tcPr>
+            <w:tcW w:type="dxa" w:w="500"/>
+            <w:tcBorders>
+              <w:top w:val="single" w:color="B0BEC5" w:sz="1"/>
+              <w:left w:val="single" w:color="B0BEC5" w:sz="1"/>
+              <w:bottom w:val="single" w:color="B0BEC5" w:sz="1"/>
+              <w:right w:val="single" w:color="B0BEC5" w:sz="1"/>
+            </w:tcBorders>
+            <w:tcMar>
+              <w:top w:type="dxa" w:w="50"/>
+              <w:left w:type="dxa" w:w="100"/>
+              <w:bottom w:type="dxa" w:w="50"/>
+              <w:right w:type="dxa" w:w="100"/>
+            </w:tcMar>
+            <w:vAlign w:val="center"/>
+          </w:tcPr>
+          <w:p>
+            <w:pPr>
+              <w:spacing w:after="0" w:before="0"/>
+              <w:jc w:val="center"/>
+            </w:pPr>
+            <w:r>
+              <w:rPr>
+                <w:rFonts w:ascii="Arial" w:cs="Arial" w:eastAsia="Arial" w:hAnsi="Arial"/>
+                <w:sz w:val="20"/>
+                <w:szCs w:val="20"/>
+              </w:rPr>
+              <w:t xml:space="preserve">2</w:t>
+            </w:r>
+          </w:p>
+        </w:tc>
+        <w:tc>
+          <w:tcPr>
+            <w:tcW w:type="dxa" w:w="2200"/>
+            <w:tcBorders>
+              <w:top w:val="single" w:color="B0BEC5" w:sz="1"/>
+              <w:left w:val="single" w:color="B0BEC5" w:sz="1"/>
+              <w:bottom w:val="single" w:color="B0BEC5" w:sz="1"/>
+              <w:right w:val="single" w:color="B0BEC5" w:sz="1"/>
+            </w:tcBorders>
+            <w:tcMar>
+              <w:top w:type="dxa" w:w="50"/>
+              <w:left w:type="dxa" w:w="100"/>
+              <w:bottom w:type="dxa" w:w="50"/>
+              <w:right w:type="dxa" w:w="100"/>
+            </w:tcMar>
+            <w:vAlign w:val="center"/>
+          </w:tcPr>
+          <w:p>
+            <w:pPr>
+              <w:spacing w:after="0" w:before="0"/>
+              <w:jc w:val="left"/>
+            </w:pPr>
+            <w:r>
+              <w:rPr>
+                <w:rFonts w:ascii="Arial" w:cs="Arial" w:eastAsia="Arial" w:hAnsi="Arial"/>
+                <w:sz w:val="20"/>
+                <w:szCs w:val="20"/>
+              </w:rPr>
+              <w:t xml:space="preserve">Duplicate player rejected</w:t>
+            </w:r>
+          </w:p>
+        </w:tc>
+        <w:tc>
+          <w:tcPr>
+            <w:tcW w:type="dxa" w:w="2200"/>
+            <w:tcBorders>
+              <w:top w:val="single" w:color="B0BEC5" w:sz="1"/>
+              <w:left w:val="single" w:color="B0BEC5" w:sz="1"/>
+              <w:bottom w:val="single" w:color="B0BEC5" w:sz="1"/>
+              <w:right w:val="single" w:color="B0BEC5" w:sz="1"/>
+            </w:tcBorders>
+            <w:tcMar>
+              <w:top w:type="dxa" w:w="50"/>
+              <w:left w:type="dxa" w:w="100"/>
+              <w:bottom w:type="dxa" w:w="50"/>
+              <w:right w:type="dxa" w:w="100"/>
+            </w:tcMar>
+            <w:vAlign w:val="center"/>
+          </w:tcPr>
+          <w:p>
+            <w:pPr>
+              <w:spacing w:after="0" w:before="0"/>
+              <w:jc w:val="left"/>
+            </w:pPr>
+            <w:r>
+              <w:rPr>
+                <w:rFonts w:ascii="Arial" w:cs="Arial" w:eastAsia="Arial" w:hAnsi="Arial"/>
+                <w:sz w:val="20"/>
+                <w:szCs w:val="20"/>
+              </w:rPr>
+              <w:t xml:space="preserve">addPlayer(P01 again)</w:t>
+            </w:r>
+          </w:p>
+        </w:tc>
+        <w:tc>
+          <w:tcPr>
+            <w:tcW w:type="dxa" w:w="2200"/>
+            <w:tcBorders>
+              <w:top w:val="single" w:color="B0BEC5" w:sz="1"/>
+              <w:left w:val="single" w:color="B0BEC5" w:sz="1"/>
+              <w:bottom w:val="single" w:color="B0BEC5" w:sz="1"/>
+              <w:right w:val="single" w:color="B0BEC5" w:sz="1"/>
+            </w:tcBorders>
+            <w:tcMar>
+              <w:top w:type="dxa" w:w="50"/>
+              <w:left w:type="dxa" w:w="100"/>
+              <w:bottom w:type="dxa" w:w="50"/>
+              <w:right w:type="dxa" w:w="100"/>
+            </w:tcMar>
+            <w:vAlign w:val="center"/>
+          </w:tcPr>
+          <w:p>
+            <w:pPr>
+              <w:spacing w:after="0" w:before="0"/>
+              <w:jc w:val="left"/>
+            </w:pPr>
+            <w:r>
+              <w:rPr>
+                <w:rFonts w:ascii="Arial" w:cs="Arial" w:eastAsia="Arial" w:hAnsi="Arial"/>
+                <w:sz w:val="20"/>
+                <w:szCs w:val="20"/>
+              </w:rPr>
+              <w:t xml:space="preserve">false (duplicate)</w:t>
+            </w:r>
+          </w:p>
+        </w:tc>
+        <w:tc>
+          <w:tcPr>
+            <w:tcW w:type="dxa" w:w="2200"/>
+            <w:tcBorders>
+              <w:top w:val="single" w:color="B0BEC5" w:sz="1"/>
+              <w:left w:val="single" w:color="B0BEC5" w:sz="1"/>
+              <w:bottom w:val="single" w:color="B0BEC5" w:sz="1"/>
+              <w:right w:val="single" w:color="B0BEC5" w:sz="1"/>
+            </w:tcBorders>
+            <w:tcMar>
+              <w:top w:type="dxa" w:w="50"/>
+              <w:left w:type="dxa" w:w="100"/>
+              <w:bottom w:type="dxa" w:w="50"/>
+              <w:right w:type="dxa" w:w="100"/>
+            </w:tcMar>
+            <w:vAlign w:val="center"/>
+          </w:tcPr>
+          <w:p>
+            <w:pPr>
+              <w:spacing w:after="0" w:before="0"/>
+              <w:jc w:val="left"/>
+            </w:pPr>
+            <w:r>
+              <w:rPr>
+                <w:rFonts w:ascii="Arial" w:cs="Arial" w:eastAsia="Arial" w:hAnsi="Arial"/>
+                <w:sz w:val="20"/>
+                <w:szCs w:val="20"/>
+              </w:rPr>
+              <w:t xml:space="preserve">false</w:t>
+            </w:r>
+          </w:p>
+        </w:tc>
+        <w:tc>
+          <w:tcPr>
+            <w:tcW w:type="dxa" w:w="1000"/>
+            <w:tcBorders>
+              <w:top w:val="single" w:color="B0BEC5" w:sz="1"/>
+              <w:left w:val="single" w:color="B0BEC5" w:sz="1"/>
+              <w:bottom w:val="single" w:color="B0BEC5" w:sz="1"/>
+              <w:right w:val="single" w:color="B0BEC5" w:sz="1"/>
+            </w:tcBorders>
+            <w:tcMar>
+              <w:top w:type="dxa" w:w="50"/>
+              <w:left w:type="dxa" w:w="100"/>
+              <w:bottom w:type="dxa" w:w="50"/>
+              <w:right w:type="dxa" w:w="100"/>
+            </w:tcMar>
+            <w:vAlign w:val="center"/>
+          </w:tcPr>
+          <w:p>
+            <w:pPr>
+              <w:spacing w:after="0" w:before="0"/>
+              <w:jc w:val="center"/>
+            </w:pPr>
+            <w:r>
+              <w:rPr>
+                <w:rFonts w:ascii="Arial" w:cs="Arial" w:eastAsia="Arial" w:hAnsi="Arial"/>
+                <w:b/>
+                <w:bCs/>
+                <w:color w:val="2E7D32"/>
+                <w:sz w:val="20"/>
+                <w:szCs w:val="20"/>
+              </w:rPr>
+              <w:t xml:space="preserve">PASS</w:t>
+            </w:r>
+          </w:p>
+        </w:tc>
+      </w:tr>
+      <w:tr>
+        <w:trPr>
+          <w:cantSplit/>
+        </w:trPr>
+        <w:tc>
+          <w:tcPr>
+            <w:tcW w:type="dxa" w:w="500"/>
+            <w:tcBorders>
+              <w:top w:val="single" w:color="B0BEC5" w:sz="1"/>
+              <w:left w:val="single" w:color="B0BEC5" w:sz="1"/>
+              <w:bottom w:val="single" w:color="B0BEC5" w:sz="1"/>
+              <w:right w:val="single" w:color="B0BEC5" w:sz="1"/>
+            </w:tcBorders>
+            <w:shd w:fill="F0F4F8" w:val="clear"/>
+            <w:tcMar>
+              <w:top w:type="dxa" w:w="50"/>
+              <w:left w:type="dxa" w:w="100"/>
+              <w:bottom w:type="dxa" w:w="50"/>
+              <w:right w:type="dxa" w:w="100"/>
+            </w:tcMar>
+            <w:vAlign w:val="center"/>
+          </w:tcPr>
+          <w:p>
+            <w:pPr>
+              <w:spacing w:after="0" w:before="0"/>
+              <w:jc w:val="center"/>
+            </w:pPr>
+            <w:r>
+              <w:rPr>
+                <w:rFonts w:ascii="Arial" w:cs="Arial" w:eastAsia="Arial" w:hAnsi="Arial"/>
+                <w:sz w:val="20"/>
+                <w:szCs w:val="20"/>
+              </w:rPr>
+              <w:t xml:space="preserve">3</w:t>
+            </w:r>
+          </w:p>
+        </w:tc>
+        <w:tc>
+          <w:tcPr>
+            <w:tcW w:type="dxa" w:w="2200"/>
+            <w:tcBorders>
+              <w:top w:val="single" w:color="B0BEC5" w:sz="1"/>
+              <w:left w:val="single" w:color="B0BEC5" w:sz="1"/>
+              <w:bottom w:val="single" w:color="B0BEC5" w:sz="1"/>
+              <w:right w:val="single" w:color="B0BEC5" w:sz="1"/>
+            </w:tcBorders>
+            <w:shd w:fill="F0F4F8" w:val="clear"/>
+            <w:tcMar>
+              <w:top w:type="dxa" w:w="50"/>
+              <w:left w:type="dxa" w:w="100"/>
+              <w:bottom w:type="dxa" w:w="50"/>
+              <w:right w:type="dxa" w:w="100"/>
+            </w:tcMar>
+            <w:vAlign w:val="center"/>
+          </w:tcPr>
+          <w:p>
+            <w:pPr>
+              <w:spacing w:after="0" w:before="0"/>
+              <w:jc w:val="left"/>
+            </w:pPr>
+            <w:r>
+              <w:rPr>
+                <w:rFonts w:ascii="Arial" w:cs="Arial" w:eastAsia="Arial" w:hAnsi="Arial"/>
+                <w:sz w:val="20"/>
+                <w:szCs w:val="20"/>
+              </w:rPr>
+              <w:t xml:space="preserve">Admin removes player with cascade</w:t>
+            </w:r>
+          </w:p>
+        </w:tc>
+        <w:tc>
+          <w:tcPr>
+            <w:tcW w:type="dxa" w:w="2200"/>
+            <w:tcBorders>
+              <w:top w:val="single" w:color="B0BEC5" w:sz="1"/>
+              <w:left w:val="single" w:color="B0BEC5" w:sz="1"/>
+              <w:bottom w:val="single" w:color="B0BEC5" w:sz="1"/>
+              <w:right w:val="single" w:color="B0BEC5" w:sz="1"/>
+            </w:tcBorders>
+            <w:shd w:fill="F0F4F8" w:val="clear"/>
+            <w:tcMar>
+              <w:top w:type="dxa" w:w="50"/>
+              <w:left w:type="dxa" w:w="100"/>
+              <w:bottom w:type="dxa" w:w="50"/>
+              <w:right w:type="dxa" w:w="100"/>
+            </w:tcMar>
+            <w:vAlign w:val="center"/>
+          </w:tcPr>
+          <w:p>
+            <w:pPr>
+              <w:spacing w:after="0" w:before="0"/>
+              <w:jc w:val="left"/>
+            </w:pPr>
+            <w:r>
+              <w:rPr>
+                <w:rFonts w:ascii="Arial" w:cs="Arial" w:eastAsia="Arial" w:hAnsi="Arial"/>
+                <w:sz w:val="20"/>
+                <w:szCs w:val="20"/>
+              </w:rPr>
+              <w:t xml:space="preserve">removePlayer(P99)</w:t>
+            </w:r>
+          </w:p>
+        </w:tc>
+        <w:tc>
+          <w:tcPr>
+            <w:tcW w:type="dxa" w:w="2200"/>
+            <w:tcBorders>
+              <w:top w:val="single" w:color="B0BEC5" w:sz="1"/>
+              <w:left w:val="single" w:color="B0BEC5" w:sz="1"/>
+              <w:bottom w:val="single" w:color="B0BEC5" w:sz="1"/>
+              <w:right w:val="single" w:color="B0BEC5" w:sz="1"/>
+            </w:tcBorders>
+            <w:shd w:fill="F0F4F8" w:val="clear"/>
+            <w:tcMar>
+              <w:top w:type="dxa" w:w="50"/>
+              <w:left w:type="dxa" w:w="100"/>
+              <w:bottom w:type="dxa" w:w="50"/>
+              <w:right w:type="dxa" w:w="100"/>
+            </w:tcMar>
+            <w:vAlign w:val="center"/>
+          </w:tcPr>
+          <w:p>
+            <w:pPr>
+              <w:spacing w:after="0" w:before="0"/>
+              <w:jc w:val="left"/>
+            </w:pPr>
+            <w:r>
+              <w:rPr>
+                <w:rFonts w:ascii="Arial" w:cs="Arial" w:eastAsia="Arial" w:hAnsi="Arial"/>
+                <w:sz w:val="20"/>
+                <w:szCs w:val="20"/>
+              </w:rPr>
+              <w:t xml:space="preserve">removed, not found</w:t>
+            </w:r>
+          </w:p>
+        </w:tc>
+        <w:tc>
+          <w:tcPr>
+            <w:tcW w:type="dxa" w:w="2200"/>
+            <w:tcBorders>
+              <w:top w:val="single" w:color="B0BEC5" w:sz="1"/>
+              <w:left w:val="single" w:color="B0BEC5" w:sz="1"/>
+              <w:bottom w:val="single" w:color="B0BEC5" w:sz="1"/>
+              <w:right w:val="single" w:color="B0BEC5" w:sz="1"/>
+            </w:tcBorders>
+            <w:shd w:fill="F0F4F8" w:val="clear"/>
+            <w:tcMar>
+              <w:top w:type="dxa" w:w="50"/>
+              <w:left w:type="dxa" w:w="100"/>
+              <w:bottom w:type="dxa" w:w="50"/>
+              <w:right w:type="dxa" w:w="100"/>
+            </w:tcMar>
+            <w:vAlign w:val="center"/>
+          </w:tcPr>
+          <w:p>
+            <w:pPr>
+              <w:spacing w:after="0" w:before="0"/>
+              <w:jc w:val="left"/>
+            </w:pPr>
+            <w:r>
+              <w:rPr>
+                <w:rFonts w:ascii="Arial" w:cs="Arial" w:eastAsia="Arial" w:hAnsi="Arial"/>
+                <w:sz w:val="20"/>
+                <w:szCs w:val="20"/>
+              </w:rPr>
+              <w:t xml:space="preserve">removed, P99=null</w:t>
+            </w:r>
+          </w:p>
+        </w:tc>
+        <w:tc>
+          <w:tcPr>
+            <w:tcW w:type="dxa" w:w="1000"/>
+            <w:tcBorders>
+              <w:top w:val="single" w:color="B0BEC5" w:sz="1"/>
+              <w:left w:val="single" w:color="B0BEC5" w:sz="1"/>
+              <w:bottom w:val="single" w:color="B0BEC5" w:sz="1"/>
+              <w:right w:val="single" w:color="B0BEC5" w:sz="1"/>
+            </w:tcBorders>
+            <w:tcMar>
+              <w:top w:type="dxa" w:w="50"/>
+              <w:left w:type="dxa" w:w="100"/>
+              <w:bottom w:type="dxa" w:w="50"/>
+              <w:right w:type="dxa" w:w="100"/>
+            </w:tcMar>
+            <w:vAlign w:val="center"/>
+          </w:tcPr>
+          <w:p>
+            <w:pPr>
+              <w:spacing w:after="0" w:before="0"/>
+              <w:jc w:val="center"/>
+            </w:pPr>
+            <w:r>
+              <w:rPr>
+                <w:rFonts w:ascii="Arial" w:cs="Arial" w:eastAsia="Arial" w:hAnsi="Arial"/>
+                <w:b/>
+                <w:bCs/>
+                <w:color w:val="2E7D32"/>
+                <w:sz w:val="20"/>
+                <w:szCs w:val="20"/>
+              </w:rPr>
+              <w:t xml:space="preserve">PASS</w:t>
+            </w:r>
+          </w:p>
+        </w:tc>
+      </w:tr>
+      <w:tr>
+        <w:trPr>
+          <w:cantSplit/>
+        </w:trPr>
+        <w:tc>
+          <w:tcPr>
+            <w:tcW w:type="dxa" w:w="500"/>
+            <w:tcBorders>
+              <w:top w:val="single" w:color="B0BEC5" w:sz="1"/>
+              <w:left w:val="single" w:color="B0BEC5" w:sz="1"/>
+              <w:bottom w:val="single" w:color="B0BEC5" w:sz="1"/>
+              <w:right w:val="single" w:color="B0BEC5" w:sz="1"/>
+            </w:tcBorders>
+            <w:tcMar>
+              <w:top w:type="dxa" w:w="50"/>
+              <w:left w:type="dxa" w:w="100"/>
+              <w:bottom w:type="dxa" w:w="50"/>
+              <w:right w:type="dxa" w:w="100"/>
+            </w:tcMar>
+            <w:vAlign w:val="center"/>
+          </w:tcPr>
+          <w:p>
+            <w:pPr>
+              <w:spacing w:after="0" w:before="0"/>
+              <w:jc w:val="center"/>
+            </w:pPr>
+            <w:r>
+              <w:rPr>
+                <w:rFonts w:ascii="Arial" w:cs="Arial" w:eastAsia="Arial" w:hAnsi="Arial"/>
+                <w:sz w:val="20"/>
+                <w:szCs w:val="20"/>
+              </w:rPr>
+              <w:t xml:space="preserve">4</w:t>
+            </w:r>
+          </w:p>
+        </w:tc>
+        <w:tc>
+          <w:tcPr>
+            <w:tcW w:type="dxa" w:w="2200"/>
+            <w:tcBorders>
+              <w:top w:val="single" w:color="B0BEC5" w:sz="1"/>
+              <w:left w:val="single" w:color="B0BEC5" w:sz="1"/>
+              <w:bottom w:val="single" w:color="B0BEC5" w:sz="1"/>
+              <w:right w:val="single" w:color="B0BEC5" w:sz="1"/>
+            </w:tcBorders>
+            <w:tcMar>
+              <w:top w:type="dxa" w:w="50"/>
+              <w:left w:type="dxa" w:w="100"/>
+              <w:bottom w:type="dxa" w:w="50"/>
+              <w:right w:type="dxa" w:w="100"/>
+            </w:tcMar>
+            <w:vAlign w:val="center"/>
+          </w:tcPr>
+          <w:p>
+            <w:pPr>
+              <w:spacing w:after="0" w:before="0"/>
+              <w:jc w:val="left"/>
+            </w:pPr>
+            <w:r>
+              <w:rPr>
+                <w:rFonts w:ascii="Arial" w:cs="Arial" w:eastAsia="Arial" w:hAnsi="Arial"/>
+                <w:sz w:val="20"/>
+                <w:szCs w:val="20"/>
+              </w:rPr>
+              <w:t xml:space="preserve">Admin adds new hero</w:t>
+            </w:r>
+          </w:p>
+        </w:tc>
+        <w:tc>
+          <w:tcPr>
+            <w:tcW w:type="dxa" w:w="2200"/>
+            <w:tcBorders>
+              <w:top w:val="single" w:color="B0BEC5" w:sz="1"/>
+              <w:left w:val="single" w:color="B0BEC5" w:sz="1"/>
+              <w:bottom w:val="single" w:color="B0BEC5" w:sz="1"/>
+              <w:right w:val="single" w:color="B0BEC5" w:sz="1"/>
+            </w:tcBorders>
+            <w:tcMar>
+              <w:top w:type="dxa" w:w="50"/>
+              <w:left w:type="dxa" w:w="100"/>
+              <w:bottom w:type="dxa" w:w="50"/>
+              <w:right w:type="dxa" w:w="100"/>
+            </w:tcMar>
+            <w:vAlign w:val="center"/>
+          </w:tcPr>
+          <w:p>
+            <w:pPr>
+              <w:spacing w:after="0" w:before="0"/>
+              <w:jc w:val="left"/>
+            </w:pPr>
+            <w:r>
+              <w:rPr>
+                <w:rFonts w:ascii="Arial" w:cs="Arial" w:eastAsia="Arial" w:hAnsi="Arial"/>
+                <w:sz w:val="20"/>
+                <w:szCs w:val="20"/>
+              </w:rPr>
+              <w:t xml:space="preserve">addHero(H99)</w:t>
+            </w:r>
+          </w:p>
+        </w:tc>
+        <w:tc>
+          <w:tcPr>
+            <w:tcW w:type="dxa" w:w="2200"/>
+            <w:tcBorders>
+              <w:top w:val="single" w:color="B0BEC5" w:sz="1"/>
+              <w:left w:val="single" w:color="B0BEC5" w:sz="1"/>
+              <w:bottom w:val="single" w:color="B0BEC5" w:sz="1"/>
+              <w:right w:val="single" w:color="B0BEC5" w:sz="1"/>
+            </w:tcBorders>
+            <w:tcMar>
+              <w:top w:type="dxa" w:w="50"/>
+              <w:left w:type="dxa" w:w="100"/>
+              <w:bottom w:type="dxa" w:w="50"/>
+              <w:right w:type="dxa" w:w="100"/>
+            </w:tcMar>
+            <w:vAlign w:val="center"/>
+          </w:tcPr>
+          <w:p>
+            <w:pPr>
+              <w:spacing w:after="0" w:before="0"/>
+              <w:jc w:val="left"/>
+            </w:pPr>
+            <w:r>
+              <w:rPr>
+                <w:rFonts w:ascii="Arial" w:cs="Arial" w:eastAsia="Arial" w:hAnsi="Arial"/>
+                <w:sz w:val="20"/>
+                <w:szCs w:val="20"/>
+              </w:rPr>
+              <w:t xml:space="preserve">hero added, findable</w:t>
+            </w:r>
+          </w:p>
+        </w:tc>
+        <w:tc>
+          <w:tcPr>
+            <w:tcW w:type="dxa" w:w="2200"/>
+            <w:tcBorders>
+              <w:top w:val="single" w:color="B0BEC5" w:sz="1"/>
+              <w:left w:val="single" w:color="B0BEC5" w:sz="1"/>
+              <w:bottom w:val="single" w:color="B0BEC5" w:sz="1"/>
+              <w:right w:val="single" w:color="B0BEC5" w:sz="1"/>
+            </w:tcBorders>
+            <w:tcMar>
+              <w:top w:type="dxa" w:w="50"/>
+              <w:left w:type="dxa" w:w="100"/>
+              <w:bottom w:type="dxa" w:w="50"/>
+              <w:right w:type="dxa" w:w="100"/>
+            </w:tcMar>
+            <w:vAlign w:val="center"/>
+          </w:tcPr>
+          <w:p>
+            <w:pPr>
+              <w:spacing w:after="0" w:before="0"/>
+              <w:jc w:val="left"/>
+            </w:pPr>
+            <w:r>
+              <w:rPr>
+                <w:rFonts w:ascii="Arial" w:cs="Arial" w:eastAsia="Arial" w:hAnsi="Arial"/>
+                <w:sz w:val="20"/>
+                <w:szCs w:val="20"/>
+              </w:rPr>
+              <w:t xml:space="preserve">H99 added and found</w:t>
+            </w:r>
+          </w:p>
+        </w:tc>
+        <w:tc>
+          <w:tcPr>
+            <w:tcW w:type="dxa" w:w="1000"/>
+            <w:tcBorders>
+              <w:top w:val="single" w:color="B0BEC5" w:sz="1"/>
+              <w:left w:val="single" w:color="B0BEC5" w:sz="1"/>
+              <w:bottom w:val="single" w:color="B0BEC5" w:sz="1"/>
+              <w:right w:val="single" w:color="B0BEC5" w:sz="1"/>
+            </w:tcBorders>
+            <w:tcMar>
+              <w:top w:type="dxa" w:w="50"/>
+              <w:left w:type="dxa" w:w="100"/>
+              <w:bottom w:type="dxa" w:w="50"/>
+              <w:right w:type="dxa" w:w="100"/>
+            </w:tcMar>
+            <w:vAlign w:val="center"/>
+          </w:tcPr>
+          <w:p>
+            <w:pPr>
+              <w:spacing w:after="0" w:before="0"/>
+              <w:jc w:val="center"/>
+            </w:pPr>
+            <w:r>
+              <w:rPr>
+                <w:rFonts w:ascii="Arial" w:cs="Arial" w:eastAsia="Arial" w:hAnsi="Arial"/>
+                <w:b/>
+                <w:bCs/>
+                <w:color w:val="2E7D32"/>
+                <w:sz w:val="20"/>
+                <w:szCs w:val="20"/>
+              </w:rPr>
+              <w:t xml:space="preserve">PASS</w:t>
+            </w:r>
+          </w:p>
+        </w:tc>
+      </w:tr>
+      <w:tr>
+        <w:trPr>
+          <w:cantSplit/>
+        </w:trPr>
+        <w:tc>
+          <w:tcPr>
+            <w:tcW w:type="dxa" w:w="500"/>
+            <w:tcBorders>
+              <w:top w:val="single" w:color="B0BEC5" w:sz="1"/>
+              <w:left w:val="single" w:color="B0BEC5" w:sz="1"/>
+              <w:bottom w:val="single" w:color="B0BEC5" w:sz="1"/>
+              <w:right w:val="single" w:color="B0BEC5" w:sz="1"/>
+            </w:tcBorders>
+            <w:shd w:fill="F0F4F8" w:val="clear"/>
+            <w:tcMar>
+              <w:top w:type="dxa" w:w="50"/>
+              <w:left w:type="dxa" w:w="100"/>
+              <w:bottom w:type="dxa" w:w="50"/>
+              <w:right w:type="dxa" w:w="100"/>
+            </w:tcMar>
+            <w:vAlign w:val="center"/>
+          </w:tcPr>
+          <w:p>
+            <w:pPr>
+              <w:spacing w:after="0" w:before="0"/>
+              <w:jc w:val="center"/>
+            </w:pPr>
+            <w:r>
+              <w:rPr>
+                <w:rFonts w:ascii="Arial" w:cs="Arial" w:eastAsia="Arial" w:hAnsi="Arial"/>
+                <w:sz w:val="20"/>
+                <w:szCs w:val="20"/>
+              </w:rPr>
+              <w:t xml:space="preserve">5</w:t>
+            </w:r>
+          </w:p>
+        </w:tc>
+        <w:tc>
+          <w:tcPr>
+            <w:tcW w:type="dxa" w:w="2200"/>
+            <w:tcBorders>
+              <w:top w:val="single" w:color="B0BEC5" w:sz="1"/>
+              <w:left w:val="single" w:color="B0BEC5" w:sz="1"/>
+              <w:bottom w:val="single" w:color="B0BEC5" w:sz="1"/>
+              <w:right w:val="single" w:color="B0BEC5" w:sz="1"/>
+            </w:tcBorders>
+            <w:shd w:fill="F0F4F8" w:val="clear"/>
+            <w:tcMar>
+              <w:top w:type="dxa" w:w="50"/>
+              <w:left w:type="dxa" w:w="100"/>
+              <w:bottom w:type="dxa" w:w="50"/>
+              <w:right w:type="dxa" w:w="100"/>
+            </w:tcMar>
+            <w:vAlign w:val="center"/>
+          </w:tcPr>
+          <w:p>
+            <w:pPr>
+              <w:spacing w:after="0" w:before="0"/>
+              <w:jc w:val="left"/>
+            </w:pPr>
+            <w:r>
+              <w:rPr>
+                <w:rFonts w:ascii="Arial" w:cs="Arial" w:eastAsia="Arial" w:hAnsi="Arial"/>
+                <w:sz w:val="20"/>
+                <w:szCs w:val="20"/>
+              </w:rPr>
+              <w:t xml:space="preserve">Admin removes hero</w:t>
+            </w:r>
+          </w:p>
+        </w:tc>
+        <w:tc>
+          <w:tcPr>
+            <w:tcW w:type="dxa" w:w="2200"/>
+            <w:tcBorders>
+              <w:top w:val="single" w:color="B0BEC5" w:sz="1"/>
+              <w:left w:val="single" w:color="B0BEC5" w:sz="1"/>
+              <w:bottom w:val="single" w:color="B0BEC5" w:sz="1"/>
+              <w:right w:val="single" w:color="B0BEC5" w:sz="1"/>
+            </w:tcBorders>
+            <w:shd w:fill="F0F4F8" w:val="clear"/>
+            <w:tcMar>
+              <w:top w:type="dxa" w:w="50"/>
+              <w:left w:type="dxa" w:w="100"/>
+              <w:bottom w:type="dxa" w:w="50"/>
+              <w:right w:type="dxa" w:w="100"/>
+            </w:tcMar>
+            <w:vAlign w:val="center"/>
+          </w:tcPr>
+          <w:p>
+            <w:pPr>
+              <w:spacing w:after="0" w:before="0"/>
+              <w:jc w:val="left"/>
+            </w:pPr>
+            <w:r>
+              <w:rPr>
+                <w:rFonts w:ascii="Arial" w:cs="Arial" w:eastAsia="Arial" w:hAnsi="Arial"/>
+                <w:sz w:val="20"/>
+                <w:szCs w:val="20"/>
+              </w:rPr>
+              <w:t xml:space="preserve">removeHero(H99)</w:t>
+            </w:r>
+          </w:p>
+        </w:tc>
+        <w:tc>
+          <w:tcPr>
+            <w:tcW w:type="dxa" w:w="2200"/>
+            <w:tcBorders>
+              <w:top w:val="single" w:color="B0BEC5" w:sz="1"/>
+              <w:left w:val="single" w:color="B0BEC5" w:sz="1"/>
+              <w:bottom w:val="single" w:color="B0BEC5" w:sz="1"/>
+              <w:right w:val="single" w:color="B0BEC5" w:sz="1"/>
+            </w:tcBorders>
+            <w:shd w:fill="F0F4F8" w:val="clear"/>
+            <w:tcMar>
+              <w:top w:type="dxa" w:w="50"/>
+              <w:left w:type="dxa" w:w="100"/>
+              <w:bottom w:type="dxa" w:w="50"/>
+              <w:right w:type="dxa" w:w="100"/>
+            </w:tcMar>
+            <w:vAlign w:val="center"/>
+          </w:tcPr>
+          <w:p>
+            <w:pPr>
+              <w:spacing w:after="0" w:before="0"/>
+              <w:jc w:val="left"/>
+            </w:pPr>
+            <w:r>
+              <w:rPr>
+                <w:rFonts w:ascii="Arial" w:cs="Arial" w:eastAsia="Arial" w:hAnsi="Arial"/>
+                <w:sz w:val="20"/>
+                <w:szCs w:val="20"/>
+              </w:rPr>
+              <w:t xml:space="preserve">removed, not found</w:t>
+            </w:r>
+          </w:p>
+        </w:tc>
+        <w:tc>
+          <w:tcPr>
+            <w:tcW w:type="dxa" w:w="2200"/>
+            <w:tcBorders>
+              <w:top w:val="single" w:color="B0BEC5" w:sz="1"/>
+              <w:left w:val="single" w:color="B0BEC5" w:sz="1"/>
+              <w:bottom w:val="single" w:color="B0BEC5" w:sz="1"/>
+              <w:right w:val="single" w:color="B0BEC5" w:sz="1"/>
+            </w:tcBorders>
+            <w:shd w:fill="F0F4F8" w:val="clear"/>
+            <w:tcMar>
+              <w:top w:type="dxa" w:w="50"/>
+              <w:left w:type="dxa" w:w="100"/>
+              <w:bottom w:type="dxa" w:w="50"/>
+              <w:right w:type="dxa" w:w="100"/>
+            </w:tcMar>
+            <w:vAlign w:val="center"/>
+          </w:tcPr>
+          <w:p>
+            <w:pPr>
+              <w:spacing w:after="0" w:before="0"/>
+              <w:jc w:val="left"/>
+            </w:pPr>
+            <w:r>
+              <w:rPr>
+                <w:rFonts w:ascii="Arial" w:cs="Arial" w:eastAsia="Arial" w:hAnsi="Arial"/>
+                <w:sz w:val="20"/>
+                <w:szCs w:val="20"/>
+              </w:rPr>
+              <w:t xml:space="preserve">removed, H99=null</w:t>
+            </w:r>
+          </w:p>
+        </w:tc>
+        <w:tc>
+          <w:tcPr>
+            <w:tcW w:type="dxa" w:w="1000"/>
+            <w:tcBorders>
+              <w:top w:val="single" w:color="B0BEC5" w:sz="1"/>
+              <w:left w:val="single" w:color="B0BEC5" w:sz="1"/>
+              <w:bottom w:val="single" w:color="B0BEC5" w:sz="1"/>
+              <w:right w:val="single" w:color="B0BEC5" w:sz="1"/>
+            </w:tcBorders>
+            <w:tcMar>
+              <w:top w:type="dxa" w:w="50"/>
+              <w:left w:type="dxa" w:w="100"/>
+              <w:bottom w:type="dxa" w:w="50"/>
+              <w:right w:type="dxa" w:w="100"/>
+            </w:tcMar>
+            <w:vAlign w:val="center"/>
+          </w:tcPr>
+          <w:p>
+            <w:pPr>
+              <w:spacing w:after="0" w:before="0"/>
+              <w:jc w:val="center"/>
+            </w:pPr>
+            <w:r>
+              <w:rPr>
+                <w:rFonts w:ascii="Arial" w:cs="Arial" w:eastAsia="Arial" w:hAnsi="Arial"/>
+                <w:b/>
+                <w:bCs/>
+                <w:color w:val="2E7D32"/>
+                <w:sz w:val="20"/>
+                <w:szCs w:val="20"/>
+              </w:rPr>
+              <w:t xml:space="preserve">PASS</w:t>
+            </w:r>
+          </w:p>
+        </w:tc>
+      </w:tr>
+      <w:tr>
+        <w:trPr>
+          <w:cantSplit/>
+        </w:trPr>
+        <w:tc>
+          <w:tcPr>
+            <w:tcW w:type="dxa" w:w="500"/>
+            <w:tcBorders>
+              <w:top w:val="single" w:color="B0BEC5" w:sz="1"/>
+              <w:left w:val="single" w:color="B0BEC5" w:sz="1"/>
+              <w:bottom w:val="single" w:color="B0BEC5" w:sz="1"/>
+              <w:right w:val="single" w:color="B0BEC5" w:sz="1"/>
+            </w:tcBorders>
+            <w:tcMar>
+              <w:top w:type="dxa" w:w="50"/>
+              <w:left w:type="dxa" w:w="100"/>
+              <w:bottom w:type="dxa" w:w="50"/>
+              <w:right w:type="dxa" w:w="100"/>
+            </w:tcMar>
+            <w:vAlign w:val="center"/>
+          </w:tcPr>
+          <w:p>
+            <w:pPr>
+              <w:spacing w:after="0" w:before="0"/>
+              <w:jc w:val="center"/>
+            </w:pPr>
+            <w:r>
+              <w:rPr>
+                <w:rFonts w:ascii="Arial" w:cs="Arial" w:eastAsia="Arial" w:hAnsi="Arial"/>
+                <w:sz w:val="20"/>
+                <w:szCs w:val="20"/>
+              </w:rPr>
+              <w:t xml:space="preserve">6</w:t>
+            </w:r>
+          </w:p>
+        </w:tc>
+        <w:tc>
+          <w:tcPr>
+            <w:tcW w:type="dxa" w:w="2200"/>
+            <w:tcBorders>
+              <w:top w:val="single" w:color="B0BEC5" w:sz="1"/>
+              <w:left w:val="single" w:color="B0BEC5" w:sz="1"/>
+              <w:bottom w:val="single" w:color="B0BEC5" w:sz="1"/>
+              <w:right w:val="single" w:color="B0BEC5" w:sz="1"/>
+            </w:tcBorders>
+            <w:tcMar>
+              <w:top w:type="dxa" w:w="50"/>
+              <w:left w:type="dxa" w:w="100"/>
+              <w:bottom w:type="dxa" w:w="50"/>
+              <w:right w:type="dxa" w:w="100"/>
+            </w:tcMar>
+            <w:vAlign w:val="center"/>
+          </w:tcPr>
+          <w:p>
+            <w:pPr>
+              <w:spacing w:after="0" w:before="0"/>
+              <w:jc w:val="left"/>
+            </w:pPr>
+            <w:r>
+              <w:rPr>
+                <w:rFonts w:ascii="Arial" w:cs="Arial" w:eastAsia="Arial" w:hAnsi="Arial"/>
+                <w:sz w:val="20"/>
+                <w:szCs w:val="20"/>
+              </w:rPr>
+              <w:t xml:space="preserve">Admin removes team with cascade</w:t>
+            </w:r>
+          </w:p>
+        </w:tc>
+        <w:tc>
+          <w:tcPr>
+            <w:tcW w:type="dxa" w:w="2200"/>
+            <w:tcBorders>
+              <w:top w:val="single" w:color="B0BEC5" w:sz="1"/>
+              <w:left w:val="single" w:color="B0BEC5" w:sz="1"/>
+              <w:bottom w:val="single" w:color="B0BEC5" w:sz="1"/>
+              <w:right w:val="single" w:color="B0BEC5" w:sz="1"/>
+            </w:tcBorders>
+            <w:tcMar>
+              <w:top w:type="dxa" w:w="50"/>
+              <w:left w:type="dxa" w:w="100"/>
+              <w:bottom w:type="dxa" w:w="50"/>
+              <w:right w:type="dxa" w:w="100"/>
+            </w:tcMar>
+            <w:vAlign w:val="center"/>
+          </w:tcPr>
+          <w:p>
+            <w:pPr>
+              <w:spacing w:after="0" w:before="0"/>
+              <w:jc w:val="left"/>
+            </w:pPr>
+            <w:r>
+              <w:rPr>
+                <w:rFonts w:ascii="Arial" w:cs="Arial" w:eastAsia="Arial" w:hAnsi="Arial"/>
+                <w:sz w:val="20"/>
+                <w:szCs w:val="20"/>
+              </w:rPr>
+              <w:t xml:space="preserve">add+remove T99</w:t>
+            </w:r>
+          </w:p>
+        </w:tc>
+        <w:tc>
+          <w:tcPr>
+            <w:tcW w:type="dxa" w:w="2200"/>
+            <w:tcBorders>
+              <w:top w:val="single" w:color="B0BEC5" w:sz="1"/>
+              <w:left w:val="single" w:color="B0BEC5" w:sz="1"/>
+              <w:bottom w:val="single" w:color="B0BEC5" w:sz="1"/>
+              <w:right w:val="single" w:color="B0BEC5" w:sz="1"/>
+            </w:tcBorders>
+            <w:tcMar>
+              <w:top w:type="dxa" w:w="50"/>
+              <w:left w:type="dxa" w:w="100"/>
+              <w:bottom w:type="dxa" w:w="50"/>
+              <w:right w:type="dxa" w:w="100"/>
+            </w:tcMar>
+            <w:vAlign w:val="center"/>
+          </w:tcPr>
+          <w:p>
+            <w:pPr>
+              <w:spacing w:after="0" w:before="0"/>
+              <w:jc w:val="left"/>
+            </w:pPr>
+            <w:r>
+              <w:rPr>
+                <w:rFonts w:ascii="Arial" w:cs="Arial" w:eastAsia="Arial" w:hAnsi="Arial"/>
+                <w:sz w:val="20"/>
+                <w:szCs w:val="20"/>
+              </w:rPr>
+              <w:t xml:space="preserve">removed, not found</w:t>
+            </w:r>
+          </w:p>
+        </w:tc>
+        <w:tc>
+          <w:tcPr>
+            <w:tcW w:type="dxa" w:w="2200"/>
+            <w:tcBorders>
+              <w:top w:val="single" w:color="B0BEC5" w:sz="1"/>
+              <w:left w:val="single" w:color="B0BEC5" w:sz="1"/>
+              <w:bottom w:val="single" w:color="B0BEC5" w:sz="1"/>
+              <w:right w:val="single" w:color="B0BEC5" w:sz="1"/>
+            </w:tcBorders>
+            <w:tcMar>
+              <w:top w:type="dxa" w:w="50"/>
+              <w:left w:type="dxa" w:w="100"/>
+              <w:bottom w:type="dxa" w:w="50"/>
+              <w:right w:type="dxa" w:w="100"/>
+            </w:tcMar>
+            <w:vAlign w:val="center"/>
+          </w:tcPr>
+          <w:p>
+            <w:pPr>
+              <w:spacing w:after="0" w:before="0"/>
+              <w:jc w:val="left"/>
+            </w:pPr>
+            <w:r>
+              <w:rPr>
+                <w:rFonts w:ascii="Arial" w:cs="Arial" w:eastAsia="Arial" w:hAnsi="Arial"/>
+                <w:sz w:val="20"/>
+                <w:szCs w:val="20"/>
+              </w:rPr>
+              <w:t xml:space="preserve">removed, T99=null</w:t>
+            </w:r>
+          </w:p>
+        </w:tc>
+        <w:tc>
+          <w:tcPr>
+            <w:tcW w:type="dxa" w:w="1000"/>
+            <w:tcBorders>
+              <w:top w:val="single" w:color="B0BEC5" w:sz="1"/>
+              <w:left w:val="single" w:color="B0BEC5" w:sz="1"/>
+              <w:bottom w:val="single" w:color="B0BEC5" w:sz="1"/>
+              <w:right w:val="single" w:color="B0BEC5" w:sz="1"/>
+            </w:tcBorders>
+            <w:tcMar>
+              <w:top w:type="dxa" w:w="50"/>
+              <w:left w:type="dxa" w:w="100"/>
+              <w:bottom w:type="dxa" w:w="50"/>
+              <w:right w:type="dxa" w:w="100"/>
+            </w:tcMar>
+            <w:vAlign w:val="center"/>
+          </w:tcPr>
+          <w:p>
+            <w:pPr>
+              <w:spacing w:after="0" w:before="0"/>
+              <w:jc w:val="center"/>
+            </w:pPr>
+            <w:r>
+              <w:rPr>
+                <w:rFonts w:ascii="Arial" w:cs="Arial" w:eastAsia="Arial" w:hAnsi="Arial"/>
+                <w:b/>
+                <w:bCs/>
+                <w:color w:val="2E7D32"/>
+                <w:sz w:val="20"/>
+                <w:szCs w:val="20"/>
+              </w:rPr>
+              <w:t xml:space="preserve">PASS</w:t>
+            </w:r>
+          </w:p>
+        </w:tc>
+      </w:tr>
+    </w:tbl>
+    <w:p>
+      <w:pPr>
+        <w:pStyle w:val="Heading2"/>
+      </w:pPr>
+      <w:r>
+        <w:t xml:space="preserve">Notes</w:t>
+      </w:r>
+    </w:p>
+    <w:p>
+      <w:pPr>
+        <w:pStyle w:val="ListParagraph"/>
+        <w:numPr>
+          <w:ilvl w:val="0"/>
+          <w:numId w:val="2"/>
+        </w:numPr>
+        <w:spacing w:after="60"/>
+      </w:pPr>
+      <w:r>
+        <w:rPr>
+          <w:rFonts w:ascii="Arial" w:cs="Arial" w:eastAsia="Arial" w:hAnsi="Arial"/>
+          <w:sz w:val="22"/>
+          <w:szCs w:val="22"/>
+        </w:rPr>
+        <w:t xml:space="preserve">All 6 test cases passed on first run.</w:t>
+      </w:r>
+    </w:p>
+    <w:p>
+      <w:pPr>
+        <w:pStyle w:val="ListParagraph"/>
+        <w:numPr>
+          <w:ilvl w:val="0"/>
+          <w:numId w:val="2"/>
+        </w:numPr>
+        <w:spacing w:after="60"/>
+      </w:pPr>
+      <w:r>
+        <w:rPr>
+          <w:rFonts w:ascii="Arial" w:cs="Arial" w:eastAsia="Arial" w:hAnsi="Arial"/>
+          <w:sz w:val="22"/>
+          <w:szCs w:val="22"/>
+        </w:rPr>
+        <w:t xml:space="preserve">Admin CRUD verified: add/remove player, hero, team all work correctly.</w:t>
+      </w:r>
+    </w:p>
+    <w:p>
+      <w:pPr>
+        <w:pStyle w:val="ListParagraph"/>
+        <w:numPr>
+          <w:ilvl w:val="0"/>
+          <w:numId w:val="2"/>
+        </w:numPr>
+        <w:spacing w:after="60"/>
+      </w:pPr>
+      <w:r>
+        <w:rPr>
+          <w:rFonts w:ascii="Arial" w:cs="Arial" w:eastAsia="Arial" w:hAnsi="Arial"/>
+          <w:sz w:val="22"/>
+          <w:szCs w:val="22"/>
+        </w:rPr>
+        <w:t xml:space="preserve">Duplicate check works: adding P01 again returns false.</w:t>
+      </w:r>
+    </w:p>
+    <w:p>
+      <w:pPr>
+        <w:pStyle w:val="ListParagraph"/>
+        <w:numPr>
+          <w:ilvl w:val="0"/>
+          <w:numId w:val="2"/>
+        </w:numPr>
+        <w:spacing w:after="60"/>
+      </w:pPr>
+      <w:r>
+        <w:rPr>
+          <w:rFonts w:ascii="Arial" w:cs="Arial" w:eastAsia="Arial" w:hAnsi="Arial"/>
+          <w:sz w:val="22"/>
+          <w:szCs w:val="22"/>
+        </w:rPr>
+        <w:t xml:space="preserve">Cascade cleanup verified: removing player cleans up team and hero associations.</w:t>
+      </w:r>
+    </w:p>
+    <w:p>
+      <w:pPr>
+        <w:pStyle w:val="Heading1"/>
+      </w:pPr>
+      <w:r>
+        <w:t xml:space="preserve">Test Session 10: Player Self-Management (F7b)</w:t>
+      </w:r>
+    </w:p>
+    <w:p>
+      <w:pPr>
+        <w:spacing w:after="120"/>
+      </w:pPr>
+      <w:r>
+        <w:rPr>
+          <w:rFonts w:ascii="Arial" w:cs="Arial" w:eastAsia="Arial" w:hAnsi="Arial"/>
+          <w:b/>
+          <w:bCs/>
+          <w:sz w:val="22"/>
+          <w:szCs w:val="22"/>
+        </w:rPr>
+        <w:t xml:space="preserve">Date: </w:t>
+      </w:r>
+      <w:r>
+        <w:rPr>
+          <w:rFonts w:ascii="Arial" w:cs="Arial" w:eastAsia="Arial" w:hAnsi="Arial"/>
+          <w:sz w:val="22"/>
+          <w:szCs w:val="22"/>
+        </w:rPr>
+        <w:t xml:space="preserve">2026-06-08</w:t>
+      </w:r>
+    </w:p>
+    <w:p>
+      <w:pPr>
+        <w:spacing w:after="120"/>
+      </w:pPr>
+      <w:r>
+        <w:rPr>
+          <w:rFonts w:ascii="Arial" w:cs="Arial" w:eastAsia="Arial" w:hAnsi="Arial"/>
+          <w:b/>
+          <w:bCs/>
+          <w:sz w:val="22"/>
+          <w:szCs w:val="22"/>
+        </w:rPr>
+        <w:t xml:space="preserve">Test File: </w:t>
+      </w:r>
+      <w:r>
+        <w:rPr>
+          <w:rFonts w:ascii="Arial" w:cs="Arial" w:eastAsia="Arial" w:hAnsi="Arial"/>
+          <w:sz w:val="22"/>
+          <w:szCs w:val="22"/>
+        </w:rPr>
+        <w:t xml:space="preserve">DataMgmtTest.java</w:t>
+      </w:r>
+    </w:p>
+    <w:p>
+      <w:pPr>
+        <w:spacing w:after="120"/>
+      </w:pPr>
+      <w:r>
+        <w:rPr>
+          <w:rFonts w:ascii="Arial" w:cs="Arial" w:eastAsia="Arial" w:hAnsi="Arial"/>
+          <w:b/>
+          <w:bCs/>
+          <w:sz w:val="22"/>
+          <w:szCs w:val="22"/>
+        </w:rPr>
+        <w:t xml:space="preserve">Component Under Test: </w:t>
+      </w:r>
+      <w:r>
+        <w:rPr>
+          <w:rFonts w:ascii="Arial" w:cs="Arial" w:eastAsia="Arial" w:hAnsi="Arial"/>
+          <w:sz w:val="22"/>
+          <w:szCs w:val="22"/>
+        </w:rPr>
+        <w:t xml:space="preserve">AuthenticationService (login, logout, getCurrentUser, currentUserIsAdmin) + Player (getHeroes, getTeam, setPassword)</w:t>
+      </w:r>
+    </w:p>
+    <w:p>
+      <w:pPr>
+        <w:spacing w:after="120"/>
+      </w:pPr>
+      <w:r>
+        <w:rPr>
+          <w:rFonts w:ascii="Arial" w:cs="Arial" w:eastAsia="Arial" w:hAnsi="Arial"/>
+          <w:b/>
+          <w:bCs/>
+          <w:sz w:val="22"/>
+          <w:szCs w:val="22"/>
+        </w:rPr>
+        <w:t xml:space="preserve">Result: </w:t>
+      </w:r>
+      <w:r>
+        <w:rPr>
+          <w:rFonts w:ascii="Arial" w:cs="Arial" w:eastAsia="Arial" w:hAnsi="Arial"/>
+          <w:b/>
+          <w:bCs/>
+          <w:color w:val="2E7D32"/>
+          <w:sz w:val="22"/>
+          <w:szCs w:val="22"/>
+        </w:rPr>
+        <w:t xml:space="preserve">6 PASSED, 0 FAILED</w:t>
+      </w:r>
+    </w:p>
+    <w:p>
+      <w:pPr>
+        <w:pStyle w:val="Heading2"/>
+      </w:pPr>
+      <w:r>
+        <w:t xml:space="preserve">Test Cases</w:t>
+      </w:r>
+    </w:p>
+    <w:tbl>
+      <w:tblPr>
+        <w:tblW w:type="pct" w:w="100%"/>
+        <w:tblBorders>
+          <w:top w:val="single" w:color="auto" w:sz="4"/>
+          <w:left w:val="single" w:color="auto" w:sz="4"/>
+          <w:bottom w:val="single" w:color="auto" w:sz="4"/>
+          <w:right w:val="single" w:color="auto" w:sz="4"/>
+          <w:insideH w:val="single" w:color="auto" w:sz="4"/>
+          <w:insideV w:val="single" w:color="auto" w:sz="4"/>
+        </w:tblBorders>
+      </w:tblPr>
+      <w:tblGrid>
+        <w:gridCol w:w="500"/>
+        <w:gridCol w:w="2200"/>
+        <w:gridCol w:w="2200"/>
+        <w:gridCol w:w="2200"/>
+        <w:gridCol w:w="2200"/>
+        <w:gridCol w:w="1000"/>
+      </w:tblGrid>
+      <w:tr>
+        <w:trPr>
+          <w:cantSplit/>
+        </w:trPr>
+        <w:tc>
+          <w:tcPr>
+            <w:tcW w:type="dxa" w:w="500"/>
+            <w:tcBorders>
+              <w:top w:val="single" w:color="B0BEC5" w:sz="1"/>
+              <w:left w:val="single" w:color="B0BEC5" w:sz="1"/>
+              <w:bottom w:val="single" w:color="B0BEC5" w:sz="1"/>
+              <w:right w:val="single" w:color="B0BEC5" w:sz="1"/>
+            </w:tcBorders>
+            <w:shd w:fill="1B3A5C" w:val="clear"/>
+            <w:tcMar>
+              <w:top w:type="dxa" w:w="60"/>
+              <w:left w:type="dxa" w:w="100"/>
+              <w:bottom w:type="dxa" w:w="60"/>
+              <w:right w:type="dxa" w:w="100"/>
+            </w:tcMar>
+            <w:vAlign w:val="center"/>
+          </w:tcPr>
+          <w:p>
+            <w:pPr>
+              <w:spacing w:after="0" w:before="0"/>
+              <w:jc w:val="center"/>
+            </w:pPr>
+            <w:r>
+              <w:rPr>
+                <w:rFonts w:ascii="Arial" w:cs="Arial" w:eastAsia="Arial" w:hAnsi="Arial"/>
+                <w:b/>
+                <w:bCs/>
+                <w:color w:val="FFFFFF"/>
+                <w:sz w:val="20"/>
+                <w:szCs w:val="20"/>
+              </w:rPr>
+              <w:t xml:space="preserve">#</w:t>
+            </w:r>
+          </w:p>
+        </w:tc>
+        <w:tc>
+          <w:tcPr>
+            <w:tcW w:type="dxa" w:w="2200"/>
+            <w:tcBorders>
+              <w:top w:val="single" w:color="B0BEC5" w:sz="1"/>
+              <w:left w:val="single" w:color="B0BEC5" w:sz="1"/>
+              <w:bottom w:val="single" w:color="B0BEC5" w:sz="1"/>
+              <w:right w:val="single" w:color="B0BEC5" w:sz="1"/>
+            </w:tcBorders>
+            <w:shd w:fill="1B3A5C" w:val="clear"/>
+            <w:tcMar>
+              <w:top w:type="dxa" w:w="60"/>
+              <w:left w:type="dxa" w:w="100"/>
+              <w:bottom w:type="dxa" w:w="60"/>
+              <w:right w:type="dxa" w:w="100"/>
+            </w:tcMar>
+            <w:vAlign w:val="center"/>
+          </w:tcPr>
+          <w:p>
+            <w:pPr>
+              <w:spacing w:after="0" w:before="0"/>
+              <w:jc w:val="center"/>
+            </w:pPr>
+            <w:r>
+              <w:rPr>
+                <w:rFonts w:ascii="Arial" w:cs="Arial" w:eastAsia="Arial" w:hAnsi="Arial"/>
+                <w:b/>
+                <w:bCs/>
+                <w:color w:val="FFFFFF"/>
+                <w:sz w:val="20"/>
+                <w:szCs w:val="20"/>
+              </w:rPr>
+              <w:t xml:space="preserve">Test Case</w:t>
+            </w:r>
+          </w:p>
+        </w:tc>
+        <w:tc>
+          <w:tcPr>
+            <w:tcW w:type="dxa" w:w="2200"/>
+            <w:tcBorders>
+              <w:top w:val="single" w:color="B0BEC5" w:sz="1"/>
+              <w:left w:val="single" w:color="B0BEC5" w:sz="1"/>
+              <w:bottom w:val="single" w:color="B0BEC5" w:sz="1"/>
+              <w:right w:val="single" w:color="B0BEC5" w:sz="1"/>
+            </w:tcBorders>
+            <w:shd w:fill="1B3A5C" w:val="clear"/>
+            <w:tcMar>
+              <w:top w:type="dxa" w:w="60"/>
+              <w:left w:type="dxa" w:w="100"/>
+              <w:bottom w:type="dxa" w:w="60"/>
+              <w:right w:type="dxa" w:w="100"/>
+            </w:tcMar>
+            <w:vAlign w:val="center"/>
+          </w:tcPr>
+          <w:p>
+            <w:pPr>
+              <w:spacing w:after="0" w:before="0"/>
+              <w:jc w:val="center"/>
+            </w:pPr>
+            <w:r>
+              <w:rPr>
+                <w:rFonts w:ascii="Arial" w:cs="Arial" w:eastAsia="Arial" w:hAnsi="Arial"/>
+                <w:b/>
+                <w:bCs/>
+                <w:color w:val="FFFFFF"/>
+                <w:sz w:val="20"/>
+                <w:szCs w:val="20"/>
+              </w:rPr>
+              <w:t xml:space="preserve">Input</w:t>
+            </w:r>
+          </w:p>
+        </w:tc>
+        <w:tc>
+          <w:tcPr>
+            <w:tcW w:type="dxa" w:w="2200"/>
+            <w:tcBorders>
+              <w:top w:val="single" w:color="B0BEC5" w:sz="1"/>
+              <w:left w:val="single" w:color="B0BEC5" w:sz="1"/>
+              <w:bottom w:val="single" w:color="B0BEC5" w:sz="1"/>
+              <w:right w:val="single" w:color="B0BEC5" w:sz="1"/>
+            </w:tcBorders>
+            <w:shd w:fill="1B3A5C" w:val="clear"/>
+            <w:tcMar>
+              <w:top w:type="dxa" w:w="60"/>
+              <w:left w:type="dxa" w:w="100"/>
+              <w:bottom w:type="dxa" w:w="60"/>
+              <w:right w:type="dxa" w:w="100"/>
+            </w:tcMar>
+            <w:vAlign w:val="center"/>
+          </w:tcPr>
+          <w:p>
+            <w:pPr>
+              <w:spacing w:after="0" w:before="0"/>
+              <w:jc w:val="center"/>
+            </w:pPr>
+            <w:r>
+              <w:rPr>
+                <w:rFonts w:ascii="Arial" w:cs="Arial" w:eastAsia="Arial" w:hAnsi="Arial"/>
+                <w:b/>
+                <w:bCs/>
+                <w:color w:val="FFFFFF"/>
+                <w:sz w:val="20"/>
+                <w:szCs w:val="20"/>
+              </w:rPr>
+              <w:t xml:space="preserve">Expected Output</w:t>
+            </w:r>
+          </w:p>
+        </w:tc>
+        <w:tc>
+          <w:tcPr>
+            <w:tcW w:type="dxa" w:w="2200"/>
+            <w:tcBorders>
+              <w:top w:val="single" w:color="B0BEC5" w:sz="1"/>
+              <w:left w:val="single" w:color="B0BEC5" w:sz="1"/>
+              <w:bottom w:val="single" w:color="B0BEC5" w:sz="1"/>
+              <w:right w:val="single" w:color="B0BEC5" w:sz="1"/>
+            </w:tcBorders>
+            <w:shd w:fill="1B3A5C" w:val="clear"/>
+            <w:tcMar>
+              <w:top w:type="dxa" w:w="60"/>
+              <w:left w:type="dxa" w:w="100"/>
+              <w:bottom w:type="dxa" w:w="60"/>
+              <w:right w:type="dxa" w:w="100"/>
+            </w:tcMar>
+            <w:vAlign w:val="center"/>
+          </w:tcPr>
+          <w:p>
+            <w:pPr>
+              <w:spacing w:after="0" w:before="0"/>
+              <w:jc w:val="center"/>
+            </w:pPr>
+            <w:r>
+              <w:rPr>
+                <w:rFonts w:ascii="Arial" w:cs="Arial" w:eastAsia="Arial" w:hAnsi="Arial"/>
+                <w:b/>
+                <w:bCs/>
+                <w:color w:val="FFFFFF"/>
+                <w:sz w:val="20"/>
+                <w:szCs w:val="20"/>
+              </w:rPr>
+              <w:t xml:space="preserve">Actual Output</w:t>
+            </w:r>
+          </w:p>
+        </w:tc>
+        <w:tc>
+          <w:tcPr>
+            <w:tcW w:type="dxa" w:w="1000"/>
+            <w:tcBorders>
+              <w:top w:val="single" w:color="B0BEC5" w:sz="1"/>
+              <w:left w:val="single" w:color="B0BEC5" w:sz="1"/>
+              <w:bottom w:val="single" w:color="B0BEC5" w:sz="1"/>
+              <w:right w:val="single" w:color="B0BEC5" w:sz="1"/>
+            </w:tcBorders>
+            <w:shd w:fill="1B3A5C" w:val="clear"/>
+            <w:tcMar>
+              <w:top w:type="dxa" w:w="60"/>
+              <w:left w:type="dxa" w:w="100"/>
+              <w:bottom w:type="dxa" w:w="60"/>
+              <w:right w:type="dxa" w:w="100"/>
+            </w:tcMar>
+            <w:vAlign w:val="center"/>
+          </w:tcPr>
+          <w:p>
+            <w:pPr>
+              <w:spacing w:after="0" w:before="0"/>
+              <w:jc w:val="center"/>
+            </w:pPr>
+            <w:r>
+              <w:rPr>
+                <w:rFonts w:ascii="Arial" w:cs="Arial" w:eastAsia="Arial" w:hAnsi="Arial"/>
+                <w:b/>
+                <w:bCs/>
+                <w:color w:val="FFFFFF"/>
+                <w:sz w:val="20"/>
+                <w:szCs w:val="20"/>
+              </w:rPr>
+              <w:t xml:space="preserve">Result</w:t>
+            </w:r>
+          </w:p>
+        </w:tc>
+      </w:tr>
+      <w:tr>
+        <w:trPr>
+          <w:cantSplit/>
+        </w:trPr>
+        <w:tc>
+          <w:tcPr>
+            <w:tcW w:type="dxa" w:w="500"/>
+            <w:tcBorders>
+              <w:top w:val="single" w:color="B0BEC5" w:sz="1"/>
+              <w:left w:val="single" w:color="B0BEC5" w:sz="1"/>
+              <w:bottom w:val="single" w:color="B0BEC5" w:sz="1"/>
+              <w:right w:val="single" w:color="B0BEC5" w:sz="1"/>
+            </w:tcBorders>
+            <w:shd w:fill="F0F4F8" w:val="clear"/>
+            <w:tcMar>
+              <w:top w:type="dxa" w:w="50"/>
+              <w:left w:type="dxa" w:w="100"/>
+              <w:bottom w:type="dxa" w:w="50"/>
+              <w:right w:type="dxa" w:w="100"/>
+            </w:tcMar>
+            <w:vAlign w:val="center"/>
+          </w:tcPr>
+          <w:p>
+            <w:pPr>
+              <w:spacing w:after="0" w:before="0"/>
+              <w:jc w:val="center"/>
+            </w:pPr>
+            <w:r>
+              <w:rPr>
+                <w:rFonts w:ascii="Arial" w:cs="Arial" w:eastAsia="Arial" w:hAnsi="Arial"/>
+                <w:sz w:val="20"/>
+                <w:szCs w:val="20"/>
+              </w:rPr>
+              <w:t xml:space="preserve">1</w:t>
+            </w:r>
+          </w:p>
+        </w:tc>
+        <w:tc>
+          <w:tcPr>
+            <w:tcW w:type="dxa" w:w="2200"/>
+            <w:tcBorders>
+              <w:top w:val="single" w:color="B0BEC5" w:sz="1"/>
+              <w:left w:val="single" w:color="B0BEC5" w:sz="1"/>
+              <w:bottom w:val="single" w:color="B0BEC5" w:sz="1"/>
+              <w:right w:val="single" w:color="B0BEC5" w:sz="1"/>
+            </w:tcBorders>
+            <w:shd w:fill="F0F4F8" w:val="clear"/>
+            <w:tcMar>
+              <w:top w:type="dxa" w:w="50"/>
+              <w:left w:type="dxa" w:w="100"/>
+              <w:bottom w:type="dxa" w:w="50"/>
+              <w:right w:type="dxa" w:w="100"/>
+            </w:tcMar>
+            <w:vAlign w:val="center"/>
+          </w:tcPr>
+          <w:p>
+            <w:pPr>
+              <w:spacing w:after="0" w:before="0"/>
+              <w:jc w:val="left"/>
+            </w:pPr>
+            <w:r>
+              <w:rPr>
+                <w:rFonts w:ascii="Arial" w:cs="Arial" w:eastAsia="Arial" w:hAnsi="Arial"/>
+                <w:sz w:val="20"/>
+                <w:szCs w:val="20"/>
+              </w:rPr>
+              <w:t xml:space="preserve">Player views own info</w:t>
+            </w:r>
+          </w:p>
+        </w:tc>
+        <w:tc>
+          <w:tcPr>
+            <w:tcW w:type="dxa" w:w="2200"/>
+            <w:tcBorders>
+              <w:top w:val="single" w:color="B0BEC5" w:sz="1"/>
+              <w:left w:val="single" w:color="B0BEC5" w:sz="1"/>
+              <w:bottom w:val="single" w:color="B0BEC5" w:sz="1"/>
+              <w:right w:val="single" w:color="B0BEC5" w:sz="1"/>
+            </w:tcBorders>
+            <w:shd w:fill="F0F4F8" w:val="clear"/>
+            <w:tcMar>
+              <w:top w:type="dxa" w:w="50"/>
+              <w:left w:type="dxa" w:w="100"/>
+              <w:bottom w:type="dxa" w:w="50"/>
+              <w:right w:type="dxa" w:w="100"/>
+            </w:tcMar>
+            <w:vAlign w:val="center"/>
+          </w:tcPr>
+          <w:p>
+            <w:pPr>
+              <w:spacing w:after="0" w:before="0"/>
+              <w:jc w:val="left"/>
+            </w:pPr>
+            <w:r>
+              <w:rPr>
+                <w:rFonts w:ascii="Arial" w:cs="Arial" w:eastAsia="Arial" w:hAnsi="Arial"/>
+                <w:sz w:val="20"/>
+                <w:szCs w:val="20"/>
+              </w:rPr>
+              <w:t xml:space="preserve">login P01, getCurrentUser</w:t>
+            </w:r>
+          </w:p>
+        </w:tc>
+        <w:tc>
+          <w:tcPr>
+            <w:tcW w:type="dxa" w:w="2200"/>
+            <w:tcBorders>
+              <w:top w:val="single" w:color="B0BEC5" w:sz="1"/>
+              <w:left w:val="single" w:color="B0BEC5" w:sz="1"/>
+              <w:bottom w:val="single" w:color="B0BEC5" w:sz="1"/>
+              <w:right w:val="single" w:color="B0BEC5" w:sz="1"/>
+            </w:tcBorders>
+            <w:shd w:fill="F0F4F8" w:val="clear"/>
+            <w:tcMar>
+              <w:top w:type="dxa" w:w="50"/>
+              <w:left w:type="dxa" w:w="100"/>
+              <w:bottom w:type="dxa" w:w="50"/>
+              <w:right w:type="dxa" w:w="100"/>
+            </w:tcMar>
+            <w:vAlign w:val="center"/>
+          </w:tcPr>
+          <w:p>
+            <w:pPr>
+              <w:spacing w:after="0" w:before="0"/>
+              <w:jc w:val="left"/>
+            </w:pPr>
+            <w:r>
+              <w:rPr>
+                <w:rFonts w:ascii="Arial" w:cs="Arial" w:eastAsia="Arial" w:hAnsi="Arial"/>
+                <w:sz w:val="20"/>
+                <w:szCs w:val="20"/>
+              </w:rPr>
+              <w:t xml:space="preserve">id=P01, role=Player</w:t>
+            </w:r>
+          </w:p>
+        </w:tc>
+        <w:tc>
+          <w:tcPr>
+            <w:tcW w:type="dxa" w:w="2200"/>
+            <w:tcBorders>
+              <w:top w:val="single" w:color="B0BEC5" w:sz="1"/>
+              <w:left w:val="single" w:color="B0BEC5" w:sz="1"/>
+              <w:bottom w:val="single" w:color="B0BEC5" w:sz="1"/>
+              <w:right w:val="single" w:color="B0BEC5" w:sz="1"/>
+            </w:tcBorders>
+            <w:shd w:fill="F0F4F8" w:val="clear"/>
+            <w:tcMar>
+              <w:top w:type="dxa" w:w="50"/>
+              <w:left w:type="dxa" w:w="100"/>
+              <w:bottom w:type="dxa" w:w="50"/>
+              <w:right w:type="dxa" w:w="100"/>
+            </w:tcMar>
+            <w:vAlign w:val="center"/>
+          </w:tcPr>
+          <w:p>
+            <w:pPr>
+              <w:spacing w:after="0" w:before="0"/>
+              <w:jc w:val="left"/>
+            </w:pPr>
+            <w:r>
+              <w:rPr>
+                <w:rFonts w:ascii="Arial" w:cs="Arial" w:eastAsia="Arial" w:hAnsi="Arial"/>
+                <w:sz w:val="20"/>
+                <w:szCs w:val="20"/>
+              </w:rPr>
+              <w:t xml:space="preserve">id=P01, role=Player</w:t>
+            </w:r>
+          </w:p>
+        </w:tc>
+        <w:tc>
+          <w:tcPr>
+            <w:tcW w:type="dxa" w:w="1000"/>
+            <w:tcBorders>
+              <w:top w:val="single" w:color="B0BEC5" w:sz="1"/>
+              <w:left w:val="single" w:color="B0BEC5" w:sz="1"/>
+              <w:bottom w:val="single" w:color="B0BEC5" w:sz="1"/>
+              <w:right w:val="single" w:color="B0BEC5" w:sz="1"/>
+            </w:tcBorders>
+            <w:tcMar>
+              <w:top w:type="dxa" w:w="50"/>
+              <w:left w:type="dxa" w:w="100"/>
+              <w:bottom w:type="dxa" w:w="50"/>
+              <w:right w:type="dxa" w:w="100"/>
+            </w:tcMar>
+            <w:vAlign w:val="center"/>
+          </w:tcPr>
+          <w:p>
+            <w:pPr>
+              <w:spacing w:after="0" w:before="0"/>
+              <w:jc w:val="center"/>
+            </w:pPr>
+            <w:r>
+              <w:rPr>
+                <w:rFonts w:ascii="Arial" w:cs="Arial" w:eastAsia="Arial" w:hAnsi="Arial"/>
+                <w:b/>
+                <w:bCs/>
+                <w:color w:val="2E7D32"/>
+                <w:sz w:val="20"/>
+                <w:szCs w:val="20"/>
+              </w:rPr>
+              <w:t xml:space="preserve">PASS</w:t>
+            </w:r>
+          </w:p>
+        </w:tc>
+      </w:tr>
+      <w:tr>
+        <w:trPr>
+          <w:cantSplit/>
+        </w:trPr>
+        <w:tc>
+          <w:tcPr>
+            <w:tcW w:type="dxa" w:w="500"/>
+            <w:tcBorders>
+              <w:top w:val="single" w:color="B0BEC5" w:sz="1"/>
+              <w:left w:val="single" w:color="B0BEC5" w:sz="1"/>
+              <w:bottom w:val="single" w:color="B0BEC5" w:sz="1"/>
+              <w:right w:val="single" w:color="B0BEC5" w:sz="1"/>
+            </w:tcBorders>
+            <w:tcMar>
+              <w:top w:type="dxa" w:w="50"/>
+              <w:left w:type="dxa" w:w="100"/>
+              <w:bottom w:type="dxa" w:w="50"/>
+              <w:right w:type="dxa" w:w="100"/>
+            </w:tcMar>
+            <w:vAlign w:val="center"/>
+          </w:tcPr>
+          <w:p>
+            <w:pPr>
+              <w:spacing w:after="0" w:before="0"/>
+              <w:jc w:val="center"/>
+            </w:pPr>
+            <w:r>
+              <w:rPr>
+                <w:rFonts w:ascii="Arial" w:cs="Arial" w:eastAsia="Arial" w:hAnsi="Arial"/>
+                <w:sz w:val="20"/>
+                <w:szCs w:val="20"/>
+              </w:rPr>
+              <w:t xml:space="preserve">2</w:t>
+            </w:r>
+          </w:p>
+        </w:tc>
+        <w:tc>
+          <w:tcPr>
+            <w:tcW w:type="dxa" w:w="2200"/>
+            <w:tcBorders>
+              <w:top w:val="single" w:color="B0BEC5" w:sz="1"/>
+              <w:left w:val="single" w:color="B0BEC5" w:sz="1"/>
+              <w:bottom w:val="single" w:color="B0BEC5" w:sz="1"/>
+              <w:right w:val="single" w:color="B0BEC5" w:sz="1"/>
+            </w:tcBorders>
+            <w:tcMar>
+              <w:top w:type="dxa" w:w="50"/>
+              <w:left w:type="dxa" w:w="100"/>
+              <w:bottom w:type="dxa" w:w="50"/>
+              <w:right w:type="dxa" w:w="100"/>
+            </w:tcMar>
+            <w:vAlign w:val="center"/>
+          </w:tcPr>
+          <w:p>
+            <w:pPr>
+              <w:spacing w:after="0" w:before="0"/>
+              <w:jc w:val="left"/>
+            </w:pPr>
+            <w:r>
+              <w:rPr>
+                <w:rFonts w:ascii="Arial" w:cs="Arial" w:eastAsia="Arial" w:hAnsi="Arial"/>
+                <w:sz w:val="20"/>
+                <w:szCs w:val="20"/>
+              </w:rPr>
+              <w:t xml:space="preserve">Player changes password</w:t>
+            </w:r>
+          </w:p>
+        </w:tc>
+        <w:tc>
+          <w:tcPr>
+            <w:tcW w:type="dxa" w:w="2200"/>
+            <w:tcBorders>
+              <w:top w:val="single" w:color="B0BEC5" w:sz="1"/>
+              <w:left w:val="single" w:color="B0BEC5" w:sz="1"/>
+              <w:bottom w:val="single" w:color="B0BEC5" w:sz="1"/>
+              <w:right w:val="single" w:color="B0BEC5" w:sz="1"/>
+            </w:tcBorders>
+            <w:tcMar>
+              <w:top w:type="dxa" w:w="50"/>
+              <w:left w:type="dxa" w:w="100"/>
+              <w:bottom w:type="dxa" w:w="50"/>
+              <w:right w:type="dxa" w:w="100"/>
+            </w:tcMar>
+            <w:vAlign w:val="center"/>
+          </w:tcPr>
+          <w:p>
+            <w:pPr>
+              <w:spacing w:after="0" w:before="0"/>
+              <w:jc w:val="left"/>
+            </w:pPr>
+            <w:r>
+              <w:rPr>
+                <w:rFonts w:ascii="Arial" w:cs="Arial" w:eastAsia="Arial" w:hAnsi="Arial"/>
+                <w:sz w:val="20"/>
+                <w:szCs w:val="20"/>
+              </w:rPr>
+              <w:t xml:space="preserve">setPassword + re-login</w:t>
+            </w:r>
+          </w:p>
+        </w:tc>
+        <w:tc>
+          <w:tcPr>
+            <w:tcW w:type="dxa" w:w="2200"/>
+            <w:tcBorders>
+              <w:top w:val="single" w:color="B0BEC5" w:sz="1"/>
+              <w:left w:val="single" w:color="B0BEC5" w:sz="1"/>
+              <w:bottom w:val="single" w:color="B0BEC5" w:sz="1"/>
+              <w:right w:val="single" w:color="B0BEC5" w:sz="1"/>
+            </w:tcBorders>
+            <w:tcMar>
+              <w:top w:type="dxa" w:w="50"/>
+              <w:left w:type="dxa" w:w="100"/>
+              <w:bottom w:type="dxa" w:w="50"/>
+              <w:right w:type="dxa" w:w="100"/>
+            </w:tcMar>
+            <w:vAlign w:val="center"/>
+          </w:tcPr>
+          <w:p>
+            <w:pPr>
+              <w:spacing w:after="0" w:before="0"/>
+              <w:jc w:val="left"/>
+            </w:pPr>
+            <w:r>
+              <w:rPr>
+                <w:rFonts w:ascii="Arial" w:cs="Arial" w:eastAsia="Arial" w:hAnsi="Arial"/>
+                <w:sz w:val="20"/>
+                <w:szCs w:val="20"/>
+              </w:rPr>
+              <w:t xml:space="preserve">re-login success</w:t>
+            </w:r>
+          </w:p>
+        </w:tc>
+        <w:tc>
+          <w:tcPr>
+            <w:tcW w:type="dxa" w:w="2200"/>
+            <w:tcBorders>
+              <w:top w:val="single" w:color="B0BEC5" w:sz="1"/>
+              <w:left w:val="single" w:color="B0BEC5" w:sz="1"/>
+              <w:bottom w:val="single" w:color="B0BEC5" w:sz="1"/>
+              <w:right w:val="single" w:color="B0BEC5" w:sz="1"/>
+            </w:tcBorders>
+            <w:tcMar>
+              <w:top w:type="dxa" w:w="50"/>
+              <w:left w:type="dxa" w:w="100"/>
+              <w:bottom w:type="dxa" w:w="50"/>
+              <w:right w:type="dxa" w:w="100"/>
+            </w:tcMar>
+            <w:vAlign w:val="center"/>
+          </w:tcPr>
+          <w:p>
+            <w:pPr>
+              <w:spacing w:after="0" w:before="0"/>
+              <w:jc w:val="left"/>
+            </w:pPr>
+            <w:r>
+              <w:rPr>
+                <w:rFonts w:ascii="Arial" w:cs="Arial" w:eastAsia="Arial" w:hAnsi="Arial"/>
+                <w:sz w:val="20"/>
+                <w:szCs w:val="20"/>
+              </w:rPr>
+              <w:t xml:space="preserve">re-login success</w:t>
+            </w:r>
+          </w:p>
+        </w:tc>
+        <w:tc>
+          <w:tcPr>
+            <w:tcW w:type="dxa" w:w="1000"/>
+            <w:tcBorders>
+              <w:top w:val="single" w:color="B0BEC5" w:sz="1"/>
+              <w:left w:val="single" w:color="B0BEC5" w:sz="1"/>
+              <w:bottom w:val="single" w:color="B0BEC5" w:sz="1"/>
+              <w:right w:val="single" w:color="B0BEC5" w:sz="1"/>
+            </w:tcBorders>
+            <w:tcMar>
+              <w:top w:type="dxa" w:w="50"/>
+              <w:left w:type="dxa" w:w="100"/>
+              <w:bottom w:type="dxa" w:w="50"/>
+              <w:right w:type="dxa" w:w="100"/>
+            </w:tcMar>
+            <w:vAlign w:val="center"/>
+          </w:tcPr>
+          <w:p>
+            <w:pPr>
+              <w:spacing w:after="0" w:before="0"/>
+              <w:jc w:val="center"/>
+            </w:pPr>
+            <w:r>
+              <w:rPr>
+                <w:rFonts w:ascii="Arial" w:cs="Arial" w:eastAsia="Arial" w:hAnsi="Arial"/>
+                <w:b/>
+                <w:bCs/>
+                <w:color w:val="2E7D32"/>
+                <w:sz w:val="20"/>
+                <w:szCs w:val="20"/>
+              </w:rPr>
+              <w:t xml:space="preserve">PASS</w:t>
+            </w:r>
+          </w:p>
+        </w:tc>
+      </w:tr>
+      <w:tr>
+        <w:trPr>
+          <w:cantSplit/>
+        </w:trPr>
+        <w:tc>
+          <w:tcPr>
+            <w:tcW w:type="dxa" w:w="500"/>
+            <w:tcBorders>
+              <w:top w:val="single" w:color="B0BEC5" w:sz="1"/>
+              <w:left w:val="single" w:color="B0BEC5" w:sz="1"/>
+              <w:bottom w:val="single" w:color="B0BEC5" w:sz="1"/>
+              <w:right w:val="single" w:color="B0BEC5" w:sz="1"/>
+            </w:tcBorders>
+            <w:shd w:fill="F0F4F8" w:val="clear"/>
+            <w:tcMar>
+              <w:top w:type="dxa" w:w="50"/>
+              <w:left w:type="dxa" w:w="100"/>
+              <w:bottom w:type="dxa" w:w="50"/>
+              <w:right w:type="dxa" w:w="100"/>
+            </w:tcMar>
+            <w:vAlign w:val="center"/>
+          </w:tcPr>
+          <w:p>
+            <w:pPr>
+              <w:spacing w:after="0" w:before="0"/>
+              <w:jc w:val="center"/>
+            </w:pPr>
+            <w:r>
+              <w:rPr>
+                <w:rFonts w:ascii="Arial" w:cs="Arial" w:eastAsia="Arial" w:hAnsi="Arial"/>
+                <w:sz w:val="20"/>
+                <w:szCs w:val="20"/>
+              </w:rPr>
+              <w:t xml:space="preserve">3</w:t>
+            </w:r>
+          </w:p>
+        </w:tc>
+        <w:tc>
+          <w:tcPr>
+            <w:tcW w:type="dxa" w:w="2200"/>
+            <w:tcBorders>
+              <w:top w:val="single" w:color="B0BEC5" w:sz="1"/>
+              <w:left w:val="single" w:color="B0BEC5" w:sz="1"/>
+              <w:bottom w:val="single" w:color="B0BEC5" w:sz="1"/>
+              <w:right w:val="single" w:color="B0BEC5" w:sz="1"/>
+            </w:tcBorders>
+            <w:shd w:fill="F0F4F8" w:val="clear"/>
+            <w:tcMar>
+              <w:top w:type="dxa" w:w="50"/>
+              <w:left w:type="dxa" w:w="100"/>
+              <w:bottom w:type="dxa" w:w="50"/>
+              <w:right w:type="dxa" w:w="100"/>
+            </w:tcMar>
+            <w:vAlign w:val="center"/>
+          </w:tcPr>
+          <w:p>
+            <w:pPr>
+              <w:spacing w:after="0" w:before="0"/>
+              <w:jc w:val="left"/>
+            </w:pPr>
+            <w:r>
+              <w:rPr>
+                <w:rFonts w:ascii="Arial" w:cs="Arial" w:eastAsia="Arial" w:hAnsi="Arial"/>
+                <w:sz w:val="20"/>
+                <w:szCs w:val="20"/>
+              </w:rPr>
+              <w:t xml:space="preserve">Player role check</w:t>
+            </w:r>
+          </w:p>
+        </w:tc>
+        <w:tc>
+          <w:tcPr>
+            <w:tcW w:type="dxa" w:w="2200"/>
+            <w:tcBorders>
+              <w:top w:val="single" w:color="B0BEC5" w:sz="1"/>
+              <w:left w:val="single" w:color="B0BEC5" w:sz="1"/>
+              <w:bottom w:val="single" w:color="B0BEC5" w:sz="1"/>
+              <w:right w:val="single" w:color="B0BEC5" w:sz="1"/>
+            </w:tcBorders>
+            <w:shd w:fill="F0F4F8" w:val="clear"/>
+            <w:tcMar>
+              <w:top w:type="dxa" w:w="50"/>
+              <w:left w:type="dxa" w:w="100"/>
+              <w:bottom w:type="dxa" w:w="50"/>
+              <w:right w:type="dxa" w:w="100"/>
+            </w:tcMar>
+            <w:vAlign w:val="center"/>
+          </w:tcPr>
+          <w:p>
+            <w:pPr>
+              <w:spacing w:after="0" w:before="0"/>
+              <w:jc w:val="left"/>
+            </w:pPr>
+            <w:r>
+              <w:rPr>
+                <w:rFonts w:ascii="Arial" w:cs="Arial" w:eastAsia="Arial" w:hAnsi="Arial"/>
+                <w:sz w:val="20"/>
+                <w:szCs w:val="20"/>
+              </w:rPr>
+              <w:t xml:space="preserve">currentUserIsAdmin()</w:t>
+            </w:r>
+          </w:p>
+        </w:tc>
+        <w:tc>
+          <w:tcPr>
+            <w:tcW w:type="dxa" w:w="2200"/>
+            <w:tcBorders>
+              <w:top w:val="single" w:color="B0BEC5" w:sz="1"/>
+              <w:left w:val="single" w:color="B0BEC5" w:sz="1"/>
+              <w:bottom w:val="single" w:color="B0BEC5" w:sz="1"/>
+              <w:right w:val="single" w:color="B0BEC5" w:sz="1"/>
+            </w:tcBorders>
+            <w:shd w:fill="F0F4F8" w:val="clear"/>
+            <w:tcMar>
+              <w:top w:type="dxa" w:w="50"/>
+              <w:left w:type="dxa" w:w="100"/>
+              <w:bottom w:type="dxa" w:w="50"/>
+              <w:right w:type="dxa" w:w="100"/>
+            </w:tcMar>
+            <w:vAlign w:val="center"/>
+          </w:tcPr>
+          <w:p>
+            <w:pPr>
+              <w:spacing w:after="0" w:before="0"/>
+              <w:jc w:val="left"/>
+            </w:pPr>
+            <w:r>
+              <w:rPr>
+                <w:rFonts w:ascii="Arial" w:cs="Arial" w:eastAsia="Arial" w:hAnsi="Arial"/>
+                <w:sz w:val="20"/>
+                <w:szCs w:val="20"/>
+              </w:rPr>
+              <w:t xml:space="preserve">false</w:t>
+            </w:r>
+          </w:p>
+        </w:tc>
+        <w:tc>
+          <w:tcPr>
+            <w:tcW w:type="dxa" w:w="2200"/>
+            <w:tcBorders>
+              <w:top w:val="single" w:color="B0BEC5" w:sz="1"/>
+              <w:left w:val="single" w:color="B0BEC5" w:sz="1"/>
+              <w:bottom w:val="single" w:color="B0BEC5" w:sz="1"/>
+              <w:right w:val="single" w:color="B0BEC5" w:sz="1"/>
+            </w:tcBorders>
+            <w:shd w:fill="F0F4F8" w:val="clear"/>
+            <w:tcMar>
+              <w:top w:type="dxa" w:w="50"/>
+              <w:left w:type="dxa" w:w="100"/>
+              <w:bottom w:type="dxa" w:w="50"/>
+              <w:right w:type="dxa" w:w="100"/>
+            </w:tcMar>
+            <w:vAlign w:val="center"/>
+          </w:tcPr>
+          <w:p>
+            <w:pPr>
+              <w:spacing w:after="0" w:before="0"/>
+              <w:jc w:val="left"/>
+            </w:pPr>
+            <w:r>
+              <w:rPr>
+                <w:rFonts w:ascii="Arial" w:cs="Arial" w:eastAsia="Arial" w:hAnsi="Arial"/>
+                <w:sz w:val="20"/>
+                <w:szCs w:val="20"/>
+              </w:rPr>
+              <w:t xml:space="preserve">false</w:t>
+            </w:r>
+          </w:p>
+        </w:tc>
+        <w:tc>
+          <w:tcPr>
+            <w:tcW w:type="dxa" w:w="1000"/>
+            <w:tcBorders>
+              <w:top w:val="single" w:color="B0BEC5" w:sz="1"/>
+              <w:left w:val="single" w:color="B0BEC5" w:sz="1"/>
+              <w:bottom w:val="single" w:color="B0BEC5" w:sz="1"/>
+              <w:right w:val="single" w:color="B0BEC5" w:sz="1"/>
+            </w:tcBorders>
+            <w:tcMar>
+              <w:top w:type="dxa" w:w="50"/>
+              <w:left w:type="dxa" w:w="100"/>
+              <w:bottom w:type="dxa" w:w="50"/>
+              <w:right w:type="dxa" w:w="100"/>
+            </w:tcMar>
+            <w:vAlign w:val="center"/>
+          </w:tcPr>
+          <w:p>
+            <w:pPr>
+              <w:spacing w:after="0" w:before="0"/>
+              <w:jc w:val="center"/>
+            </w:pPr>
+            <w:r>
+              <w:rPr>
+                <w:rFonts w:ascii="Arial" w:cs="Arial" w:eastAsia="Arial" w:hAnsi="Arial"/>
+                <w:b/>
+                <w:bCs/>
+                <w:color w:val="2E7D32"/>
+                <w:sz w:val="20"/>
+                <w:szCs w:val="20"/>
+              </w:rPr>
+              <w:t xml:space="preserve">PASS</w:t>
+            </w:r>
+          </w:p>
+        </w:tc>
+      </w:tr>
+      <w:tr>
+        <w:trPr>
+          <w:cantSplit/>
+        </w:trPr>
+        <w:tc>
+          <w:tcPr>
+            <w:tcW w:type="dxa" w:w="500"/>
+            <w:tcBorders>
+              <w:top w:val="single" w:color="B0BEC5" w:sz="1"/>
+              <w:left w:val="single" w:color="B0BEC5" w:sz="1"/>
+              <w:bottom w:val="single" w:color="B0BEC5" w:sz="1"/>
+              <w:right w:val="single" w:color="B0BEC5" w:sz="1"/>
+            </w:tcBorders>
+            <w:tcMar>
+              <w:top w:type="dxa" w:w="50"/>
+              <w:left w:type="dxa" w:w="100"/>
+              <w:bottom w:type="dxa" w:w="50"/>
+              <w:right w:type="dxa" w:w="100"/>
+            </w:tcMar>
+            <w:vAlign w:val="center"/>
+          </w:tcPr>
+          <w:p>
+            <w:pPr>
+              <w:spacing w:after="0" w:before="0"/>
+              <w:jc w:val="center"/>
+            </w:pPr>
+            <w:r>
+              <w:rPr>
+                <w:rFonts w:ascii="Arial" w:cs="Arial" w:eastAsia="Arial" w:hAnsi="Arial"/>
+                <w:sz w:val="20"/>
+                <w:szCs w:val="20"/>
+              </w:rPr>
+              <w:t xml:space="preserve">4</w:t>
+            </w:r>
+          </w:p>
+        </w:tc>
+        <w:tc>
+          <w:tcPr>
+            <w:tcW w:type="dxa" w:w="2200"/>
+            <w:tcBorders>
+              <w:top w:val="single" w:color="B0BEC5" w:sz="1"/>
+              <w:left w:val="single" w:color="B0BEC5" w:sz="1"/>
+              <w:bottom w:val="single" w:color="B0BEC5" w:sz="1"/>
+              <w:right w:val="single" w:color="B0BEC5" w:sz="1"/>
+            </w:tcBorders>
+            <w:tcMar>
+              <w:top w:type="dxa" w:w="50"/>
+              <w:left w:type="dxa" w:w="100"/>
+              <w:bottom w:type="dxa" w:w="50"/>
+              <w:right w:type="dxa" w:w="100"/>
+            </w:tcMar>
+            <w:vAlign w:val="center"/>
+          </w:tcPr>
+          <w:p>
+            <w:pPr>
+              <w:spacing w:after="0" w:before="0"/>
+              <w:jc w:val="left"/>
+            </w:pPr>
+            <w:r>
+              <w:rPr>
+                <w:rFonts w:ascii="Arial" w:cs="Arial" w:eastAsia="Arial" w:hAnsi="Arial"/>
+                <w:sz w:val="20"/>
+                <w:szCs w:val="20"/>
+              </w:rPr>
+              <w:t xml:space="preserve">Player views own heroes</w:t>
+            </w:r>
+          </w:p>
+        </w:tc>
+        <w:tc>
+          <w:tcPr>
+            <w:tcW w:type="dxa" w:w="2200"/>
+            <w:tcBorders>
+              <w:top w:val="single" w:color="B0BEC5" w:sz="1"/>
+              <w:left w:val="single" w:color="B0BEC5" w:sz="1"/>
+              <w:bottom w:val="single" w:color="B0BEC5" w:sz="1"/>
+              <w:right w:val="single" w:color="B0BEC5" w:sz="1"/>
+            </w:tcBorders>
+            <w:tcMar>
+              <w:top w:type="dxa" w:w="50"/>
+              <w:left w:type="dxa" w:w="100"/>
+              <w:bottom w:type="dxa" w:w="50"/>
+              <w:right w:type="dxa" w:w="100"/>
+            </w:tcMar>
+            <w:vAlign w:val="center"/>
+          </w:tcPr>
+          <w:p>
+            <w:pPr>
+              <w:spacing w:after="0" w:before="0"/>
+              <w:jc w:val="left"/>
+            </w:pPr>
+            <w:r>
+              <w:rPr>
+                <w:rFonts w:ascii="Arial" w:cs="Arial" w:eastAsia="Arial" w:hAnsi="Arial"/>
+                <w:sz w:val="20"/>
+                <w:szCs w:val="20"/>
+              </w:rPr>
+              <w:t xml:space="preserve">getHeroes()</w:t>
+            </w:r>
+          </w:p>
+        </w:tc>
+        <w:tc>
+          <w:tcPr>
+            <w:tcW w:type="dxa" w:w="2200"/>
+            <w:tcBorders>
+              <w:top w:val="single" w:color="B0BEC5" w:sz="1"/>
+              <w:left w:val="single" w:color="B0BEC5" w:sz="1"/>
+              <w:bottom w:val="single" w:color="B0BEC5" w:sz="1"/>
+              <w:right w:val="single" w:color="B0BEC5" w:sz="1"/>
+            </w:tcBorders>
+            <w:tcMar>
+              <w:top w:type="dxa" w:w="50"/>
+              <w:left w:type="dxa" w:w="100"/>
+              <w:bottom w:type="dxa" w:w="50"/>
+              <w:right w:type="dxa" w:w="100"/>
+            </w:tcMar>
+            <w:vAlign w:val="center"/>
+          </w:tcPr>
+          <w:p>
+            <w:pPr>
+              <w:spacing w:after="0" w:before="0"/>
+              <w:jc w:val="left"/>
+            </w:pPr>
+            <w:r>
+              <w:rPr>
+                <w:rFonts w:ascii="Arial" w:cs="Arial" w:eastAsia="Arial" w:hAnsi="Arial"/>
+                <w:sz w:val="20"/>
+                <w:szCs w:val="20"/>
+              </w:rPr>
+              <w:t xml:space="preserve">2 heroes</w:t>
+            </w:r>
+          </w:p>
+        </w:tc>
+        <w:tc>
+          <w:tcPr>
+            <w:tcW w:type="dxa" w:w="2200"/>
+            <w:tcBorders>
+              <w:top w:val="single" w:color="B0BEC5" w:sz="1"/>
+              <w:left w:val="single" w:color="B0BEC5" w:sz="1"/>
+              <w:bottom w:val="single" w:color="B0BEC5" w:sz="1"/>
+              <w:right w:val="single" w:color="B0BEC5" w:sz="1"/>
+            </w:tcBorders>
+            <w:tcMar>
+              <w:top w:type="dxa" w:w="50"/>
+              <w:left w:type="dxa" w:w="100"/>
+              <w:bottom w:type="dxa" w:w="50"/>
+              <w:right w:type="dxa" w:w="100"/>
+            </w:tcMar>
+            <w:vAlign w:val="center"/>
+          </w:tcPr>
+          <w:p>
+            <w:pPr>
+              <w:spacing w:after="0" w:before="0"/>
+              <w:jc w:val="left"/>
+            </w:pPr>
+            <w:r>
+              <w:rPr>
+                <w:rFonts w:ascii="Arial" w:cs="Arial" w:eastAsia="Arial" w:hAnsi="Arial"/>
+                <w:sz w:val="20"/>
+                <w:szCs w:val="20"/>
+              </w:rPr>
+              <w:t xml:space="preserve">2 heroes</w:t>
+            </w:r>
+          </w:p>
+        </w:tc>
+        <w:tc>
+          <w:tcPr>
+            <w:tcW w:type="dxa" w:w="1000"/>
+            <w:tcBorders>
+              <w:top w:val="single" w:color="B0BEC5" w:sz="1"/>
+              <w:left w:val="single" w:color="B0BEC5" w:sz="1"/>
+              <w:bottom w:val="single" w:color="B0BEC5" w:sz="1"/>
+              <w:right w:val="single" w:color="B0BEC5" w:sz="1"/>
+            </w:tcBorders>
+            <w:tcMar>
+              <w:top w:type="dxa" w:w="50"/>
+              <w:left w:type="dxa" w:w="100"/>
+              <w:bottom w:type="dxa" w:w="50"/>
+              <w:right w:type="dxa" w:w="100"/>
+            </w:tcMar>
+            <w:vAlign w:val="center"/>
+          </w:tcPr>
+          <w:p>
+            <w:pPr>
+              <w:spacing w:after="0" w:before="0"/>
+              <w:jc w:val="center"/>
+            </w:pPr>
+            <w:r>
+              <w:rPr>
+                <w:rFonts w:ascii="Arial" w:cs="Arial" w:eastAsia="Arial" w:hAnsi="Arial"/>
+                <w:b/>
+                <w:bCs/>
+                <w:color w:val="2E7D32"/>
+                <w:sz w:val="20"/>
+                <w:szCs w:val="20"/>
+              </w:rPr>
+              <w:t xml:space="preserve">PASS</w:t>
+            </w:r>
+          </w:p>
+        </w:tc>
+      </w:tr>
+      <w:tr>
+        <w:trPr>
+          <w:cantSplit/>
+        </w:trPr>
+        <w:tc>
+          <w:tcPr>
+            <w:tcW w:type="dxa" w:w="500"/>
+            <w:tcBorders>
+              <w:top w:val="single" w:color="B0BEC5" w:sz="1"/>
+              <w:left w:val="single" w:color="B0BEC5" w:sz="1"/>
+              <w:bottom w:val="single" w:color="B0BEC5" w:sz="1"/>
+              <w:right w:val="single" w:color="B0BEC5" w:sz="1"/>
+            </w:tcBorders>
+            <w:shd w:fill="F0F4F8" w:val="clear"/>
+            <w:tcMar>
+              <w:top w:type="dxa" w:w="50"/>
+              <w:left w:type="dxa" w:w="100"/>
+              <w:bottom w:type="dxa" w:w="50"/>
+              <w:right w:type="dxa" w:w="100"/>
+            </w:tcMar>
+            <w:vAlign w:val="center"/>
+          </w:tcPr>
+          <w:p>
+            <w:pPr>
+              <w:spacing w:after="0" w:before="0"/>
+              <w:jc w:val="center"/>
+            </w:pPr>
+            <w:r>
+              <w:rPr>
+                <w:rFonts w:ascii="Arial" w:cs="Arial" w:eastAsia="Arial" w:hAnsi="Arial"/>
+                <w:sz w:val="20"/>
+                <w:szCs w:val="20"/>
+              </w:rPr>
+              <w:t xml:space="preserve">5</w:t>
+            </w:r>
+          </w:p>
+        </w:tc>
+        <w:tc>
+          <w:tcPr>
+            <w:tcW w:type="dxa" w:w="2200"/>
+            <w:tcBorders>
+              <w:top w:val="single" w:color="B0BEC5" w:sz="1"/>
+              <w:left w:val="single" w:color="B0BEC5" w:sz="1"/>
+              <w:bottom w:val="single" w:color="B0BEC5" w:sz="1"/>
+              <w:right w:val="single" w:color="B0BEC5" w:sz="1"/>
+            </w:tcBorders>
+            <w:shd w:fill="F0F4F8" w:val="clear"/>
+            <w:tcMar>
+              <w:top w:type="dxa" w:w="50"/>
+              <w:left w:type="dxa" w:w="100"/>
+              <w:bottom w:type="dxa" w:w="50"/>
+              <w:right w:type="dxa" w:w="100"/>
+            </w:tcMar>
+            <w:vAlign w:val="center"/>
+          </w:tcPr>
+          <w:p>
+            <w:pPr>
+              <w:spacing w:after="0" w:before="0"/>
+              <w:jc w:val="left"/>
+            </w:pPr>
+            <w:r>
+              <w:rPr>
+                <w:rFonts w:ascii="Arial" w:cs="Arial" w:eastAsia="Arial" w:hAnsi="Arial"/>
+                <w:sz w:val="20"/>
+                <w:szCs w:val="20"/>
+              </w:rPr>
+              <w:t xml:space="preserve">Player views team info</w:t>
+            </w:r>
+          </w:p>
+        </w:tc>
+        <w:tc>
+          <w:tcPr>
+            <w:tcW w:type="dxa" w:w="2200"/>
+            <w:tcBorders>
+              <w:top w:val="single" w:color="B0BEC5" w:sz="1"/>
+              <w:left w:val="single" w:color="B0BEC5" w:sz="1"/>
+              <w:bottom w:val="single" w:color="B0BEC5" w:sz="1"/>
+              <w:right w:val="single" w:color="B0BEC5" w:sz="1"/>
+            </w:tcBorders>
+            <w:shd w:fill="F0F4F8" w:val="clear"/>
+            <w:tcMar>
+              <w:top w:type="dxa" w:w="50"/>
+              <w:left w:type="dxa" w:w="100"/>
+              <w:bottom w:type="dxa" w:w="50"/>
+              <w:right w:type="dxa" w:w="100"/>
+            </w:tcMar>
+            <w:vAlign w:val="center"/>
+          </w:tcPr>
+          <w:p>
+            <w:pPr>
+              <w:spacing w:after="0" w:before="0"/>
+              <w:jc w:val="left"/>
+            </w:pPr>
+            <w:r>
+              <w:rPr>
+                <w:rFonts w:ascii="Arial" w:cs="Arial" w:eastAsia="Arial" w:hAnsi="Arial"/>
+                <w:sz w:val="20"/>
+                <w:szCs w:val="20"/>
+              </w:rPr>
+              <w:t xml:space="preserve">getTeam()</w:t>
+            </w:r>
+          </w:p>
+        </w:tc>
+        <w:tc>
+          <w:tcPr>
+            <w:tcW w:type="dxa" w:w="2200"/>
+            <w:tcBorders>
+              <w:top w:val="single" w:color="B0BEC5" w:sz="1"/>
+              <w:left w:val="single" w:color="B0BEC5" w:sz="1"/>
+              <w:bottom w:val="single" w:color="B0BEC5" w:sz="1"/>
+              <w:right w:val="single" w:color="B0BEC5" w:sz="1"/>
+            </w:tcBorders>
+            <w:shd w:fill="F0F4F8" w:val="clear"/>
+            <w:tcMar>
+              <w:top w:type="dxa" w:w="50"/>
+              <w:left w:type="dxa" w:w="100"/>
+              <w:bottom w:type="dxa" w:w="50"/>
+              <w:right w:type="dxa" w:w="100"/>
+            </w:tcMar>
+            <w:vAlign w:val="center"/>
+          </w:tcPr>
+          <w:p>
+            <w:pPr>
+              <w:spacing w:after="0" w:before="0"/>
+              <w:jc w:val="left"/>
+            </w:pPr>
+            <w:r>
+              <w:rPr>
+                <w:rFonts w:ascii="Arial" w:cs="Arial" w:eastAsia="Arial" w:hAnsi="Arial"/>
+                <w:sz w:val="20"/>
+                <w:szCs w:val="20"/>
+              </w:rPr>
+              <w:t xml:space="preserve">Dragon Riders</w:t>
+            </w:r>
+          </w:p>
+        </w:tc>
+        <w:tc>
+          <w:tcPr>
+            <w:tcW w:type="dxa" w:w="2200"/>
+            <w:tcBorders>
+              <w:top w:val="single" w:color="B0BEC5" w:sz="1"/>
+              <w:left w:val="single" w:color="B0BEC5" w:sz="1"/>
+              <w:bottom w:val="single" w:color="B0BEC5" w:sz="1"/>
+              <w:right w:val="single" w:color="B0BEC5" w:sz="1"/>
+            </w:tcBorders>
+            <w:shd w:fill="F0F4F8" w:val="clear"/>
+            <w:tcMar>
+              <w:top w:type="dxa" w:w="50"/>
+              <w:left w:type="dxa" w:w="100"/>
+              <w:bottom w:type="dxa" w:w="50"/>
+              <w:right w:type="dxa" w:w="100"/>
+            </w:tcMar>
+            <w:vAlign w:val="center"/>
+          </w:tcPr>
+          <w:p>
+            <w:pPr>
+              <w:spacing w:after="0" w:before="0"/>
+              <w:jc w:val="left"/>
+            </w:pPr>
+            <w:r>
+              <w:rPr>
+                <w:rFonts w:ascii="Arial" w:cs="Arial" w:eastAsia="Arial" w:hAnsi="Arial"/>
+                <w:sz w:val="20"/>
+                <w:szCs w:val="20"/>
+              </w:rPr>
+              <w:t xml:space="preserve">Dragon Riders</w:t>
+            </w:r>
+          </w:p>
+        </w:tc>
+        <w:tc>
+          <w:tcPr>
+            <w:tcW w:type="dxa" w:w="1000"/>
+            <w:tcBorders>
+              <w:top w:val="single" w:color="B0BEC5" w:sz="1"/>
+              <w:left w:val="single" w:color="B0BEC5" w:sz="1"/>
+              <w:bottom w:val="single" w:color="B0BEC5" w:sz="1"/>
+              <w:right w:val="single" w:color="B0BEC5" w:sz="1"/>
+            </w:tcBorders>
+            <w:tcMar>
+              <w:top w:type="dxa" w:w="50"/>
+              <w:left w:type="dxa" w:w="100"/>
+              <w:bottom w:type="dxa" w:w="50"/>
+              <w:right w:type="dxa" w:w="100"/>
+            </w:tcMar>
+            <w:vAlign w:val="center"/>
+          </w:tcPr>
+          <w:p>
+            <w:pPr>
+              <w:spacing w:after="0" w:before="0"/>
+              <w:jc w:val="center"/>
+            </w:pPr>
+            <w:r>
+              <w:rPr>
+                <w:rFonts w:ascii="Arial" w:cs="Arial" w:eastAsia="Arial" w:hAnsi="Arial"/>
+                <w:b/>
+                <w:bCs/>
+                <w:color w:val="2E7D32"/>
+                <w:sz w:val="20"/>
+                <w:szCs w:val="20"/>
+              </w:rPr>
+              <w:t xml:space="preserve">PASS</w:t>
+            </w:r>
+          </w:p>
+        </w:tc>
+      </w:tr>
+      <w:tr>
+        <w:trPr>
+          <w:cantSplit/>
+        </w:trPr>
+        <w:tc>
+          <w:tcPr>
+            <w:tcW w:type="dxa" w:w="500"/>
+            <w:tcBorders>
+              <w:top w:val="single" w:color="B0BEC5" w:sz="1"/>
+              <w:left w:val="single" w:color="B0BEC5" w:sz="1"/>
+              <w:bottom w:val="single" w:color="B0BEC5" w:sz="1"/>
+              <w:right w:val="single" w:color="B0BEC5" w:sz="1"/>
+            </w:tcBorders>
+            <w:tcMar>
+              <w:top w:type="dxa" w:w="50"/>
+              <w:left w:type="dxa" w:w="100"/>
+              <w:bottom w:type="dxa" w:w="50"/>
+              <w:right w:type="dxa" w:w="100"/>
+            </w:tcMar>
+            <w:vAlign w:val="center"/>
+          </w:tcPr>
+          <w:p>
+            <w:pPr>
+              <w:spacing w:after="0" w:before="0"/>
+              <w:jc w:val="center"/>
+            </w:pPr>
+            <w:r>
+              <w:rPr>
+                <w:rFonts w:ascii="Arial" w:cs="Arial" w:eastAsia="Arial" w:hAnsi="Arial"/>
+                <w:sz w:val="20"/>
+                <w:szCs w:val="20"/>
+              </w:rPr>
+              <w:t xml:space="preserve">6</w:t>
+            </w:r>
+          </w:p>
+        </w:tc>
+        <w:tc>
+          <w:tcPr>
+            <w:tcW w:type="dxa" w:w="2200"/>
+            <w:tcBorders>
+              <w:top w:val="single" w:color="B0BEC5" w:sz="1"/>
+              <w:left w:val="single" w:color="B0BEC5" w:sz="1"/>
+              <w:bottom w:val="single" w:color="B0BEC5" w:sz="1"/>
+              <w:right w:val="single" w:color="B0BEC5" w:sz="1"/>
+            </w:tcBorders>
+            <w:tcMar>
+              <w:top w:type="dxa" w:w="50"/>
+              <w:left w:type="dxa" w:w="100"/>
+              <w:bottom w:type="dxa" w:w="50"/>
+              <w:right w:type="dxa" w:w="100"/>
+            </w:tcMar>
+            <w:vAlign w:val="center"/>
+          </w:tcPr>
+          <w:p>
+            <w:pPr>
+              <w:spacing w:after="0" w:before="0"/>
+              <w:jc w:val="left"/>
+            </w:pPr>
+            <w:r>
+              <w:rPr>
+                <w:rFonts w:ascii="Arial" w:cs="Arial" w:eastAsia="Arial" w:hAnsi="Arial"/>
+                <w:sz w:val="20"/>
+                <w:szCs w:val="20"/>
+              </w:rPr>
+              <w:t xml:space="preserve">Unauthenticated no access</w:t>
+            </w:r>
+          </w:p>
+        </w:tc>
+        <w:tc>
+          <w:tcPr>
+            <w:tcW w:type="dxa" w:w="2200"/>
+            <w:tcBorders>
+              <w:top w:val="single" w:color="B0BEC5" w:sz="1"/>
+              <w:left w:val="single" w:color="B0BEC5" w:sz="1"/>
+              <w:bottom w:val="single" w:color="B0BEC5" w:sz="1"/>
+              <w:right w:val="single" w:color="B0BEC5" w:sz="1"/>
+            </w:tcBorders>
+            <w:tcMar>
+              <w:top w:type="dxa" w:w="50"/>
+              <w:left w:type="dxa" w:w="100"/>
+              <w:bottom w:type="dxa" w:w="50"/>
+              <w:right w:type="dxa" w:w="100"/>
+            </w:tcMar>
+            <w:vAlign w:val="center"/>
+          </w:tcPr>
+          <w:p>
+            <w:pPr>
+              <w:spacing w:after="0" w:before="0"/>
+              <w:jc w:val="left"/>
+            </w:pPr>
+            <w:r>
+              <w:rPr>
+                <w:rFonts w:ascii="Arial" w:cs="Arial" w:eastAsia="Arial" w:hAnsi="Arial"/>
+                <w:sz w:val="20"/>
+                <w:szCs w:val="20"/>
+              </w:rPr>
+              <w:t xml:space="preserve">logout, getCurrentUser</w:t>
+            </w:r>
+          </w:p>
+        </w:tc>
+        <w:tc>
+          <w:tcPr>
+            <w:tcW w:type="dxa" w:w="2200"/>
+            <w:tcBorders>
+              <w:top w:val="single" w:color="B0BEC5" w:sz="1"/>
+              <w:left w:val="single" w:color="B0BEC5" w:sz="1"/>
+              <w:bottom w:val="single" w:color="B0BEC5" w:sz="1"/>
+              <w:right w:val="single" w:color="B0BEC5" w:sz="1"/>
+            </w:tcBorders>
+            <w:tcMar>
+              <w:top w:type="dxa" w:w="50"/>
+              <w:left w:type="dxa" w:w="100"/>
+              <w:bottom w:type="dxa" w:w="50"/>
+              <w:right w:type="dxa" w:w="100"/>
+            </w:tcMar>
+            <w:vAlign w:val="center"/>
+          </w:tcPr>
+          <w:p>
+            <w:pPr>
+              <w:spacing w:after="0" w:before="0"/>
+              <w:jc w:val="left"/>
+            </w:pPr>
+            <w:r>
+              <w:rPr>
+                <w:rFonts w:ascii="Arial" w:cs="Arial" w:eastAsia="Arial" w:hAnsi="Arial"/>
+                <w:sz w:val="20"/>
+                <w:szCs w:val="20"/>
+              </w:rPr>
+              <w:t xml:space="preserve">null</w:t>
+            </w:r>
+          </w:p>
+        </w:tc>
+        <w:tc>
+          <w:tcPr>
+            <w:tcW w:type="dxa" w:w="2200"/>
+            <w:tcBorders>
+              <w:top w:val="single" w:color="B0BEC5" w:sz="1"/>
+              <w:left w:val="single" w:color="B0BEC5" w:sz="1"/>
+              <w:bottom w:val="single" w:color="B0BEC5" w:sz="1"/>
+              <w:right w:val="single" w:color="B0BEC5" w:sz="1"/>
+            </w:tcBorders>
+            <w:tcMar>
+              <w:top w:type="dxa" w:w="50"/>
+              <w:left w:type="dxa" w:w="100"/>
+              <w:bottom w:type="dxa" w:w="50"/>
+              <w:right w:type="dxa" w:w="100"/>
+            </w:tcMar>
+            <w:vAlign w:val="center"/>
+          </w:tcPr>
+          <w:p>
+            <w:pPr>
+              <w:spacing w:after="0" w:before="0"/>
+              <w:jc w:val="left"/>
+            </w:pPr>
+            <w:r>
+              <w:rPr>
+                <w:rFonts w:ascii="Arial" w:cs="Arial" w:eastAsia="Arial" w:hAnsi="Arial"/>
+                <w:sz w:val="20"/>
+                <w:szCs w:val="20"/>
+              </w:rPr>
+              <w:t xml:space="preserve">null</w:t>
+            </w:r>
+          </w:p>
+        </w:tc>
+        <w:tc>
+          <w:tcPr>
+            <w:tcW w:type="dxa" w:w="1000"/>
+            <w:tcBorders>
+              <w:top w:val="single" w:color="B0BEC5" w:sz="1"/>
+              <w:left w:val="single" w:color="B0BEC5" w:sz="1"/>
+              <w:bottom w:val="single" w:color="B0BEC5" w:sz="1"/>
+              <w:right w:val="single" w:color="B0BEC5" w:sz="1"/>
+            </w:tcBorders>
+            <w:tcMar>
+              <w:top w:type="dxa" w:w="50"/>
+              <w:left w:type="dxa" w:w="100"/>
+              <w:bottom w:type="dxa" w:w="50"/>
+              <w:right w:type="dxa" w:w="100"/>
+            </w:tcMar>
+            <w:vAlign w:val="center"/>
+          </w:tcPr>
+          <w:p>
+            <w:pPr>
+              <w:spacing w:after="0" w:before="0"/>
+              <w:jc w:val="center"/>
+            </w:pPr>
+            <w:r>
+              <w:rPr>
+                <w:rFonts w:ascii="Arial" w:cs="Arial" w:eastAsia="Arial" w:hAnsi="Arial"/>
+                <w:b/>
+                <w:bCs/>
+                <w:color w:val="2E7D32"/>
+                <w:sz w:val="20"/>
+                <w:szCs w:val="20"/>
+              </w:rPr>
+              <w:t xml:space="preserve">PASS</w:t>
+            </w:r>
+          </w:p>
+        </w:tc>
+      </w:tr>
+    </w:tbl>
+    <w:p>
+      <w:pPr>
+        <w:pStyle w:val="Heading2"/>
+      </w:pPr>
+      <w:r>
+        <w:t xml:space="preserve">Notes</w:t>
+      </w:r>
+    </w:p>
+    <w:p>
+      <w:pPr>
+        <w:pStyle w:val="ListParagraph"/>
+        <w:numPr>
+          <w:ilvl w:val="0"/>
+          <w:numId w:val="2"/>
+        </w:numPr>
+        <w:spacing w:after="60"/>
+      </w:pPr>
+      <w:r>
+        <w:rPr>
+          <w:rFonts w:ascii="Arial" w:cs="Arial" w:eastAsia="Arial" w:hAnsi="Arial"/>
+          <w:sz w:val="22"/>
+          <w:szCs w:val="22"/>
+        </w:rPr>
+        <w:t xml:space="preserve">All 6 test cases passed on first run.</w:t>
+      </w:r>
+    </w:p>
+    <w:p>
+      <w:pPr>
+        <w:pStyle w:val="ListParagraph"/>
+        <w:numPr>
+          <w:ilvl w:val="0"/>
+          <w:numId w:val="2"/>
+        </w:numPr>
+        <w:spacing w:after="60"/>
+      </w:pPr>
+      <w:r>
+        <w:rPr>
+          <w:rFonts w:ascii="Arial" w:cs="Arial" w:eastAsia="Arial" w:hAnsi="Arial"/>
+          <w:sz w:val="22"/>
+          <w:szCs w:val="22"/>
+        </w:rPr>
+        <w:t xml:space="preserve">Player can view own info, heroes (2), and team (Dragon Riders).</w:t>
+      </w:r>
+    </w:p>
+    <w:p>
+      <w:pPr>
+        <w:pStyle w:val="ListParagraph"/>
+        <w:numPr>
+          <w:ilvl w:val="0"/>
+          <w:numId w:val="2"/>
+        </w:numPr>
+        <w:spacing w:after="60"/>
+      </w:pPr>
+      <w:r>
+        <w:rPr>
+          <w:rFonts w:ascii="Arial" w:cs="Arial" w:eastAsia="Arial" w:hAnsi="Arial"/>
+          <w:sz w:val="22"/>
+          <w:szCs w:val="22"/>
+        </w:rPr>
+        <w:t xml:space="preserve">Player can change password and re-login successfully.</w:t>
+      </w:r>
+    </w:p>
+    <w:p>
+      <w:pPr>
+        <w:pStyle w:val="ListParagraph"/>
+        <w:numPr>
+          <w:ilvl w:val="0"/>
+          <w:numId w:val="2"/>
+        </w:numPr>
+        <w:spacing w:after="60"/>
+      </w:pPr>
+      <w:r>
+        <w:rPr>
+          <w:rFonts w:ascii="Arial" w:cs="Arial" w:eastAsia="Arial" w:hAnsi="Arial"/>
+          <w:sz w:val="22"/>
+          <w:szCs w:val="22"/>
+        </w:rPr>
+        <w:t xml:space="preserve">Role-based access verified: Player is not admin, unauthenticated user has no access.</w:t>
       </w:r>
     </w:p>
     <w:sectPr>

</xml_diff>